<commit_message>
feat: add remote model mode and gateway forwarding
</commit_message>
<xml_diff>
--- a/output/doc/毕业设计说明书初稿.docx
+++ b/output/doc/毕业设计说明书初稿.docx
@@ -2680,7 +2680,7 @@
           <w:b w:val="0"/>
           <w:sz w:val="24"/>
         </w:rPr>
-        <w:t>AI 服务封装对外部大模型接口的调用逻辑，处理鉴权、超时、异常捕获与结果提取。若模型调用失败，系统返回统一错误信息并记录日志，避免异常直接暴露给用户。</w:t>
+        <w:t>AI 服务封装对外部大模型接口的调用逻辑，处理鉴权、超时、异常捕获与结果提取。系统设计为双模式运行：在未配置模型接口环境变量时，自动返回演示模式回复，以保证本地开发和答辩演示的稳定性；在配置 `LLM_API_URL`、`LLM_API_KEY` 和 `LLM_MODEL_NAME` 后，系统会向真实模型服务发送请求并提取结果。若模型调用失败，系统自动回退到本地演示模式，避免异常直接暴露给用户。</w:t>
       </w:r>
     </w:p>
     <w:p/>
@@ -2755,7 +2755,37 @@
           <w:b/>
           <w:sz w:val="24"/>
         </w:rPr>
-        <w:t>5.6 关键实现难点分析</w:t>
+        <w:t>5.6 C++ 网关转发实现</w:t>
+      </w:r>
+    </w:p>
+    <w:p/>
+    <w:p>
+      <w:pPr>
+        <w:spacing w:line="360" w:lineRule="auto"/>
+        <w:ind w:firstLine="480"/>
+      </w:pPr>
+      <w:r>
+        <w:rPr>
+          <w:rFonts w:ascii="宋体" w:hAnsi="宋体" w:eastAsia="宋体"/>
+          <w:b w:val="0"/>
+          <w:sz w:val="24"/>
+        </w:rPr>
+        <w:t>C++ 网关启动后监听固定端口，通过 Epoll 感知连接事件，并将客户端请求交由线程池异步处理。在线程池任务中，系统首先解析 HTTP 请求行，提取请求方法与路径，再读取消息体内容，最后通过套接字向 Python 服务重新组装 HTTP 请求并转发。Python 服务处理完成后，网关读取完整响应并回传浏览器端。该设计使得“高并发接入”和“智能服务处理”在职责上保持清晰分离。</w:t>
+      </w:r>
+    </w:p>
+    <w:p/>
+    <w:p>
+      <w:pPr>
+        <w:spacing w:line="360" w:lineRule="auto"/>
+        <w:ind w:firstLine="0"/>
+      </w:pPr>
+      <w:r>
+        <w:rPr>
+          <w:rFonts w:ascii="宋体" w:hAnsi="宋体" w:eastAsia="宋体"/>
+          <w:b/>
+          <w:sz w:val="24"/>
+        </w:rPr>
+        <w:t>5.7 关键实现难点分析</w:t>
       </w:r>
     </w:p>
     <w:p/>

</xml_diff>

<commit_message>
feat: add system overview and expand thesis
</commit_message>
<xml_diff>
--- a/output/doc/毕业设计说明书初稿.docx
+++ b/output/doc/毕业设计说明书初稿.docx
@@ -1512,6 +1512,106 @@
     <w:p>
       <w:pPr>
         <w:spacing w:line="360" w:lineRule="auto"/>
+        <w:ind w:firstLine="480"/>
+      </w:pPr>
+      <w:r>
+        <w:rPr>
+          <w:rFonts w:ascii="宋体" w:hAnsi="宋体" w:eastAsia="宋体"/>
+          <w:b w:val="0"/>
+          <w:sz w:val="24"/>
+        </w:rPr>
+        <w:t>管理员功能用例如表3-1所示。</w:t>
+      </w:r>
+    </w:p>
+    <w:p>
+      <w:pPr>
+        <w:spacing w:line="360" w:lineRule="auto"/>
+        <w:ind w:firstLine="480"/>
+      </w:pPr>
+      <w:r>
+        <w:rPr>
+          <w:rFonts w:ascii="宋体" w:hAnsi="宋体" w:eastAsia="宋体"/>
+          <w:b w:val="0"/>
+          <w:sz w:val="24"/>
+        </w:rPr>
+        <w:t>表3-1 管理员核心功能说明</w:t>
+      </w:r>
+    </w:p>
+    <w:p/>
+    <w:p>
+      <w:pPr>
+        <w:spacing w:line="360" w:lineRule="auto"/>
+        <w:ind w:firstLine="480"/>
+      </w:pPr>
+      <w:r>
+        <w:rPr>
+          <w:rFonts w:ascii="宋体" w:hAnsi="宋体" w:eastAsia="宋体"/>
+          <w:b w:val="0"/>
+          <w:sz w:val="24"/>
+        </w:rPr>
+        <w:t>| 功能编号 | 功能名称 | 输入 | 输出 | 说明 |</w:t>
+      </w:r>
+    </w:p>
+    <w:p>
+      <w:pPr>
+        <w:spacing w:line="360" w:lineRule="auto"/>
+        <w:ind w:firstLine="480"/>
+      </w:pPr>
+      <w:r>
+        <w:rPr>
+          <w:rFonts w:ascii="宋体" w:hAnsi="宋体" w:eastAsia="宋体"/>
+          <w:b w:val="0"/>
+          <w:sz w:val="24"/>
+        </w:rPr>
+        <w:t>| --- | --- | --- | --- | --- |</w:t>
+      </w:r>
+    </w:p>
+    <w:p>
+      <w:pPr>
+        <w:spacing w:line="360" w:lineRule="auto"/>
+        <w:ind w:firstLine="480"/>
+      </w:pPr>
+      <w:r>
+        <w:rPr>
+          <w:rFonts w:ascii="宋体" w:hAnsi="宋体" w:eastAsia="宋体"/>
+          <w:b w:val="0"/>
+          <w:sz w:val="24"/>
+        </w:rPr>
+        <w:t>| A01 | 查看系统概览 | 管理员 token | 用户数、会话数、消息数、日志数 | 用于答辩演示与运行分析 |</w:t>
+      </w:r>
+    </w:p>
+    <w:p>
+      <w:pPr>
+        <w:spacing w:line="360" w:lineRule="auto"/>
+        <w:ind w:firstLine="480"/>
+      </w:pPr>
+      <w:r>
+        <w:rPr>
+          <w:rFonts w:ascii="宋体" w:hAnsi="宋体" w:eastAsia="宋体"/>
+          <w:b w:val="0"/>
+          <w:sz w:val="24"/>
+        </w:rPr>
+        <w:t>| A02 | 查看系统日志 | 管理员 token | 日志列表 | 查看登录、问答、配置修改等事件 |</w:t>
+      </w:r>
+    </w:p>
+    <w:p>
+      <w:pPr>
+        <w:spacing w:line="360" w:lineRule="auto"/>
+        <w:ind w:firstLine="480"/>
+      </w:pPr>
+      <w:r>
+        <w:rPr>
+          <w:rFonts w:ascii="宋体" w:hAnsi="宋体" w:eastAsia="宋体"/>
+          <w:b w:val="0"/>
+          <w:sz w:val="24"/>
+        </w:rPr>
+        <w:t>| A03 | 修改系统配置 | 配置键、配置值 | 最新配置 | 用于切换模型名或超时策略 |</w:t>
+      </w:r>
+    </w:p>
+    <w:p/>
+    <w:p>
+      <w:pPr>
+        <w:spacing w:line="360" w:lineRule="auto"/>
         <w:ind w:firstLine="0"/>
       </w:pPr>
       <w:r>
@@ -2214,6 +2314,390 @@
     <w:p>
       <w:pPr>
         <w:spacing w:line="360" w:lineRule="auto"/>
+        <w:ind w:firstLine="480"/>
+      </w:pPr>
+      <w:r>
+        <w:rPr>
+          <w:rFonts w:ascii="宋体" w:hAnsi="宋体" w:eastAsia="宋体"/>
+          <w:b w:val="0"/>
+          <w:sz w:val="24"/>
+        </w:rPr>
+        <w:t>会话表结构如表4-2所示。</w:t>
+      </w:r>
+    </w:p>
+    <w:p>
+      <w:pPr>
+        <w:spacing w:line="360" w:lineRule="auto"/>
+        <w:ind w:firstLine="480"/>
+      </w:pPr>
+      <w:r>
+        <w:rPr>
+          <w:rFonts w:ascii="宋体" w:hAnsi="宋体" w:eastAsia="宋体"/>
+          <w:b w:val="0"/>
+          <w:sz w:val="24"/>
+        </w:rPr>
+        <w:t>表4-2 会话表结构</w:t>
+      </w:r>
+    </w:p>
+    <w:p/>
+    <w:p>
+      <w:pPr>
+        <w:spacing w:line="360" w:lineRule="auto"/>
+        <w:ind w:firstLine="480"/>
+      </w:pPr>
+      <w:r>
+        <w:rPr>
+          <w:rFonts w:ascii="宋体" w:hAnsi="宋体" w:eastAsia="宋体"/>
+          <w:b w:val="0"/>
+          <w:sz w:val="24"/>
+        </w:rPr>
+        <w:t>| 字段 | 类型 | 长度 | 备注 |</w:t>
+      </w:r>
+    </w:p>
+    <w:p>
+      <w:pPr>
+        <w:spacing w:line="360" w:lineRule="auto"/>
+        <w:ind w:firstLine="480"/>
+      </w:pPr>
+      <w:r>
+        <w:rPr>
+          <w:rFonts w:ascii="宋体" w:hAnsi="宋体" w:eastAsia="宋体"/>
+          <w:b w:val="0"/>
+          <w:sz w:val="24"/>
+        </w:rPr>
+        <w:t>| --- | --- | --- | --- |</w:t>
+      </w:r>
+    </w:p>
+    <w:p>
+      <w:pPr>
+        <w:spacing w:line="360" w:lineRule="auto"/>
+        <w:ind w:firstLine="480"/>
+      </w:pPr>
+      <w:r>
+        <w:rPr>
+          <w:rFonts w:ascii="宋体" w:hAnsi="宋体" w:eastAsia="宋体"/>
+          <w:b w:val="0"/>
+          <w:sz w:val="24"/>
+        </w:rPr>
+        <w:t>| id | int | 11 | 主键，自增 |</w:t>
+      </w:r>
+    </w:p>
+    <w:p>
+      <w:pPr>
+        <w:spacing w:line="360" w:lineRule="auto"/>
+        <w:ind w:firstLine="480"/>
+      </w:pPr>
+      <w:r>
+        <w:rPr>
+          <w:rFonts w:ascii="宋体" w:hAnsi="宋体" w:eastAsia="宋体"/>
+          <w:b w:val="0"/>
+          <w:sz w:val="24"/>
+        </w:rPr>
+        <w:t>| session_code | varchar | 64 | 会话唯一标识 |</w:t>
+      </w:r>
+    </w:p>
+    <w:p>
+      <w:pPr>
+        <w:spacing w:line="360" w:lineRule="auto"/>
+        <w:ind w:firstLine="480"/>
+      </w:pPr>
+      <w:r>
+        <w:rPr>
+          <w:rFonts w:ascii="宋体" w:hAnsi="宋体" w:eastAsia="宋体"/>
+          <w:b w:val="0"/>
+          <w:sz w:val="24"/>
+        </w:rPr>
+        <w:t>| user_id | int | 11 | 用户编号 |</w:t>
+      </w:r>
+    </w:p>
+    <w:p>
+      <w:pPr>
+        <w:spacing w:line="360" w:lineRule="auto"/>
+        <w:ind w:firstLine="480"/>
+      </w:pPr>
+      <w:r>
+        <w:rPr>
+          <w:rFonts w:ascii="宋体" w:hAnsi="宋体" w:eastAsia="宋体"/>
+          <w:b w:val="0"/>
+          <w:sz w:val="24"/>
+        </w:rPr>
+        <w:t>| title | varchar | 128 | 会话标题 |</w:t>
+      </w:r>
+    </w:p>
+    <w:p>
+      <w:pPr>
+        <w:spacing w:line="360" w:lineRule="auto"/>
+        <w:ind w:firstLine="480"/>
+      </w:pPr>
+      <w:r>
+        <w:rPr>
+          <w:rFonts w:ascii="宋体" w:hAnsi="宋体" w:eastAsia="宋体"/>
+          <w:b w:val="0"/>
+          <w:sz w:val="24"/>
+        </w:rPr>
+        <w:t>| created_at | datetime | 8 | 创建时间 |</w:t>
+      </w:r>
+    </w:p>
+    <w:p/>
+    <w:p>
+      <w:pPr>
+        <w:spacing w:line="360" w:lineRule="auto"/>
+        <w:ind w:firstLine="480"/>
+      </w:pPr>
+      <w:r>
+        <w:rPr>
+          <w:rFonts w:ascii="宋体" w:hAnsi="宋体" w:eastAsia="宋体"/>
+          <w:b w:val="0"/>
+          <w:sz w:val="24"/>
+        </w:rPr>
+        <w:t>消息表结构如表4-3所示。</w:t>
+      </w:r>
+    </w:p>
+    <w:p>
+      <w:pPr>
+        <w:spacing w:line="360" w:lineRule="auto"/>
+        <w:ind w:firstLine="480"/>
+      </w:pPr>
+      <w:r>
+        <w:rPr>
+          <w:rFonts w:ascii="宋体" w:hAnsi="宋体" w:eastAsia="宋体"/>
+          <w:b w:val="0"/>
+          <w:sz w:val="24"/>
+        </w:rPr>
+        <w:t>表4-3 消息表结构</w:t>
+      </w:r>
+    </w:p>
+    <w:p/>
+    <w:p>
+      <w:pPr>
+        <w:spacing w:line="360" w:lineRule="auto"/>
+        <w:ind w:firstLine="480"/>
+      </w:pPr>
+      <w:r>
+        <w:rPr>
+          <w:rFonts w:ascii="宋体" w:hAnsi="宋体" w:eastAsia="宋体"/>
+          <w:b w:val="0"/>
+          <w:sz w:val="24"/>
+        </w:rPr>
+        <w:t>| 字段 | 类型 | 长度 | 备注 |</w:t>
+      </w:r>
+    </w:p>
+    <w:p>
+      <w:pPr>
+        <w:spacing w:line="360" w:lineRule="auto"/>
+        <w:ind w:firstLine="480"/>
+      </w:pPr>
+      <w:r>
+        <w:rPr>
+          <w:rFonts w:ascii="宋体" w:hAnsi="宋体" w:eastAsia="宋体"/>
+          <w:b w:val="0"/>
+          <w:sz w:val="24"/>
+        </w:rPr>
+        <w:t>| --- | --- | --- | --- |</w:t>
+      </w:r>
+    </w:p>
+    <w:p>
+      <w:pPr>
+        <w:spacing w:line="360" w:lineRule="auto"/>
+        <w:ind w:firstLine="480"/>
+      </w:pPr>
+      <w:r>
+        <w:rPr>
+          <w:rFonts w:ascii="宋体" w:hAnsi="宋体" w:eastAsia="宋体"/>
+          <w:b w:val="0"/>
+          <w:sz w:val="24"/>
+        </w:rPr>
+        <w:t>| id | int | 11 | 主键，自增 |</w:t>
+      </w:r>
+    </w:p>
+    <w:p>
+      <w:pPr>
+        <w:spacing w:line="360" w:lineRule="auto"/>
+        <w:ind w:firstLine="480"/>
+      </w:pPr>
+      <w:r>
+        <w:rPr>
+          <w:rFonts w:ascii="宋体" w:hAnsi="宋体" w:eastAsia="宋体"/>
+          <w:b w:val="0"/>
+          <w:sz w:val="24"/>
+        </w:rPr>
+        <w:t>| session_id | int | 11 | 所属会话 |</w:t>
+      </w:r>
+    </w:p>
+    <w:p>
+      <w:pPr>
+        <w:spacing w:line="360" w:lineRule="auto"/>
+        <w:ind w:firstLine="480"/>
+      </w:pPr>
+      <w:r>
+        <w:rPr>
+          <w:rFonts w:ascii="宋体" w:hAnsi="宋体" w:eastAsia="宋体"/>
+          <w:b w:val="0"/>
+          <w:sz w:val="24"/>
+        </w:rPr>
+        <w:t>| user_message | text | - | 用户问题 |</w:t>
+      </w:r>
+    </w:p>
+    <w:p>
+      <w:pPr>
+        <w:spacing w:line="360" w:lineRule="auto"/>
+        <w:ind w:firstLine="480"/>
+      </w:pPr>
+      <w:r>
+        <w:rPr>
+          <w:rFonts w:ascii="宋体" w:hAnsi="宋体" w:eastAsia="宋体"/>
+          <w:b w:val="0"/>
+          <w:sz w:val="24"/>
+        </w:rPr>
+        <w:t>| assistant_message | text | - | 模型回答 |</w:t>
+      </w:r>
+    </w:p>
+    <w:p>
+      <w:pPr>
+        <w:spacing w:line="360" w:lineRule="auto"/>
+        <w:ind w:firstLine="480"/>
+      </w:pPr>
+      <w:r>
+        <w:rPr>
+          <w:rFonts w:ascii="宋体" w:hAnsi="宋体" w:eastAsia="宋体"/>
+          <w:b w:val="0"/>
+          <w:sz w:val="24"/>
+        </w:rPr>
+        <w:t>| created_at | datetime | 8 | 发送时间 |</w:t>
+      </w:r>
+    </w:p>
+    <w:p/>
+    <w:p>
+      <w:pPr>
+        <w:spacing w:line="360" w:lineRule="auto"/>
+        <w:ind w:firstLine="480"/>
+      </w:pPr>
+      <w:r>
+        <w:rPr>
+          <w:rFonts w:ascii="宋体" w:hAnsi="宋体" w:eastAsia="宋体"/>
+          <w:b w:val="0"/>
+          <w:sz w:val="24"/>
+        </w:rPr>
+        <w:t>日志表结构如表4-4所示。</w:t>
+      </w:r>
+    </w:p>
+    <w:p>
+      <w:pPr>
+        <w:spacing w:line="360" w:lineRule="auto"/>
+        <w:ind w:firstLine="480"/>
+      </w:pPr>
+      <w:r>
+        <w:rPr>
+          <w:rFonts w:ascii="宋体" w:hAnsi="宋体" w:eastAsia="宋体"/>
+          <w:b w:val="0"/>
+          <w:sz w:val="24"/>
+        </w:rPr>
+        <w:t>表4-4 日志表结构</w:t>
+      </w:r>
+    </w:p>
+    <w:p/>
+    <w:p>
+      <w:pPr>
+        <w:spacing w:line="360" w:lineRule="auto"/>
+        <w:ind w:firstLine="480"/>
+      </w:pPr>
+      <w:r>
+        <w:rPr>
+          <w:rFonts w:ascii="宋体" w:hAnsi="宋体" w:eastAsia="宋体"/>
+          <w:b w:val="0"/>
+          <w:sz w:val="24"/>
+        </w:rPr>
+        <w:t>| 字段 | 类型 | 长度 | 备注 |</w:t>
+      </w:r>
+    </w:p>
+    <w:p>
+      <w:pPr>
+        <w:spacing w:line="360" w:lineRule="auto"/>
+        <w:ind w:firstLine="480"/>
+      </w:pPr>
+      <w:r>
+        <w:rPr>
+          <w:rFonts w:ascii="宋体" w:hAnsi="宋体" w:eastAsia="宋体"/>
+          <w:b w:val="0"/>
+          <w:sz w:val="24"/>
+        </w:rPr>
+        <w:t>| --- | --- | --- | --- |</w:t>
+      </w:r>
+    </w:p>
+    <w:p>
+      <w:pPr>
+        <w:spacing w:line="360" w:lineRule="auto"/>
+        <w:ind w:firstLine="480"/>
+      </w:pPr>
+      <w:r>
+        <w:rPr>
+          <w:rFonts w:ascii="宋体" w:hAnsi="宋体" w:eastAsia="宋体"/>
+          <w:b w:val="0"/>
+          <w:sz w:val="24"/>
+        </w:rPr>
+        <w:t>| id | int | 11 | 主键，自增 |</w:t>
+      </w:r>
+    </w:p>
+    <w:p>
+      <w:pPr>
+        <w:spacing w:line="360" w:lineRule="auto"/>
+        <w:ind w:firstLine="480"/>
+      </w:pPr>
+      <w:r>
+        <w:rPr>
+          <w:rFonts w:ascii="宋体" w:hAnsi="宋体" w:eastAsia="宋体"/>
+          <w:b w:val="0"/>
+          <w:sz w:val="24"/>
+        </w:rPr>
+        <w:t>| level | varchar | 16 | 日志级别 |</w:t>
+      </w:r>
+    </w:p>
+    <w:p>
+      <w:pPr>
+        <w:spacing w:line="360" w:lineRule="auto"/>
+        <w:ind w:firstLine="480"/>
+      </w:pPr>
+      <w:r>
+        <w:rPr>
+          <w:rFonts w:ascii="宋体" w:hAnsi="宋体" w:eastAsia="宋体"/>
+          <w:b w:val="0"/>
+          <w:sz w:val="24"/>
+        </w:rPr>
+        <w:t>| event_type | varchar | 32 | 事件类型 |</w:t>
+      </w:r>
+    </w:p>
+    <w:p>
+      <w:pPr>
+        <w:spacing w:line="360" w:lineRule="auto"/>
+        <w:ind w:firstLine="480"/>
+      </w:pPr>
+      <w:r>
+        <w:rPr>
+          <w:rFonts w:ascii="宋体" w:hAnsi="宋体" w:eastAsia="宋体"/>
+          <w:b w:val="0"/>
+          <w:sz w:val="24"/>
+        </w:rPr>
+        <w:t>| message | text | - | 日志描述 |</w:t>
+      </w:r>
+    </w:p>
+    <w:p>
+      <w:pPr>
+        <w:spacing w:line="360" w:lineRule="auto"/>
+        <w:ind w:firstLine="480"/>
+      </w:pPr>
+      <w:r>
+        <w:rPr>
+          <w:rFonts w:ascii="宋体" w:hAnsi="宋体" w:eastAsia="宋体"/>
+          <w:b w:val="0"/>
+          <w:sz w:val="24"/>
+        </w:rPr>
+        <w:t>| created_at | datetime | 8 | 记录时间 |</w:t>
+      </w:r>
+    </w:p>
+    <w:p/>
+    <w:p>
+      <w:pPr>
+        <w:spacing w:line="360" w:lineRule="auto"/>
         <w:ind w:firstLine="0"/>
       </w:pPr>
       <w:r>
@@ -2710,7 +3194,7 @@
           <w:b w:val="0"/>
           <w:sz w:val="24"/>
         </w:rPr>
-        <w:t>前端页面主要包括登录页、问答主页、历史记录页和管理员页面。问答主页用于展示用户输入框、对话气泡和返回内容；管理员页面用于查看日志、调整参数和监控系统运行状态。前端通过 AJAX 或 Fetch 接口向后端发送请求，实现异步交互。</w:t>
+        <w:t>前端页面主要包括登录页、问答主页、历史记录页和管理员页面。问答主页用于展示用户输入框、对话气泡和返回内容；管理员页面用于查看系统概览、日志、模型参数配置和运行状态。前端通过 AJAX 或 Fetch 接口向后端发送请求，实现异步交互。</w:t>
       </w:r>
     </w:p>
     <w:p/>
@@ -3225,6 +3709,106 @@
     <w:p>
       <w:pPr>
         <w:spacing w:line="360" w:lineRule="auto"/>
+        <w:ind w:firstLine="480"/>
+      </w:pPr>
+      <w:r>
+        <w:rPr>
+          <w:rFonts w:ascii="宋体" w:hAnsi="宋体" w:eastAsia="宋体"/>
+          <w:b w:val="0"/>
+          <w:sz w:val="24"/>
+        </w:rPr>
+        <w:t>管理员功能测试用例如表6-3所示。</w:t>
+      </w:r>
+    </w:p>
+    <w:p>
+      <w:pPr>
+        <w:spacing w:line="360" w:lineRule="auto"/>
+        <w:ind w:firstLine="480"/>
+      </w:pPr>
+      <w:r>
+        <w:rPr>
+          <w:rFonts w:ascii="宋体" w:hAnsi="宋体" w:eastAsia="宋体"/>
+          <w:b w:val="0"/>
+          <w:sz w:val="24"/>
+        </w:rPr>
+        <w:t>表6-3 管理员功能测试用例表</w:t>
+      </w:r>
+    </w:p>
+    <w:p/>
+    <w:p>
+      <w:pPr>
+        <w:spacing w:line="360" w:lineRule="auto"/>
+        <w:ind w:firstLine="480"/>
+      </w:pPr>
+      <w:r>
+        <w:rPr>
+          <w:rFonts w:ascii="宋体" w:hAnsi="宋体" w:eastAsia="宋体"/>
+          <w:b w:val="0"/>
+          <w:sz w:val="24"/>
+        </w:rPr>
+        <w:t>| 序号 | 操作 | 预期结果 | 实际结果 | 测试结果 |</w:t>
+      </w:r>
+    </w:p>
+    <w:p>
+      <w:pPr>
+        <w:spacing w:line="360" w:lineRule="auto"/>
+        <w:ind w:firstLine="480"/>
+      </w:pPr>
+      <w:r>
+        <w:rPr>
+          <w:rFonts w:ascii="宋体" w:hAnsi="宋体" w:eastAsia="宋体"/>
+          <w:b w:val="0"/>
+          <w:sz w:val="24"/>
+        </w:rPr>
+        <w:t>| --- | --- | --- | --- | --- |</w:t>
+      </w:r>
+    </w:p>
+    <w:p>
+      <w:pPr>
+        <w:spacing w:line="360" w:lineRule="auto"/>
+        <w:ind w:firstLine="480"/>
+      </w:pPr>
+      <w:r>
+        <w:rPr>
+          <w:rFonts w:ascii="宋体" w:hAnsi="宋体" w:eastAsia="宋体"/>
+          <w:b w:val="0"/>
+          <w:sz w:val="24"/>
+        </w:rPr>
+        <w:t>| 1 | 管理员访问系统概览接口 | 返回系统概览数据 | 返回用户数、会话数、消息数等指标 | 通过 |</w:t>
+      </w:r>
+    </w:p>
+    <w:p>
+      <w:pPr>
+        <w:spacing w:line="360" w:lineRule="auto"/>
+        <w:ind w:firstLine="480"/>
+      </w:pPr>
+      <w:r>
+        <w:rPr>
+          <w:rFonts w:ascii="宋体" w:hAnsi="宋体" w:eastAsia="宋体"/>
+          <w:b w:val="0"/>
+          <w:sz w:val="24"/>
+        </w:rPr>
+        <w:t>| 2 | 管理员访问日志接口 | 返回日志列表 | 返回登录、问答、配置更新日志 | 通过 |</w:t>
+      </w:r>
+    </w:p>
+    <w:p>
+      <w:pPr>
+        <w:spacing w:line="360" w:lineRule="auto"/>
+        <w:ind w:firstLine="480"/>
+      </w:pPr>
+      <w:r>
+        <w:rPr>
+          <w:rFonts w:ascii="宋体" w:hAnsi="宋体" w:eastAsia="宋体"/>
+          <w:b w:val="0"/>
+          <w:sz w:val="24"/>
+        </w:rPr>
+        <w:t>| 3 | 普通用户访问管理员日志 | 返回权限错误 | 返回 403 权限错误 | 通过 |</w:t>
+      </w:r>
+    </w:p>
+    <w:p/>
+    <w:p>
+      <w:pPr>
+        <w:spacing w:line="360" w:lineRule="auto"/>
         <w:ind w:firstLine="0"/>
       </w:pPr>
       <w:r>
@@ -3263,7 +3847,7 @@
           <w:b w:val="0"/>
           <w:sz w:val="24"/>
         </w:rPr>
-        <w:t>并发测试指标示例如表6-3所示。</w:t>
+        <w:t>并发测试指标示例如表6-4所示。</w:t>
       </w:r>
     </w:p>
     <w:p>
@@ -3277,7 +3861,7 @@
           <w:b w:val="0"/>
           <w:sz w:val="24"/>
         </w:rPr>
-        <w:t>表6-3 并发性能测试结果表</w:t>
+        <w:t>表6-4 并发性能测试结果表</w:t>
       </w:r>
     </w:p>
     <w:p/>
@@ -3496,6 +4080,21 @@
           <w:sz w:val="24"/>
         </w:rPr>
         <w:t>3. 前端交互效果和后台运维能力还有进一步完善空间。</w:t>
+      </w:r>
+    </w:p>
+    <w:p/>
+    <w:p>
+      <w:pPr>
+        <w:spacing w:line="360" w:lineRule="auto"/>
+        <w:ind w:firstLine="480"/>
+      </w:pPr>
+      <w:r>
+        <w:rPr>
+          <w:rFonts w:ascii="宋体" w:hAnsi="宋体" w:eastAsia="宋体"/>
+          <w:b w:val="0"/>
+          <w:sz w:val="24"/>
+        </w:rPr>
+        <w:t>此外，从当前自动化测试结果来看，Python 业务层、API 层以及项目结构检查均已通过验证，说明系统的主链路具备较好的可运行性。后续若在 Linux 环境完成 C++ 网关编译与压力测试截图采集，则论文的实验部分还可进一步增强。</w:t>
       </w:r>
     </w:p>
     <w:p/>

</xml_diff>

<commit_message>
feat: polish demo frontend and thesis figures
</commit_message>
<xml_diff>
--- a/output/doc/毕业设计说明书初稿.docx
+++ b/output/doc/毕业设计说明书初稿.docx
@@ -2850,6 +2850,36 @@
           <w:sz w:val="24"/>
         </w:rPr>
         <w:t>图4-2 智能问答处理流程图</w:t>
+      </w:r>
+    </w:p>
+    <w:p/>
+    <w:p>
+      <w:pPr>
+        <w:spacing w:line="360" w:lineRule="auto"/>
+        <w:ind w:firstLine="480"/>
+      </w:pPr>
+      <w:r>
+        <w:rPr>
+          <w:rFonts w:ascii="宋体" w:hAnsi="宋体" w:eastAsia="宋体"/>
+          <w:b w:val="0"/>
+          <w:sz w:val="24"/>
+        </w:rPr>
+        <w:t>为进一步增强论文表达的完整性，正式定稿时还应补充问答处理时序图，用于说明浏览器、C++ 网关、Python 服务和模型接口之间的调用先后关系。建议将该图编号为图4-3 问答处理时序图。</w:t>
+      </w:r>
+    </w:p>
+    <w:p/>
+    <w:p>
+      <w:pPr>
+        <w:spacing w:line="360" w:lineRule="auto"/>
+        <w:ind w:firstLine="480"/>
+      </w:pPr>
+      <w:r>
+        <w:rPr>
+          <w:rFonts w:ascii="宋体" w:hAnsi="宋体" w:eastAsia="宋体"/>
+          <w:b w:val="0"/>
+          <w:sz w:val="24"/>
+        </w:rPr>
+        <w:t>在数据库设计表达方面，建议补充系统 E-R 图，用于展示用户实体、会话实体、消息实体、日志实体以及配置实体之间的关联关系。建议将该图编号为图4-4 系统 E-R 图。</w:t>
       </w:r>
     </w:p>
     <w:p/>

</xml_diff>

<commit_message>
feat: add cross-environment runtime support
</commit_message>
<xml_diff>
--- a/output/doc/毕业设计说明书初稿.docx
+++ b/output/doc/毕业设计说明书初稿.docx
@@ -2892,24 +2892,24 @@
         <w:rPr>
           <w:rFonts w:ascii="宋体" w:hAnsi="宋体" w:eastAsia="宋体"/>
           <w:b/>
-          <w:sz w:val="28"/>
-        </w:rPr>
-        <w:t>第5章 系统详细实现</w:t>
+          <w:sz w:val="24"/>
+        </w:rPr>
+        <w:t>4.6 跨环境部署设计</w:t>
       </w:r>
     </w:p>
     <w:p/>
     <w:p>
       <w:pPr>
         <w:spacing w:line="360" w:lineRule="auto"/>
-        <w:ind w:firstLine="0"/>
-      </w:pPr>
-      <w:r>
-        <w:rPr>
-          <w:rFonts w:ascii="宋体" w:hAnsi="宋体" w:eastAsia="宋体"/>
-          <w:b/>
-          <w:sz w:val="24"/>
-        </w:rPr>
-        <w:t>5.1 开发环境与运行环境</w:t>
+        <w:ind w:firstLine="480"/>
+      </w:pPr>
+      <w:r>
+        <w:rPr>
+          <w:rFonts w:ascii="宋体" w:hAnsi="宋体" w:eastAsia="宋体"/>
+          <w:b w:val="0"/>
+          <w:sz w:val="24"/>
+        </w:rPr>
+        <w:t>为了保证本课题不仅能在单一设备上演示，而且具备跨环境运行能力，系统在部署层面采用“通用层 + 高并发专项层”的方式组织。通用层由前端页面与 Python FastAPI 服务构成，这部分正式支持 Windows、Linux 与 WSL 三类环境；高并发专项层由基于 epoll 的 C++ 网关构成，由于 epoll 是 Linux 特有机制，因此该模块正式支持 Linux 与 WSL，不将 Windows 原生运行作为当前实现目标。</w:t>
       </w:r>
     </w:p>
     <w:p/>
@@ -2924,43 +2924,13 @@
           <w:b w:val="0"/>
           <w:sz w:val="24"/>
         </w:rPr>
-        <w:t>本系统开发工具包括 Visual Studio Code、CLion 或 GCC 编译环境、Python 解释器、MySQL 数据库以及 Postman 等辅助调试工具。运行环境采用 Linux 虚拟机或 Linux 云服务器，后端服务通过本地端口进行联调。</w:t>
+        <w:t>在跨环境运行约定上，系统统一使用 Python 服务端口 `8000`、C++ 网关端口 `8080`、前端静态服务端口 `5500`。前端支持两种访问模式：一种是直连 Python 服务的通用演示模式，适合 Windows 环境下快速展示；另一种是通过 C++ 网关转发访问的高并发演示模式，适合在 WSL 或 Linux 环境下展示系统的双后端协同架构。</w:t>
       </w:r>
     </w:p>
     <w:p/>
     <w:p>
       <w:pPr>
         <w:spacing w:line="360" w:lineRule="auto"/>
-        <w:ind w:firstLine="0"/>
-      </w:pPr>
-      <w:r>
-        <w:rPr>
-          <w:rFonts w:ascii="宋体" w:hAnsi="宋体" w:eastAsia="宋体"/>
-          <w:b/>
-          <w:sz w:val="24"/>
-        </w:rPr>
-        <w:t>5.2 C++ 高并发接入层实现</w:t>
-      </w:r>
-    </w:p>
-    <w:p/>
-    <w:p>
-      <w:pPr>
-        <w:spacing w:line="360" w:lineRule="auto"/>
-        <w:ind w:firstLine="0"/>
-      </w:pPr>
-      <w:r>
-        <w:rPr>
-          <w:rFonts w:ascii="宋体" w:hAnsi="宋体" w:eastAsia="宋体"/>
-          <w:b/>
-          <w:sz w:val="24"/>
-        </w:rPr>
-        <w:t>5.2.1 服务器启动与监听</w:t>
-      </w:r>
-    </w:p>
-    <w:p/>
-    <w:p>
-      <w:pPr>
-        <w:spacing w:line="360" w:lineRule="auto"/>
         <w:ind w:firstLine="480"/>
       </w:pPr>
       <w:r>
@@ -2969,424 +2939,7 @@
           <w:b w:val="0"/>
           <w:sz w:val="24"/>
         </w:rPr>
-        <w:t>服务器启动后首先创建监听套接字，绑定指定端口并进入监听状态。随后创建 Epoll 实例，将监听套接字加入事件集合中，等待新的连接事件到来。</w:t>
-      </w:r>
-    </w:p>
-    <w:p/>
-    <w:p>
-      <w:pPr>
-        <w:spacing w:line="360" w:lineRule="auto"/>
-        <w:ind w:firstLine="0"/>
-      </w:pPr>
-      <w:r>
-        <w:rPr>
-          <w:rFonts w:ascii="宋体" w:hAnsi="宋体" w:eastAsia="宋体"/>
-          <w:b/>
-          <w:sz w:val="24"/>
-        </w:rPr>
-        <w:t>5.2.2 Epoll 事件循环</w:t>
-      </w:r>
-    </w:p>
-    <w:p/>
-    <w:p>
-      <w:pPr>
-        <w:spacing w:line="360" w:lineRule="auto"/>
-        <w:ind w:firstLine="480"/>
-      </w:pPr>
-      <w:r>
-        <w:rPr>
-          <w:rFonts w:ascii="宋体" w:hAnsi="宋体" w:eastAsia="宋体"/>
-          <w:b w:val="0"/>
-          <w:sz w:val="24"/>
-        </w:rPr>
-        <w:t>主线程通过事件循环持续调用 Epoll 等待事件返回。当检测到新连接到达时执行连接建立逻辑；当检测到读写事件时，将对应任务放入线程池队列；当检测到异常事件或连接关闭事件时，执行资源回收。</w:t>
-      </w:r>
-    </w:p>
-    <w:p/>
-    <w:p>
-      <w:pPr>
-        <w:spacing w:line="360" w:lineRule="auto"/>
-        <w:ind w:firstLine="0"/>
-      </w:pPr>
-      <w:r>
-        <w:rPr>
-          <w:rFonts w:ascii="宋体" w:hAnsi="宋体" w:eastAsia="宋体"/>
-          <w:b/>
-          <w:sz w:val="24"/>
-        </w:rPr>
-        <w:t>5.2.3 HTTP 请求解析</w:t>
-      </w:r>
-    </w:p>
-    <w:p/>
-    <w:p>
-      <w:pPr>
-        <w:spacing w:line="360" w:lineRule="auto"/>
-        <w:ind w:firstLine="480"/>
-      </w:pPr>
-      <w:r>
-        <w:rPr>
-          <w:rFonts w:ascii="宋体" w:hAnsi="宋体" w:eastAsia="宋体"/>
-          <w:b w:val="0"/>
-          <w:sz w:val="24"/>
-        </w:rPr>
-        <w:t>系统采用有限状态机方式对 HTTP 报文进行解析，将解析过程划分为请求行解析、请求头解析和消息体解析三个阶段。该方法可提高复杂报文处理的清晰度和稳定性。</w:t>
-      </w:r>
-    </w:p>
-    <w:p/>
-    <w:p>
-      <w:pPr>
-        <w:spacing w:line="360" w:lineRule="auto"/>
-        <w:ind w:firstLine="0"/>
-      </w:pPr>
-      <w:r>
-        <w:rPr>
-          <w:rFonts w:ascii="宋体" w:hAnsi="宋体" w:eastAsia="宋体"/>
-          <w:b/>
-          <w:sz w:val="24"/>
-        </w:rPr>
-        <w:t>5.2.4 线程池任务调度</w:t>
-      </w:r>
-    </w:p>
-    <w:p/>
-    <w:p>
-      <w:pPr>
-        <w:spacing w:line="360" w:lineRule="auto"/>
-        <w:ind w:firstLine="480"/>
-      </w:pPr>
-      <w:r>
-        <w:rPr>
-          <w:rFonts w:ascii="宋体" w:hAnsi="宋体" w:eastAsia="宋体"/>
-          <w:b w:val="0"/>
-          <w:sz w:val="24"/>
-        </w:rPr>
-        <w:t>线程池在系统初始化时预创建多个工作线程。主线程负责将已解析请求封装成任务，工作线程负责执行业务逻辑，包括数据库访问、向 AI 服务发送请求和组织返回报文等。</w:t>
-      </w:r>
-    </w:p>
-    <w:p/>
-    <w:p>
-      <w:pPr>
-        <w:spacing w:line="360" w:lineRule="auto"/>
-        <w:ind w:firstLine="0"/>
-      </w:pPr>
-      <w:r>
-        <w:rPr>
-          <w:rFonts w:ascii="宋体" w:hAnsi="宋体" w:eastAsia="宋体"/>
-          <w:b/>
-          <w:sz w:val="24"/>
-        </w:rPr>
-        <w:t>5.2.5 超时连接处理</w:t>
-      </w:r>
-    </w:p>
-    <w:p/>
-    <w:p>
-      <w:pPr>
-        <w:spacing w:line="360" w:lineRule="auto"/>
-        <w:ind w:firstLine="480"/>
-      </w:pPr>
-      <w:r>
-        <w:rPr>
-          <w:rFonts w:ascii="宋体" w:hAnsi="宋体" w:eastAsia="宋体"/>
-          <w:b w:val="0"/>
-          <w:sz w:val="24"/>
-        </w:rPr>
-        <w:t>系统为每个客户端连接维护超时信息，通过定时器定期扫描长时间无活动连接并主动关闭，以防止连接长期占用系统资源。</w:t>
-      </w:r>
-    </w:p>
-    <w:p/>
-    <w:p>
-      <w:pPr>
-        <w:spacing w:line="360" w:lineRule="auto"/>
-        <w:ind w:firstLine="0"/>
-      </w:pPr>
-      <w:r>
-        <w:rPr>
-          <w:rFonts w:ascii="宋体" w:hAnsi="宋体" w:eastAsia="宋体"/>
-          <w:b/>
-          <w:sz w:val="24"/>
-        </w:rPr>
-        <w:t>5.3 Python AI 服务实现</w:t>
-      </w:r>
-    </w:p>
-    <w:p/>
-    <w:p>
-      <w:pPr>
-        <w:spacing w:line="360" w:lineRule="auto"/>
-        <w:ind w:firstLine="0"/>
-      </w:pPr>
-      <w:r>
-        <w:rPr>
-          <w:rFonts w:ascii="宋体" w:hAnsi="宋体" w:eastAsia="宋体"/>
-          <w:b/>
-          <w:sz w:val="24"/>
-        </w:rPr>
-        <w:t>5.3.1 FastAPI 接口定义</w:t>
-      </w:r>
-    </w:p>
-    <w:p/>
-    <w:p>
-      <w:pPr>
-        <w:spacing w:line="360" w:lineRule="auto"/>
-        <w:ind w:firstLine="480"/>
-      </w:pPr>
-      <w:r>
-        <w:rPr>
-          <w:rFonts w:ascii="宋体" w:hAnsi="宋体" w:eastAsia="宋体"/>
-          <w:b w:val="0"/>
-          <w:sz w:val="24"/>
-        </w:rPr>
-        <w:t>Python 服务提供统一的问答接口，例如 `/api/ask`。该接口接收用户问题、会话编号和可选上下文信息，完成输入校验后调用模型服务。</w:t>
-      </w:r>
-    </w:p>
-    <w:p/>
-    <w:p>
-      <w:pPr>
-        <w:spacing w:line="360" w:lineRule="auto"/>
-        <w:ind w:firstLine="0"/>
-      </w:pPr>
-      <w:r>
-        <w:rPr>
-          <w:rFonts w:ascii="宋体" w:hAnsi="宋体" w:eastAsia="宋体"/>
-          <w:b/>
-          <w:sz w:val="24"/>
-        </w:rPr>
-        <w:t>5.3.2 Prompt 组织与上下文管理</w:t>
-      </w:r>
-    </w:p>
-    <w:p/>
-    <w:p>
-      <w:pPr>
-        <w:spacing w:line="360" w:lineRule="auto"/>
-        <w:ind w:firstLine="480"/>
-      </w:pPr>
-      <w:r>
-        <w:rPr>
-          <w:rFonts w:ascii="宋体" w:hAnsi="宋体" w:eastAsia="宋体"/>
-          <w:b w:val="0"/>
-          <w:sz w:val="24"/>
-        </w:rPr>
-        <w:t>为提升回答质量，系统在发送模型请求前会将用户问题与必要的上下文信息进行拼接，形成较稳定的提示模板。对于多轮对话场景，可根据会话记录加载若干历史消息，以增强回答连贯性。</w:t>
-      </w:r>
-    </w:p>
-    <w:p/>
-    <w:p>
-      <w:pPr>
-        <w:spacing w:line="360" w:lineRule="auto"/>
-        <w:ind w:firstLine="0"/>
-      </w:pPr>
-      <w:r>
-        <w:rPr>
-          <w:rFonts w:ascii="宋体" w:hAnsi="宋体" w:eastAsia="宋体"/>
-          <w:b/>
-          <w:sz w:val="24"/>
-        </w:rPr>
-        <w:t>5.3.3 模型接口调用</w:t>
-      </w:r>
-    </w:p>
-    <w:p/>
-    <w:p>
-      <w:pPr>
-        <w:spacing w:line="360" w:lineRule="auto"/>
-        <w:ind w:firstLine="480"/>
-      </w:pPr>
-      <w:r>
-        <w:rPr>
-          <w:rFonts w:ascii="宋体" w:hAnsi="宋体" w:eastAsia="宋体"/>
-          <w:b w:val="0"/>
-          <w:sz w:val="24"/>
-        </w:rPr>
-        <w:t>AI 服务封装对外部大模型接口的调用逻辑，处理鉴权、超时、异常捕获与结果提取。系统设计为双模式运行：在未配置模型接口环境变量时，自动返回演示模式回复，以保证本地开发和答辩演示的稳定性；在配置 `LLM_API_URL`、`LLM_API_KEY` 和 `LLM_MODEL_NAME` 后，系统会向真实模型服务发送请求并提取结果。若模型调用失败，系统自动回退到本地演示模式，避免异常直接暴露给用户。</w:t>
-      </w:r>
-    </w:p>
-    <w:p/>
-    <w:p>
-      <w:pPr>
-        <w:spacing w:line="360" w:lineRule="auto"/>
-        <w:ind w:firstLine="0"/>
-      </w:pPr>
-      <w:r>
-        <w:rPr>
-          <w:rFonts w:ascii="宋体" w:hAnsi="宋体" w:eastAsia="宋体"/>
-          <w:b/>
-          <w:sz w:val="24"/>
-        </w:rPr>
-        <w:t>5.4 前端交互实现</w:t>
-      </w:r>
-    </w:p>
-    <w:p/>
-    <w:p>
-      <w:pPr>
-        <w:spacing w:line="360" w:lineRule="auto"/>
-        <w:ind w:firstLine="480"/>
-      </w:pPr>
-      <w:r>
-        <w:rPr>
-          <w:rFonts w:ascii="宋体" w:hAnsi="宋体" w:eastAsia="宋体"/>
-          <w:b w:val="0"/>
-          <w:sz w:val="24"/>
-        </w:rPr>
-        <w:t>前端页面主要包括登录页、问答主页、历史记录页和管理员页面。问答主页用于展示用户输入框、对话气泡和返回内容；管理员页面用于查看系统概览、日志、模型参数配置和运行状态。前端通过 AJAX 或 Fetch 接口向后端发送请求，实现异步交互。</w:t>
-      </w:r>
-    </w:p>
-    <w:p/>
-    <w:p>
-      <w:pPr>
-        <w:spacing w:line="360" w:lineRule="auto"/>
-        <w:ind w:firstLine="0"/>
-      </w:pPr>
-      <w:r>
-        <w:rPr>
-          <w:rFonts w:ascii="宋体" w:hAnsi="宋体" w:eastAsia="宋体"/>
-          <w:b/>
-          <w:sz w:val="24"/>
-        </w:rPr>
-        <w:t>5.5 数据库访问实现</w:t>
-      </w:r>
-    </w:p>
-    <w:p/>
-    <w:p>
-      <w:pPr>
-        <w:spacing w:line="360" w:lineRule="auto"/>
-        <w:ind w:firstLine="480"/>
-      </w:pPr>
-      <w:r>
-        <w:rPr>
-          <w:rFonts w:ascii="宋体" w:hAnsi="宋体" w:eastAsia="宋体"/>
-          <w:b w:val="0"/>
-          <w:sz w:val="24"/>
-        </w:rPr>
-        <w:t>系统在用户登录、问答记录保存、日志记录和配置读取等场景中访问 MySQL 数据库。为保证系统可维护性，可在 Python 服务或中间封装层中统一实现数据库访问逻辑，降低业务代码耦合度。</w:t>
-      </w:r>
-    </w:p>
-    <w:p/>
-    <w:p>
-      <w:pPr>
-        <w:spacing w:line="360" w:lineRule="auto"/>
-        <w:ind w:firstLine="0"/>
-      </w:pPr>
-      <w:r>
-        <w:rPr>
-          <w:rFonts w:ascii="宋体" w:hAnsi="宋体" w:eastAsia="宋体"/>
-          <w:b/>
-          <w:sz w:val="24"/>
-        </w:rPr>
-        <w:t>5.6 C++ 网关转发实现</w:t>
-      </w:r>
-    </w:p>
-    <w:p/>
-    <w:p>
-      <w:pPr>
-        <w:spacing w:line="360" w:lineRule="auto"/>
-        <w:ind w:firstLine="480"/>
-      </w:pPr>
-      <w:r>
-        <w:rPr>
-          <w:rFonts w:ascii="宋体" w:hAnsi="宋体" w:eastAsia="宋体"/>
-          <w:b w:val="0"/>
-          <w:sz w:val="24"/>
-        </w:rPr>
-        <w:t>C++ 网关启动后监听固定端口，通过 Epoll 感知连接事件，并将客户端请求交由线程池异步处理。在线程池任务中，系统首先解析 HTTP 请求行，提取请求方法与路径，再读取消息体内容，最后通过套接字向 Python 服务重新组装 HTTP 请求并转发。Python 服务处理完成后，网关读取完整响应并回传浏览器端。该设计使得“高并发接入”和“智能服务处理”在职责上保持清晰分离。</w:t>
-      </w:r>
-    </w:p>
-    <w:p/>
-    <w:p>
-      <w:pPr>
-        <w:spacing w:line="360" w:lineRule="auto"/>
-        <w:ind w:firstLine="0"/>
-      </w:pPr>
-      <w:r>
-        <w:rPr>
-          <w:rFonts w:ascii="宋体" w:hAnsi="宋体" w:eastAsia="宋体"/>
-          <w:b/>
-          <w:sz w:val="24"/>
-        </w:rPr>
-        <w:t>5.7 关键实现难点分析</w:t>
-      </w:r>
-    </w:p>
-    <w:p/>
-    <w:p>
-      <w:pPr>
-        <w:spacing w:line="360" w:lineRule="auto"/>
-        <w:ind w:firstLine="480"/>
-      </w:pPr>
-      <w:r>
-        <w:rPr>
-          <w:rFonts w:ascii="宋体" w:hAnsi="宋体" w:eastAsia="宋体"/>
-          <w:b w:val="0"/>
-          <w:sz w:val="24"/>
-        </w:rPr>
-        <w:t>本系统在实现过程中主要面临以下难点：</w:t>
-      </w:r>
-    </w:p>
-    <w:p/>
-    <w:p>
-      <w:pPr>
-        <w:spacing w:line="360" w:lineRule="auto"/>
-        <w:ind w:firstLine="480"/>
-      </w:pPr>
-      <w:r>
-        <w:rPr>
-          <w:rFonts w:ascii="宋体" w:hAnsi="宋体" w:eastAsia="宋体"/>
-          <w:b w:val="0"/>
-          <w:sz w:val="24"/>
-        </w:rPr>
-        <w:t>1. C++ 层需要兼顾高并发接入与请求正确解析，容易出现连接管理复杂和调试难度大的问题。</w:t>
-      </w:r>
-    </w:p>
-    <w:p>
-      <w:pPr>
-        <w:spacing w:line="360" w:lineRule="auto"/>
-        <w:ind w:firstLine="480"/>
-      </w:pPr>
-      <w:r>
-        <w:rPr>
-          <w:rFonts w:ascii="宋体" w:hAnsi="宋体" w:eastAsia="宋体"/>
-          <w:b w:val="0"/>
-          <w:sz w:val="24"/>
-        </w:rPr>
-        <w:t>2. Python AI 服务需要处理模型接口超时、返回内容不稳定等情况。</w:t>
-      </w:r>
-    </w:p>
-    <w:p>
-      <w:pPr>
-        <w:spacing w:line="360" w:lineRule="auto"/>
-        <w:ind w:firstLine="480"/>
-      </w:pPr>
-      <w:r>
-        <w:rPr>
-          <w:rFonts w:ascii="宋体" w:hAnsi="宋体" w:eastAsia="宋体"/>
-          <w:b w:val="0"/>
-          <w:sz w:val="24"/>
-        </w:rPr>
-        <w:t>3. C++ 与 Python 跨语言协作时，需要明确定义通信格式、错误码和超时策略。</w:t>
-      </w:r>
-    </w:p>
-    <w:p>
-      <w:pPr>
-        <w:spacing w:line="360" w:lineRule="auto"/>
-        <w:ind w:firstLine="480"/>
-      </w:pPr>
-      <w:r>
-        <w:rPr>
-          <w:rFonts w:ascii="宋体" w:hAnsi="宋体" w:eastAsia="宋体"/>
-          <w:b w:val="0"/>
-          <w:sz w:val="24"/>
-        </w:rPr>
-        <w:t>4. 在毕业设计项目规模下，需要控制功能范围，避免系统复杂度过高导致无法按时完成。</w:t>
-      </w:r>
-    </w:p>
-    <w:p/>
-    <w:p>
-      <w:pPr>
-        <w:spacing w:line="360" w:lineRule="auto"/>
-        <w:ind w:firstLine="480"/>
-      </w:pPr>
-      <w:r>
-        <w:rPr>
-          <w:rFonts w:ascii="宋体" w:hAnsi="宋体" w:eastAsia="宋体"/>
-          <w:b w:val="0"/>
-          <w:sz w:val="24"/>
-        </w:rPr>
-        <w:t>针对上述问题，本文采用分层设计、统一接口约定、模块化调试和逐步联调的方式进行解决。</w:t>
+        <w:t>这种设计既保证了整套项目在 Windows、Linux、WSL 下均有明确运行路径，又保留了题目中 C++ 高并发架构的核心亮点，使论文中的技术路线与工程实现能够保持一致。</w:t>
       </w:r>
     </w:p>
     <w:p/>
@@ -3401,6 +2954,528 @@
           <w:b/>
           <w:sz w:val="28"/>
         </w:rPr>
+        <w:t>第5章 系统详细实现</w:t>
+      </w:r>
+    </w:p>
+    <w:p/>
+    <w:p>
+      <w:pPr>
+        <w:spacing w:line="360" w:lineRule="auto"/>
+        <w:ind w:firstLine="0"/>
+      </w:pPr>
+      <w:r>
+        <w:rPr>
+          <w:rFonts w:ascii="宋体" w:hAnsi="宋体" w:eastAsia="宋体"/>
+          <w:b/>
+          <w:sz w:val="24"/>
+        </w:rPr>
+        <w:t>5.1 开发环境与运行环境</w:t>
+      </w:r>
+    </w:p>
+    <w:p/>
+    <w:p>
+      <w:pPr>
+        <w:spacing w:line="360" w:lineRule="auto"/>
+        <w:ind w:firstLine="480"/>
+      </w:pPr>
+      <w:r>
+        <w:rPr>
+          <w:rFonts w:ascii="宋体" w:hAnsi="宋体" w:eastAsia="宋体"/>
+          <w:b w:val="0"/>
+          <w:sz w:val="24"/>
+        </w:rPr>
+        <w:t>本系统开发工具包括 Visual Studio Code、CLion 或 GCC 编译环境、Python 解释器、MySQL 数据库以及 Postman 等辅助调试工具。运行环境采用 Linux 虚拟机或 Linux 云服务器，后端服务通过本地端口进行联调。</w:t>
+      </w:r>
+    </w:p>
+    <w:p/>
+    <w:p>
+      <w:pPr>
+        <w:spacing w:line="360" w:lineRule="auto"/>
+        <w:ind w:firstLine="0"/>
+      </w:pPr>
+      <w:r>
+        <w:rPr>
+          <w:rFonts w:ascii="宋体" w:hAnsi="宋体" w:eastAsia="宋体"/>
+          <w:b/>
+          <w:sz w:val="24"/>
+        </w:rPr>
+        <w:t>5.2 C++ 高并发接入层实现</w:t>
+      </w:r>
+    </w:p>
+    <w:p/>
+    <w:p>
+      <w:pPr>
+        <w:spacing w:line="360" w:lineRule="auto"/>
+        <w:ind w:firstLine="0"/>
+      </w:pPr>
+      <w:r>
+        <w:rPr>
+          <w:rFonts w:ascii="宋体" w:hAnsi="宋体" w:eastAsia="宋体"/>
+          <w:b/>
+          <w:sz w:val="24"/>
+        </w:rPr>
+        <w:t>5.2.1 服务器启动与监听</w:t>
+      </w:r>
+    </w:p>
+    <w:p/>
+    <w:p>
+      <w:pPr>
+        <w:spacing w:line="360" w:lineRule="auto"/>
+        <w:ind w:firstLine="480"/>
+      </w:pPr>
+      <w:r>
+        <w:rPr>
+          <w:rFonts w:ascii="宋体" w:hAnsi="宋体" w:eastAsia="宋体"/>
+          <w:b w:val="0"/>
+          <w:sz w:val="24"/>
+        </w:rPr>
+        <w:t>服务器启动后首先创建监听套接字，绑定指定端口并进入监听状态。随后创建 Epoll 实例，将监听套接字加入事件集合中，等待新的连接事件到来。</w:t>
+      </w:r>
+    </w:p>
+    <w:p/>
+    <w:p>
+      <w:pPr>
+        <w:spacing w:line="360" w:lineRule="auto"/>
+        <w:ind w:firstLine="0"/>
+      </w:pPr>
+      <w:r>
+        <w:rPr>
+          <w:rFonts w:ascii="宋体" w:hAnsi="宋体" w:eastAsia="宋体"/>
+          <w:b/>
+          <w:sz w:val="24"/>
+        </w:rPr>
+        <w:t>5.2.2 Epoll 事件循环</w:t>
+      </w:r>
+    </w:p>
+    <w:p/>
+    <w:p>
+      <w:pPr>
+        <w:spacing w:line="360" w:lineRule="auto"/>
+        <w:ind w:firstLine="480"/>
+      </w:pPr>
+      <w:r>
+        <w:rPr>
+          <w:rFonts w:ascii="宋体" w:hAnsi="宋体" w:eastAsia="宋体"/>
+          <w:b w:val="0"/>
+          <w:sz w:val="24"/>
+        </w:rPr>
+        <w:t>主线程通过事件循环持续调用 Epoll 等待事件返回。当检测到新连接到达时执行连接建立逻辑；当检测到读写事件时，将对应任务放入线程池队列；当检测到异常事件或连接关闭事件时，执行资源回收。</w:t>
+      </w:r>
+    </w:p>
+    <w:p/>
+    <w:p>
+      <w:pPr>
+        <w:spacing w:line="360" w:lineRule="auto"/>
+        <w:ind w:firstLine="0"/>
+      </w:pPr>
+      <w:r>
+        <w:rPr>
+          <w:rFonts w:ascii="宋体" w:hAnsi="宋体" w:eastAsia="宋体"/>
+          <w:b/>
+          <w:sz w:val="24"/>
+        </w:rPr>
+        <w:t>5.2.3 HTTP 请求解析</w:t>
+      </w:r>
+    </w:p>
+    <w:p/>
+    <w:p>
+      <w:pPr>
+        <w:spacing w:line="360" w:lineRule="auto"/>
+        <w:ind w:firstLine="480"/>
+      </w:pPr>
+      <w:r>
+        <w:rPr>
+          <w:rFonts w:ascii="宋体" w:hAnsi="宋体" w:eastAsia="宋体"/>
+          <w:b w:val="0"/>
+          <w:sz w:val="24"/>
+        </w:rPr>
+        <w:t>系统采用有限状态机方式对 HTTP 报文进行解析，将解析过程划分为请求行解析、请求头解析和消息体解析三个阶段。该方法可提高复杂报文处理的清晰度和稳定性。</w:t>
+      </w:r>
+    </w:p>
+    <w:p/>
+    <w:p>
+      <w:pPr>
+        <w:spacing w:line="360" w:lineRule="auto"/>
+        <w:ind w:firstLine="0"/>
+      </w:pPr>
+      <w:r>
+        <w:rPr>
+          <w:rFonts w:ascii="宋体" w:hAnsi="宋体" w:eastAsia="宋体"/>
+          <w:b/>
+          <w:sz w:val="24"/>
+        </w:rPr>
+        <w:t>5.2.4 线程池任务调度</w:t>
+      </w:r>
+    </w:p>
+    <w:p/>
+    <w:p>
+      <w:pPr>
+        <w:spacing w:line="360" w:lineRule="auto"/>
+        <w:ind w:firstLine="480"/>
+      </w:pPr>
+      <w:r>
+        <w:rPr>
+          <w:rFonts w:ascii="宋体" w:hAnsi="宋体" w:eastAsia="宋体"/>
+          <w:b w:val="0"/>
+          <w:sz w:val="24"/>
+        </w:rPr>
+        <w:t>线程池在系统初始化时预创建多个工作线程。主线程负责将已解析请求封装成任务，工作线程负责执行业务逻辑，包括数据库访问、向 AI 服务发送请求和组织返回报文等。</w:t>
+      </w:r>
+    </w:p>
+    <w:p/>
+    <w:p>
+      <w:pPr>
+        <w:spacing w:line="360" w:lineRule="auto"/>
+        <w:ind w:firstLine="0"/>
+      </w:pPr>
+      <w:r>
+        <w:rPr>
+          <w:rFonts w:ascii="宋体" w:hAnsi="宋体" w:eastAsia="宋体"/>
+          <w:b/>
+          <w:sz w:val="24"/>
+        </w:rPr>
+        <w:t>5.2.5 超时连接处理</w:t>
+      </w:r>
+    </w:p>
+    <w:p/>
+    <w:p>
+      <w:pPr>
+        <w:spacing w:line="360" w:lineRule="auto"/>
+        <w:ind w:firstLine="480"/>
+      </w:pPr>
+      <w:r>
+        <w:rPr>
+          <w:rFonts w:ascii="宋体" w:hAnsi="宋体" w:eastAsia="宋体"/>
+          <w:b w:val="0"/>
+          <w:sz w:val="24"/>
+        </w:rPr>
+        <w:t>系统为每个客户端连接维护超时信息，通过定时器定期扫描长时间无活动连接并主动关闭，以防止连接长期占用系统资源。</w:t>
+      </w:r>
+    </w:p>
+    <w:p/>
+    <w:p>
+      <w:pPr>
+        <w:spacing w:line="360" w:lineRule="auto"/>
+        <w:ind w:firstLine="0"/>
+      </w:pPr>
+      <w:r>
+        <w:rPr>
+          <w:rFonts w:ascii="宋体" w:hAnsi="宋体" w:eastAsia="宋体"/>
+          <w:b/>
+          <w:sz w:val="24"/>
+        </w:rPr>
+        <w:t>5.3 Python AI 服务实现</w:t>
+      </w:r>
+    </w:p>
+    <w:p/>
+    <w:p>
+      <w:pPr>
+        <w:spacing w:line="360" w:lineRule="auto"/>
+        <w:ind w:firstLine="0"/>
+      </w:pPr>
+      <w:r>
+        <w:rPr>
+          <w:rFonts w:ascii="宋体" w:hAnsi="宋体" w:eastAsia="宋体"/>
+          <w:b/>
+          <w:sz w:val="24"/>
+        </w:rPr>
+        <w:t>5.3.1 FastAPI 接口定义</w:t>
+      </w:r>
+    </w:p>
+    <w:p/>
+    <w:p>
+      <w:pPr>
+        <w:spacing w:line="360" w:lineRule="auto"/>
+        <w:ind w:firstLine="480"/>
+      </w:pPr>
+      <w:r>
+        <w:rPr>
+          <w:rFonts w:ascii="宋体" w:hAnsi="宋体" w:eastAsia="宋体"/>
+          <w:b w:val="0"/>
+          <w:sz w:val="24"/>
+        </w:rPr>
+        <w:t>Python 服务提供统一的问答接口，例如 `/api/ask`。该接口接收用户问题、会话编号和可选上下文信息，完成输入校验后调用模型服务。</w:t>
+      </w:r>
+    </w:p>
+    <w:p/>
+    <w:p>
+      <w:pPr>
+        <w:spacing w:line="360" w:lineRule="auto"/>
+        <w:ind w:firstLine="0"/>
+      </w:pPr>
+      <w:r>
+        <w:rPr>
+          <w:rFonts w:ascii="宋体" w:hAnsi="宋体" w:eastAsia="宋体"/>
+          <w:b/>
+          <w:sz w:val="24"/>
+        </w:rPr>
+        <w:t>5.3.2 Prompt 组织与上下文管理</w:t>
+      </w:r>
+    </w:p>
+    <w:p/>
+    <w:p>
+      <w:pPr>
+        <w:spacing w:line="360" w:lineRule="auto"/>
+        <w:ind w:firstLine="480"/>
+      </w:pPr>
+      <w:r>
+        <w:rPr>
+          <w:rFonts w:ascii="宋体" w:hAnsi="宋体" w:eastAsia="宋体"/>
+          <w:b w:val="0"/>
+          <w:sz w:val="24"/>
+        </w:rPr>
+        <w:t>为提升回答质量，系统在发送模型请求前会将用户问题与必要的上下文信息进行拼接，形成较稳定的提示模板。对于多轮对话场景，可根据会话记录加载若干历史消息，以增强回答连贯性。</w:t>
+      </w:r>
+    </w:p>
+    <w:p/>
+    <w:p>
+      <w:pPr>
+        <w:spacing w:line="360" w:lineRule="auto"/>
+        <w:ind w:firstLine="0"/>
+      </w:pPr>
+      <w:r>
+        <w:rPr>
+          <w:rFonts w:ascii="宋体" w:hAnsi="宋体" w:eastAsia="宋体"/>
+          <w:b/>
+          <w:sz w:val="24"/>
+        </w:rPr>
+        <w:t>5.3.3 模型接口调用</w:t>
+      </w:r>
+    </w:p>
+    <w:p/>
+    <w:p>
+      <w:pPr>
+        <w:spacing w:line="360" w:lineRule="auto"/>
+        <w:ind w:firstLine="480"/>
+      </w:pPr>
+      <w:r>
+        <w:rPr>
+          <w:rFonts w:ascii="宋体" w:hAnsi="宋体" w:eastAsia="宋体"/>
+          <w:b w:val="0"/>
+          <w:sz w:val="24"/>
+        </w:rPr>
+        <w:t>AI 服务封装对外部大模型接口的调用逻辑，处理鉴权、超时、异常捕获与结果提取。系统设计为双模式运行：在未配置模型接口环境变量时，自动返回演示模式回复，以保证本地开发和答辩演示的稳定性；在配置 `LLM_API_URL`、`LLM_API_KEY` 和 `LLM_MODEL_NAME` 后，系统会向真实模型服务发送请求并提取结果。若模型调用失败，系统自动回退到本地演示模式，避免异常直接暴露给用户。</w:t>
+      </w:r>
+    </w:p>
+    <w:p/>
+    <w:p>
+      <w:pPr>
+        <w:spacing w:line="360" w:lineRule="auto"/>
+        <w:ind w:firstLine="0"/>
+      </w:pPr>
+      <w:r>
+        <w:rPr>
+          <w:rFonts w:ascii="宋体" w:hAnsi="宋体" w:eastAsia="宋体"/>
+          <w:b/>
+          <w:sz w:val="24"/>
+        </w:rPr>
+        <w:t>5.4 前端交互实现</w:t>
+      </w:r>
+    </w:p>
+    <w:p/>
+    <w:p>
+      <w:pPr>
+        <w:spacing w:line="360" w:lineRule="auto"/>
+        <w:ind w:firstLine="480"/>
+      </w:pPr>
+      <w:r>
+        <w:rPr>
+          <w:rFonts w:ascii="宋体" w:hAnsi="宋体" w:eastAsia="宋体"/>
+          <w:b w:val="0"/>
+          <w:sz w:val="24"/>
+        </w:rPr>
+        <w:t>前端页面主要包括登录页、问答主页、历史记录页和管理员页面。问答主页用于展示用户输入框、对话气泡和返回内容；管理员页面用于查看系统概览、日志、模型参数配置和运行状态。前端通过 AJAX 或 Fetch 接口向后端发送请求，实现异步交互。</w:t>
+      </w:r>
+    </w:p>
+    <w:p/>
+    <w:p>
+      <w:pPr>
+        <w:spacing w:line="360" w:lineRule="auto"/>
+        <w:ind w:firstLine="480"/>
+      </w:pPr>
+      <w:r>
+        <w:rPr>
+          <w:rFonts w:ascii="宋体" w:hAnsi="宋体" w:eastAsia="宋体"/>
+          <w:b w:val="0"/>
+          <w:sz w:val="24"/>
+        </w:rPr>
+        <w:t>为了适配不同环境下的运行方式，前端增加了运行时配置脚本。当前端以默认模式启动时，页面直连 Python 服务，适合 Windows、Linux 和 WSL 的通用演示；当页面以 `mode=gateway` 参数启动时，前端自动将请求发送给 `8080` 端口的 C++ 网关，从而展示 Linux/WSL 环境下的高并发接入层转发能力。</w:t>
+      </w:r>
+    </w:p>
+    <w:p/>
+    <w:p>
+      <w:pPr>
+        <w:spacing w:line="360" w:lineRule="auto"/>
+        <w:ind w:firstLine="0"/>
+      </w:pPr>
+      <w:r>
+        <w:rPr>
+          <w:rFonts w:ascii="宋体" w:hAnsi="宋体" w:eastAsia="宋体"/>
+          <w:b/>
+          <w:sz w:val="24"/>
+        </w:rPr>
+        <w:t>5.5 数据库访问实现</w:t>
+      </w:r>
+    </w:p>
+    <w:p/>
+    <w:p>
+      <w:pPr>
+        <w:spacing w:line="360" w:lineRule="auto"/>
+        <w:ind w:firstLine="480"/>
+      </w:pPr>
+      <w:r>
+        <w:rPr>
+          <w:rFonts w:ascii="宋体" w:hAnsi="宋体" w:eastAsia="宋体"/>
+          <w:b w:val="0"/>
+          <w:sz w:val="24"/>
+        </w:rPr>
+        <w:t>系统在用户登录、问答记录保存、日志记录和配置读取等场景中访问 MySQL 数据库。为保证系统可维护性，可在 Python 服务或中间封装层中统一实现数据库访问逻辑，降低业务代码耦合度。</w:t>
+      </w:r>
+    </w:p>
+    <w:p/>
+    <w:p>
+      <w:pPr>
+        <w:spacing w:line="360" w:lineRule="auto"/>
+        <w:ind w:firstLine="0"/>
+      </w:pPr>
+      <w:r>
+        <w:rPr>
+          <w:rFonts w:ascii="宋体" w:hAnsi="宋体" w:eastAsia="宋体"/>
+          <w:b/>
+          <w:sz w:val="24"/>
+        </w:rPr>
+        <w:t>5.6 C++ 网关转发实现</w:t>
+      </w:r>
+    </w:p>
+    <w:p/>
+    <w:p>
+      <w:pPr>
+        <w:spacing w:line="360" w:lineRule="auto"/>
+        <w:ind w:firstLine="480"/>
+      </w:pPr>
+      <w:r>
+        <w:rPr>
+          <w:rFonts w:ascii="宋体" w:hAnsi="宋体" w:eastAsia="宋体"/>
+          <w:b w:val="0"/>
+          <w:sz w:val="24"/>
+        </w:rPr>
+        <w:t>C++ 网关启动后监听固定端口，通过 Epoll 感知连接事件，并将客户端请求交由线程池异步处理。在线程池任务中，系统首先解析 HTTP 请求行，提取请求方法与路径，再读取消息体内容，最后通过套接字向 Python 服务重新组装 HTTP 请求并转发。Python 服务处理完成后，网关读取完整响应并回传浏览器端。该设计使得“高并发接入”和“智能服务处理”在职责上保持清晰分离。</w:t>
+      </w:r>
+    </w:p>
+    <w:p/>
+    <w:p>
+      <w:pPr>
+        <w:spacing w:line="360" w:lineRule="auto"/>
+        <w:ind w:firstLine="0"/>
+      </w:pPr>
+      <w:r>
+        <w:rPr>
+          <w:rFonts w:ascii="宋体" w:hAnsi="宋体" w:eastAsia="宋体"/>
+          <w:b/>
+          <w:sz w:val="24"/>
+        </w:rPr>
+        <w:t>5.7 关键实现难点分析</w:t>
+      </w:r>
+    </w:p>
+    <w:p/>
+    <w:p>
+      <w:pPr>
+        <w:spacing w:line="360" w:lineRule="auto"/>
+        <w:ind w:firstLine="480"/>
+      </w:pPr>
+      <w:r>
+        <w:rPr>
+          <w:rFonts w:ascii="宋体" w:hAnsi="宋体" w:eastAsia="宋体"/>
+          <w:b w:val="0"/>
+          <w:sz w:val="24"/>
+        </w:rPr>
+        <w:t>本系统在实现过程中主要面临以下难点：</w:t>
+      </w:r>
+    </w:p>
+    <w:p/>
+    <w:p>
+      <w:pPr>
+        <w:spacing w:line="360" w:lineRule="auto"/>
+        <w:ind w:firstLine="480"/>
+      </w:pPr>
+      <w:r>
+        <w:rPr>
+          <w:rFonts w:ascii="宋体" w:hAnsi="宋体" w:eastAsia="宋体"/>
+          <w:b w:val="0"/>
+          <w:sz w:val="24"/>
+        </w:rPr>
+        <w:t>1. C++ 层需要兼顾高并发接入与请求正确解析，容易出现连接管理复杂和调试难度大的问题。</w:t>
+      </w:r>
+    </w:p>
+    <w:p>
+      <w:pPr>
+        <w:spacing w:line="360" w:lineRule="auto"/>
+        <w:ind w:firstLine="480"/>
+      </w:pPr>
+      <w:r>
+        <w:rPr>
+          <w:rFonts w:ascii="宋体" w:hAnsi="宋体" w:eastAsia="宋体"/>
+          <w:b w:val="0"/>
+          <w:sz w:val="24"/>
+        </w:rPr>
+        <w:t>2. Python AI 服务需要处理模型接口超时、返回内容不稳定等情况。</w:t>
+      </w:r>
+    </w:p>
+    <w:p>
+      <w:pPr>
+        <w:spacing w:line="360" w:lineRule="auto"/>
+        <w:ind w:firstLine="480"/>
+      </w:pPr>
+      <w:r>
+        <w:rPr>
+          <w:rFonts w:ascii="宋体" w:hAnsi="宋体" w:eastAsia="宋体"/>
+          <w:b w:val="0"/>
+          <w:sz w:val="24"/>
+        </w:rPr>
+        <w:t>3. C++ 与 Python 跨语言协作时，需要明确定义通信格式、错误码和超时策略。</w:t>
+      </w:r>
+    </w:p>
+    <w:p>
+      <w:pPr>
+        <w:spacing w:line="360" w:lineRule="auto"/>
+        <w:ind w:firstLine="480"/>
+      </w:pPr>
+      <w:r>
+        <w:rPr>
+          <w:rFonts w:ascii="宋体" w:hAnsi="宋体" w:eastAsia="宋体"/>
+          <w:b w:val="0"/>
+          <w:sz w:val="24"/>
+        </w:rPr>
+        <w:t>4. 在毕业设计项目规模下，需要控制功能范围，避免系统复杂度过高导致无法按时完成。</w:t>
+      </w:r>
+    </w:p>
+    <w:p/>
+    <w:p>
+      <w:pPr>
+        <w:spacing w:line="360" w:lineRule="auto"/>
+        <w:ind w:firstLine="480"/>
+      </w:pPr>
+      <w:r>
+        <w:rPr>
+          <w:rFonts w:ascii="宋体" w:hAnsi="宋体" w:eastAsia="宋体"/>
+          <w:b w:val="0"/>
+          <w:sz w:val="24"/>
+        </w:rPr>
+        <w:t>针对上述问题，本文采用分层设计、统一接口约定、模块化调试和逐步联调的方式进行解决。</w:t>
+      </w:r>
+    </w:p>
+    <w:p/>
+    <w:p>
+      <w:pPr>
+        <w:spacing w:line="360" w:lineRule="auto"/>
+        <w:ind w:firstLine="0"/>
+      </w:pPr>
+      <w:r>
+        <w:rPr>
+          <w:rFonts w:ascii="宋体" w:hAnsi="宋体" w:eastAsia="宋体"/>
+          <w:b/>
+          <w:sz w:val="28"/>
+        </w:rPr>
         <w:t>第6章 系统测试与结果分析</w:t>
       </w:r>
     </w:p>
@@ -4036,7 +4111,52 @@
           <w:b/>
           <w:sz w:val="24"/>
         </w:rPr>
-        <w:t>6.5 测试结果分析</w:t>
+        <w:t>6.5 环境适配与部署验证</w:t>
+      </w:r>
+    </w:p>
+    <w:p/>
+    <w:p>
+      <w:pPr>
+        <w:spacing w:line="360" w:lineRule="auto"/>
+        <w:ind w:firstLine="480"/>
+      </w:pPr>
+      <w:r>
+        <w:rPr>
+          <w:rFonts w:ascii="宋体" w:hAnsi="宋体" w:eastAsia="宋体"/>
+          <w:b w:val="0"/>
+          <w:sz w:val="24"/>
+        </w:rPr>
+        <w:t>从跨环境运行角度看，系统的部署验证分为三个层次。第一，Windows 环境下验证前端页面与 Python 服务能够独立启动，并完成登录、问答、历史记录和管理员概览等核心功能；第二，WSL 环境下验证 C++ 网关能够完成编译、启动与转发，并通过网关访问 `/api/login`、`/api/chat`、`/api/history` 等主链路接口；第三，Linux 环境下保留完整部署与并发压测入口，用于后续进一步补充高并发实验数据。</w:t>
+      </w:r>
+    </w:p>
+    <w:p/>
+    <w:p>
+      <w:pPr>
+        <w:spacing w:line="360" w:lineRule="auto"/>
+        <w:ind w:firstLine="480"/>
+      </w:pPr>
+      <w:r>
+        <w:rPr>
+          <w:rFonts w:ascii="宋体" w:hAnsi="宋体" w:eastAsia="宋体"/>
+          <w:b w:val="0"/>
+          <w:sz w:val="24"/>
+        </w:rPr>
+        <w:t>通过这种环境适配设计，系统避免了“只能在作者本机上运行”的问题，使其能够在不同操作系统和运行环境下按照统一的接口契约完成部署与演示。</w:t>
+      </w:r>
+    </w:p>
+    <w:p/>
+    <w:p>
+      <w:pPr>
+        <w:spacing w:line="360" w:lineRule="auto"/>
+        <w:ind w:firstLine="0"/>
+      </w:pPr>
+      <w:r>
+        <w:rPr>
+          <w:rFonts w:ascii="宋体" w:hAnsi="宋体" w:eastAsia="宋体"/>
+          <w:b/>
+          <w:sz w:val="24"/>
+        </w:rPr>
+        <w:t>6.6 测试结果分析</w:t>
       </w:r>
     </w:p>
     <w:p/>

</xml_diff>

<commit_message>
feat: add runtime health checks and env templates
</commit_message>
<xml_diff>
--- a/output/doc/毕业设计说明书初稿.docx
+++ b/output/doc/毕业设计说明书初稿.docx
@@ -2939,6 +2939,21 @@
           <w:b w:val="0"/>
           <w:sz w:val="24"/>
         </w:rPr>
+        <w:t>为了降低不同环境下的部署歧义，项目根目录统一提供 `.env.example` 作为环境变量模板，用于约定模型接口地址、端口号和运行参数；同时系统定义 `/api/health` 作为统一健康检查接口，使得 Windows、Linux 和 WSL 三类环境均可以通过相同方式完成最小可运行验证。</w:t>
+      </w:r>
+    </w:p>
+    <w:p/>
+    <w:p>
+      <w:pPr>
+        <w:spacing w:line="360" w:lineRule="auto"/>
+        <w:ind w:firstLine="480"/>
+      </w:pPr>
+      <w:r>
+        <w:rPr>
+          <w:rFonts w:ascii="宋体" w:hAnsi="宋体" w:eastAsia="宋体"/>
+          <w:b w:val="0"/>
+          <w:sz w:val="24"/>
+        </w:rPr>
         <w:t>这种设计既保证了整套项目在 Windows、Linux、WSL 下均有明确运行路径，又保留了题目中 C++ 高并发架构的核心亮点，使论文中的技术路线与工程实现能够保持一致。</w:t>
       </w:r>
     </w:p>
@@ -3306,6 +3321,21 @@
     <w:p>
       <w:pPr>
         <w:spacing w:line="360" w:lineRule="auto"/>
+        <w:ind w:firstLine="480"/>
+      </w:pPr>
+      <w:r>
+        <w:rPr>
+          <w:rFonts w:ascii="宋体" w:hAnsi="宋体" w:eastAsia="宋体"/>
+          <w:b w:val="0"/>
+          <w:sz w:val="24"/>
+        </w:rPr>
+        <w:t>为便于部署检查，Python 服务额外提供 `/api/health` 健康检查接口，返回服务状态、当前运行模式、模型名称和会话数量等基础信息。配合 `verify_runtime.ps1` 与 `verify_runtime.sh` 脚本，系统可以在不同环境下用统一方式验证“服务启动成功、登录成功、问答成功”这条最小主链路。</w:t>
+      </w:r>
+    </w:p>
+    <w:p/>
+    <w:p>
+      <w:pPr>
+        <w:spacing w:line="360" w:lineRule="auto"/>
         <w:ind w:firstLine="0"/>
       </w:pPr>
       <w:r>
@@ -4127,6 +4157,21 @@
           <w:sz w:val="24"/>
         </w:rPr>
         <w:t>从跨环境运行角度看，系统的部署验证分为三个层次。第一，Windows 环境下验证前端页面与 Python 服务能够独立启动，并完成登录、问答、历史记录和管理员概览等核心功能；第二，WSL 环境下验证 C++ 网关能够完成编译、启动与转发，并通过网关访问 `/api/login`、`/api/chat`、`/api/history` 等主链路接口；第三，Linux 环境下保留完整部署与并发压测入口，用于后续进一步补充高并发实验数据。</w:t>
+      </w:r>
+    </w:p>
+    <w:p/>
+    <w:p>
+      <w:pPr>
+        <w:spacing w:line="360" w:lineRule="auto"/>
+        <w:ind w:firstLine="480"/>
+      </w:pPr>
+      <w:r>
+        <w:rPr>
+          <w:rFonts w:ascii="宋体" w:hAnsi="宋体" w:eastAsia="宋体"/>
+          <w:b w:val="0"/>
+          <w:sz w:val="24"/>
+        </w:rPr>
+        <w:t>在具体验证方法上，本系统将 `/api/health` 作为统一健康检查契约，并提供 Windows PowerShell 与 Linux Shell 两套运行验证脚本。通过这种方式，三个环境下的验证工作不再依赖人工逐条构造请求，而是能够按照统一脚本完成基础检查，提高了部署验证的可重复性。</w:t>
       </w:r>
     </w:p>
     <w:p/>

</xml_diff>

<commit_message>
feat: make gateway startup configurable
</commit_message>
<xml_diff>
--- a/output/doc/毕业设计说明书初稿.docx
+++ b/output/doc/毕业设计说明书初稿.docx
@@ -2954,6 +2954,21 @@
           <w:b w:val="0"/>
           <w:sz w:val="24"/>
         </w:rPr>
+        <w:t>在高并发专项层中，C++ 网关默认监听 `8080` 端口并转发到 `127.0.0.1:8000` 的 Python 服务，同时支持通过 `GATEWAY_PORT`、`UPSTREAM_HOST`、`UPSTREAM_PORT` 等环境变量覆盖默认配置，从而适应 WSL 与 Linux 下不同的联调和部署拓扑。</w:t>
+      </w:r>
+    </w:p>
+    <w:p/>
+    <w:p>
+      <w:pPr>
+        <w:spacing w:line="360" w:lineRule="auto"/>
+        <w:ind w:firstLine="480"/>
+      </w:pPr>
+      <w:r>
+        <w:rPr>
+          <w:rFonts w:ascii="宋体" w:hAnsi="宋体" w:eastAsia="宋体"/>
+          <w:b w:val="0"/>
+          <w:sz w:val="24"/>
+        </w:rPr>
         <w:t>这种设计既保证了整套项目在 Windows、Linux、WSL 下均有明确运行路径，又保留了题目中 C++ 高并发架构的核心亮点，使论文中的技术路线与工程实现能够保持一致。</w:t>
       </w:r>
     </w:p>
@@ -3330,6 +3345,21 @@
           <w:sz w:val="24"/>
         </w:rPr>
         <w:t>为便于部署检查，Python 服务额外提供 `/api/health` 健康检查接口，返回服务状态、当前运行模式、模型名称和会话数量等基础信息。配合 `verify_runtime.ps1` 与 `verify_runtime.sh` 脚本，系统可以在不同环境下用统一方式验证“服务启动成功、登录成功、问答成功”这条最小主链路。</w:t>
+      </w:r>
+    </w:p>
+    <w:p/>
+    <w:p>
+      <w:pPr>
+        <w:spacing w:line="360" w:lineRule="auto"/>
+        <w:ind w:firstLine="480"/>
+      </w:pPr>
+      <w:r>
+        <w:rPr>
+          <w:rFonts w:ascii="宋体" w:hAnsi="宋体" w:eastAsia="宋体"/>
+          <w:b w:val="0"/>
+          <w:sz w:val="24"/>
+        </w:rPr>
+        <w:t>针对 Linux / WSL 下的网关专项验证，系统额外提供 `start_gateway_wsl.sh` 脚本，用于按统一环境变量启动 epoll 网关，并结合 `verify_gateway_smoke.sh` 对历史记录接口进行补充验证。这种做法降低了联调时对人工输入命令的依赖，提高了实验复现效率。</w:t>
       </w:r>
     </w:p>
     <w:p/>

</xml_diff>

<commit_message>
fix: remove outer borders from chapter three tables
</commit_message>
<xml_diff>
--- a/output/doc/毕业设计说明书初稿.docx
+++ b/output/doc/毕业设计说明书初稿.docx
@@ -2528,9 +2528,14 @@
     </w:p>
     <w:tbl>
       <w:tblPr>
-        <w:tblStyle w:val="TableGrid"/>
         <w:tblW w:type="auto" w:w="0"/>
         <w:tblLook w:firstColumn="1" w:firstRow="1" w:lastColumn="0" w:lastRow="0" w:noHBand="0" w:noVBand="1" w:val="04A0"/>
+        <w:tblBorders>
+          <w:left w:val="nil"/>
+          <w:right w:val="nil"/>
+          <w:start w:val="nil"/>
+          <w:end w:val="nil"/>
+        </w:tblBorders>
       </w:tblPr>
       <w:tblGrid>
         <w:gridCol w:w="1728"/>
@@ -2544,6 +2549,14 @@
           <w:tcPr>
             <w:tcW w:type="dxa" w:w="1728"/>
             <w:vAlign w:val="center"/>
+            <w:tcBorders>
+              <w:top w:val="single" w:sz="4" w:space="0" w:color="auto"/>
+              <w:bottom w:val="single" w:sz="4" w:space="0" w:color="auto"/>
+              <w:left w:val="nil"/>
+              <w:right w:val="single" w:sz="4" w:space="0" w:color="auto"/>
+              <w:start w:val="nil"/>
+              <w:end w:val="single" w:sz="4" w:space="0" w:color="auto"/>
+            </w:tcBorders>
           </w:tcPr>
           <w:p>
             <w:pPr>
@@ -2564,6 +2577,14 @@
           <w:tcPr>
             <w:tcW w:type="dxa" w:w="1728"/>
             <w:vAlign w:val="center"/>
+            <w:tcBorders>
+              <w:top w:val="single" w:sz="4" w:space="0" w:color="auto"/>
+              <w:bottom w:val="single" w:sz="4" w:space="0" w:color="auto"/>
+              <w:left w:val="single" w:sz="4" w:space="0" w:color="auto"/>
+              <w:right w:val="single" w:sz="4" w:space="0" w:color="auto"/>
+              <w:start w:val="single" w:sz="4" w:space="0" w:color="auto"/>
+              <w:end w:val="single" w:sz="4" w:space="0" w:color="auto"/>
+            </w:tcBorders>
           </w:tcPr>
           <w:p>
             <w:pPr>
@@ -2584,6 +2605,14 @@
           <w:tcPr>
             <w:tcW w:type="dxa" w:w="1728"/>
             <w:vAlign w:val="center"/>
+            <w:tcBorders>
+              <w:top w:val="single" w:sz="4" w:space="0" w:color="auto"/>
+              <w:bottom w:val="single" w:sz="4" w:space="0" w:color="auto"/>
+              <w:left w:val="single" w:sz="4" w:space="0" w:color="auto"/>
+              <w:right w:val="single" w:sz="4" w:space="0" w:color="auto"/>
+              <w:start w:val="single" w:sz="4" w:space="0" w:color="auto"/>
+              <w:end w:val="single" w:sz="4" w:space="0" w:color="auto"/>
+            </w:tcBorders>
           </w:tcPr>
           <w:p>
             <w:pPr>
@@ -2604,6 +2633,14 @@
           <w:tcPr>
             <w:tcW w:type="dxa" w:w="1728"/>
             <w:vAlign w:val="center"/>
+            <w:tcBorders>
+              <w:top w:val="single" w:sz="4" w:space="0" w:color="auto"/>
+              <w:bottom w:val="single" w:sz="4" w:space="0" w:color="auto"/>
+              <w:left w:val="single" w:sz="4" w:space="0" w:color="auto"/>
+              <w:right w:val="single" w:sz="4" w:space="0" w:color="auto"/>
+              <w:start w:val="single" w:sz="4" w:space="0" w:color="auto"/>
+              <w:end w:val="single" w:sz="4" w:space="0" w:color="auto"/>
+            </w:tcBorders>
           </w:tcPr>
           <w:p>
             <w:pPr>
@@ -2624,6 +2661,14 @@
           <w:tcPr>
             <w:tcW w:type="dxa" w:w="1728"/>
             <w:vAlign w:val="center"/>
+            <w:tcBorders>
+              <w:top w:val="single" w:sz="4" w:space="0" w:color="auto"/>
+              <w:bottom w:val="single" w:sz="4" w:space="0" w:color="auto"/>
+              <w:left w:val="single" w:sz="4" w:space="0" w:color="auto"/>
+              <w:right w:val="nil"/>
+              <w:start w:val="single" w:sz="4" w:space="0" w:color="auto"/>
+              <w:end w:val="nil"/>
+            </w:tcBorders>
           </w:tcPr>
           <w:p>
             <w:pPr>
@@ -2646,6 +2691,14 @@
           <w:tcPr>
             <w:tcW w:type="dxa" w:w="1728"/>
             <w:vAlign w:val="center"/>
+            <w:tcBorders>
+              <w:top w:val="single" w:sz="4" w:space="0" w:color="auto"/>
+              <w:bottom w:val="single" w:sz="4" w:space="0" w:color="auto"/>
+              <w:left w:val="nil"/>
+              <w:right w:val="single" w:sz="4" w:space="0" w:color="auto"/>
+              <w:start w:val="nil"/>
+              <w:end w:val="single" w:sz="4" w:space="0" w:color="auto"/>
+            </w:tcBorders>
           </w:tcPr>
           <w:p>
             <w:pPr>
@@ -2666,6 +2719,14 @@
           <w:tcPr>
             <w:tcW w:type="dxa" w:w="1728"/>
             <w:vAlign w:val="center"/>
+            <w:tcBorders>
+              <w:top w:val="single" w:sz="4" w:space="0" w:color="auto"/>
+              <w:bottom w:val="single" w:sz="4" w:space="0" w:color="auto"/>
+              <w:left w:val="single" w:sz="4" w:space="0" w:color="auto"/>
+              <w:right w:val="single" w:sz="4" w:space="0" w:color="auto"/>
+              <w:start w:val="single" w:sz="4" w:space="0" w:color="auto"/>
+              <w:end w:val="single" w:sz="4" w:space="0" w:color="auto"/>
+            </w:tcBorders>
           </w:tcPr>
           <w:p>
             <w:pPr>
@@ -2686,6 +2747,14 @@
           <w:tcPr>
             <w:tcW w:type="dxa" w:w="1728"/>
             <w:vAlign w:val="center"/>
+            <w:tcBorders>
+              <w:top w:val="single" w:sz="4" w:space="0" w:color="auto"/>
+              <w:bottom w:val="single" w:sz="4" w:space="0" w:color="auto"/>
+              <w:left w:val="single" w:sz="4" w:space="0" w:color="auto"/>
+              <w:right w:val="single" w:sz="4" w:space="0" w:color="auto"/>
+              <w:start w:val="single" w:sz="4" w:space="0" w:color="auto"/>
+              <w:end w:val="single" w:sz="4" w:space="0" w:color="auto"/>
+            </w:tcBorders>
           </w:tcPr>
           <w:p>
             <w:pPr>
@@ -2706,6 +2775,14 @@
           <w:tcPr>
             <w:tcW w:type="dxa" w:w="1728"/>
             <w:vAlign w:val="center"/>
+            <w:tcBorders>
+              <w:top w:val="single" w:sz="4" w:space="0" w:color="auto"/>
+              <w:bottom w:val="single" w:sz="4" w:space="0" w:color="auto"/>
+              <w:left w:val="single" w:sz="4" w:space="0" w:color="auto"/>
+              <w:right w:val="single" w:sz="4" w:space="0" w:color="auto"/>
+              <w:start w:val="single" w:sz="4" w:space="0" w:color="auto"/>
+              <w:end w:val="single" w:sz="4" w:space="0" w:color="auto"/>
+            </w:tcBorders>
           </w:tcPr>
           <w:p>
             <w:pPr>
@@ -2726,6 +2803,14 @@
           <w:tcPr>
             <w:tcW w:type="dxa" w:w="1728"/>
             <w:vAlign w:val="center"/>
+            <w:tcBorders>
+              <w:top w:val="single" w:sz="4" w:space="0" w:color="auto"/>
+              <w:bottom w:val="single" w:sz="4" w:space="0" w:color="auto"/>
+              <w:left w:val="single" w:sz="4" w:space="0" w:color="auto"/>
+              <w:right w:val="nil"/>
+              <w:start w:val="single" w:sz="4" w:space="0" w:color="auto"/>
+              <w:end w:val="nil"/>
+            </w:tcBorders>
           </w:tcPr>
           <w:p>
             <w:pPr>
@@ -2748,6 +2833,14 @@
           <w:tcPr>
             <w:tcW w:type="dxa" w:w="1728"/>
             <w:vAlign w:val="center"/>
+            <w:tcBorders>
+              <w:top w:val="single" w:sz="4" w:space="0" w:color="auto"/>
+              <w:bottom w:val="single" w:sz="4" w:space="0" w:color="auto"/>
+              <w:left w:val="nil"/>
+              <w:right w:val="single" w:sz="4" w:space="0" w:color="auto"/>
+              <w:start w:val="nil"/>
+              <w:end w:val="single" w:sz="4" w:space="0" w:color="auto"/>
+            </w:tcBorders>
           </w:tcPr>
           <w:p>
             <w:pPr>
@@ -2768,6 +2861,14 @@
           <w:tcPr>
             <w:tcW w:type="dxa" w:w="1728"/>
             <w:vAlign w:val="center"/>
+            <w:tcBorders>
+              <w:top w:val="single" w:sz="4" w:space="0" w:color="auto"/>
+              <w:bottom w:val="single" w:sz="4" w:space="0" w:color="auto"/>
+              <w:left w:val="single" w:sz="4" w:space="0" w:color="auto"/>
+              <w:right w:val="single" w:sz="4" w:space="0" w:color="auto"/>
+              <w:start w:val="single" w:sz="4" w:space="0" w:color="auto"/>
+              <w:end w:val="single" w:sz="4" w:space="0" w:color="auto"/>
+            </w:tcBorders>
           </w:tcPr>
           <w:p>
             <w:pPr>
@@ -2788,6 +2889,14 @@
           <w:tcPr>
             <w:tcW w:type="dxa" w:w="1728"/>
             <w:vAlign w:val="center"/>
+            <w:tcBorders>
+              <w:top w:val="single" w:sz="4" w:space="0" w:color="auto"/>
+              <w:bottom w:val="single" w:sz="4" w:space="0" w:color="auto"/>
+              <w:left w:val="single" w:sz="4" w:space="0" w:color="auto"/>
+              <w:right w:val="single" w:sz="4" w:space="0" w:color="auto"/>
+              <w:start w:val="single" w:sz="4" w:space="0" w:color="auto"/>
+              <w:end w:val="single" w:sz="4" w:space="0" w:color="auto"/>
+            </w:tcBorders>
           </w:tcPr>
           <w:p>
             <w:pPr>
@@ -2808,6 +2917,14 @@
           <w:tcPr>
             <w:tcW w:type="dxa" w:w="1728"/>
             <w:vAlign w:val="center"/>
+            <w:tcBorders>
+              <w:top w:val="single" w:sz="4" w:space="0" w:color="auto"/>
+              <w:bottom w:val="single" w:sz="4" w:space="0" w:color="auto"/>
+              <w:left w:val="single" w:sz="4" w:space="0" w:color="auto"/>
+              <w:right w:val="single" w:sz="4" w:space="0" w:color="auto"/>
+              <w:start w:val="single" w:sz="4" w:space="0" w:color="auto"/>
+              <w:end w:val="single" w:sz="4" w:space="0" w:color="auto"/>
+            </w:tcBorders>
           </w:tcPr>
           <w:p>
             <w:pPr>
@@ -2828,6 +2945,14 @@
           <w:tcPr>
             <w:tcW w:type="dxa" w:w="1728"/>
             <w:vAlign w:val="center"/>
+            <w:tcBorders>
+              <w:top w:val="single" w:sz="4" w:space="0" w:color="auto"/>
+              <w:bottom w:val="single" w:sz="4" w:space="0" w:color="auto"/>
+              <w:left w:val="single" w:sz="4" w:space="0" w:color="auto"/>
+              <w:right w:val="nil"/>
+              <w:start w:val="single" w:sz="4" w:space="0" w:color="auto"/>
+              <w:end w:val="nil"/>
+            </w:tcBorders>
           </w:tcPr>
           <w:p>
             <w:pPr>
@@ -2850,6 +2975,14 @@
           <w:tcPr>
             <w:tcW w:type="dxa" w:w="1728"/>
             <w:vAlign w:val="center"/>
+            <w:tcBorders>
+              <w:top w:val="single" w:sz="4" w:space="0" w:color="auto"/>
+              <w:bottom w:val="single" w:sz="4" w:space="0" w:color="auto"/>
+              <w:left w:val="nil"/>
+              <w:right w:val="single" w:sz="4" w:space="0" w:color="auto"/>
+              <w:start w:val="nil"/>
+              <w:end w:val="single" w:sz="4" w:space="0" w:color="auto"/>
+            </w:tcBorders>
           </w:tcPr>
           <w:p>
             <w:pPr>
@@ -2870,6 +3003,14 @@
           <w:tcPr>
             <w:tcW w:type="dxa" w:w="1728"/>
             <w:vAlign w:val="center"/>
+            <w:tcBorders>
+              <w:top w:val="single" w:sz="4" w:space="0" w:color="auto"/>
+              <w:bottom w:val="single" w:sz="4" w:space="0" w:color="auto"/>
+              <w:left w:val="single" w:sz="4" w:space="0" w:color="auto"/>
+              <w:right w:val="single" w:sz="4" w:space="0" w:color="auto"/>
+              <w:start w:val="single" w:sz="4" w:space="0" w:color="auto"/>
+              <w:end w:val="single" w:sz="4" w:space="0" w:color="auto"/>
+            </w:tcBorders>
           </w:tcPr>
           <w:p>
             <w:pPr>
@@ -2890,6 +3031,14 @@
           <w:tcPr>
             <w:tcW w:type="dxa" w:w="1728"/>
             <w:vAlign w:val="center"/>
+            <w:tcBorders>
+              <w:top w:val="single" w:sz="4" w:space="0" w:color="auto"/>
+              <w:bottom w:val="single" w:sz="4" w:space="0" w:color="auto"/>
+              <w:left w:val="single" w:sz="4" w:space="0" w:color="auto"/>
+              <w:right w:val="single" w:sz="4" w:space="0" w:color="auto"/>
+              <w:start w:val="single" w:sz="4" w:space="0" w:color="auto"/>
+              <w:end w:val="single" w:sz="4" w:space="0" w:color="auto"/>
+            </w:tcBorders>
           </w:tcPr>
           <w:p>
             <w:pPr>
@@ -2910,6 +3059,14 @@
           <w:tcPr>
             <w:tcW w:type="dxa" w:w="1728"/>
             <w:vAlign w:val="center"/>
+            <w:tcBorders>
+              <w:top w:val="single" w:sz="4" w:space="0" w:color="auto"/>
+              <w:bottom w:val="single" w:sz="4" w:space="0" w:color="auto"/>
+              <w:left w:val="single" w:sz="4" w:space="0" w:color="auto"/>
+              <w:right w:val="single" w:sz="4" w:space="0" w:color="auto"/>
+              <w:start w:val="single" w:sz="4" w:space="0" w:color="auto"/>
+              <w:end w:val="single" w:sz="4" w:space="0" w:color="auto"/>
+            </w:tcBorders>
           </w:tcPr>
           <w:p>
             <w:pPr>
@@ -2930,6 +3087,14 @@
           <w:tcPr>
             <w:tcW w:type="dxa" w:w="1728"/>
             <w:vAlign w:val="center"/>
+            <w:tcBorders>
+              <w:top w:val="single" w:sz="4" w:space="0" w:color="auto"/>
+              <w:bottom w:val="single" w:sz="4" w:space="0" w:color="auto"/>
+              <w:left w:val="single" w:sz="4" w:space="0" w:color="auto"/>
+              <w:right w:val="nil"/>
+              <w:start w:val="single" w:sz="4" w:space="0" w:color="auto"/>
+              <w:end w:val="nil"/>
+            </w:tcBorders>
           </w:tcPr>
           <w:p>
             <w:pPr>
@@ -3068,10 +3233,12 @@
             <w:tcW w:type="dxa" w:w="2880"/>
             <w:vAlign w:val="center"/>
             <w:tcBorders>
-              <w:left w:val="nil"/>
               <w:top w:val="single" w:sz="4" w:space="0" w:color="auto"/>
               <w:bottom w:val="single" w:sz="4" w:space="0" w:color="auto"/>
+              <w:left w:val="nil"/>
               <w:right w:val="single" w:sz="4" w:space="0" w:color="auto"/>
+              <w:start w:val="nil"/>
+              <w:end w:val="single" w:sz="4" w:space="0" w:color="auto"/>
             </w:tcBorders>
           </w:tcPr>
           <w:p>
@@ -3095,10 +3262,12 @@
             <w:gridSpan w:val="2"/>
             <w:vAlign w:val="center"/>
             <w:tcBorders>
-              <w:right w:val="nil"/>
               <w:top w:val="single" w:sz="4" w:space="0" w:color="auto"/>
               <w:bottom w:val="single" w:sz="4" w:space="0" w:color="auto"/>
               <w:left w:val="single" w:sz="4" w:space="0" w:color="auto"/>
+              <w:right w:val="nil"/>
+              <w:start w:val="single" w:sz="4" w:space="0" w:color="auto"/>
+              <w:end w:val="nil"/>
             </w:tcBorders>
           </w:tcPr>
           <w:p>
@@ -3123,10 +3292,12 @@
             <w:tcW w:type="dxa" w:w="2880"/>
             <w:vAlign w:val="center"/>
             <w:tcBorders>
-              <w:left w:val="nil"/>
               <w:top w:val="single" w:sz="4" w:space="0" w:color="auto"/>
               <w:bottom w:val="single" w:sz="4" w:space="0" w:color="auto"/>
+              <w:left w:val="nil"/>
               <w:right w:val="single" w:sz="4" w:space="0" w:color="auto"/>
+              <w:start w:val="nil"/>
+              <w:end w:val="single" w:sz="4" w:space="0" w:color="auto"/>
             </w:tcBorders>
           </w:tcPr>
           <w:p>
@@ -3150,10 +3321,12 @@
             <w:gridSpan w:val="2"/>
             <w:vAlign w:val="center"/>
             <w:tcBorders>
-              <w:right w:val="nil"/>
               <w:top w:val="single" w:sz="4" w:space="0" w:color="auto"/>
               <w:bottom w:val="single" w:sz="4" w:space="0" w:color="auto"/>
               <w:left w:val="single" w:sz="4" w:space="0" w:color="auto"/>
+              <w:right w:val="nil"/>
+              <w:start w:val="single" w:sz="4" w:space="0" w:color="auto"/>
+              <w:end w:val="nil"/>
             </w:tcBorders>
           </w:tcPr>
           <w:p>
@@ -3178,10 +3351,12 @@
             <w:tcW w:type="dxa" w:w="2880"/>
             <w:vAlign w:val="center"/>
             <w:tcBorders>
-              <w:left w:val="nil"/>
               <w:top w:val="single" w:sz="4" w:space="0" w:color="auto"/>
               <w:bottom w:val="single" w:sz="4" w:space="0" w:color="auto"/>
+              <w:left w:val="nil"/>
               <w:right w:val="single" w:sz="4" w:space="0" w:color="auto"/>
+              <w:start w:val="nil"/>
+              <w:end w:val="single" w:sz="4" w:space="0" w:color="auto"/>
             </w:tcBorders>
           </w:tcPr>
           <w:p>
@@ -3205,10 +3380,12 @@
             <w:gridSpan w:val="2"/>
             <w:vAlign w:val="center"/>
             <w:tcBorders>
-              <w:right w:val="nil"/>
               <w:top w:val="single" w:sz="4" w:space="0" w:color="auto"/>
               <w:bottom w:val="single" w:sz="4" w:space="0" w:color="auto"/>
               <w:left w:val="single" w:sz="4" w:space="0" w:color="auto"/>
+              <w:right w:val="nil"/>
+              <w:start w:val="single" w:sz="4" w:space="0" w:color="auto"/>
+              <w:end w:val="nil"/>
             </w:tcBorders>
           </w:tcPr>
           <w:p>
@@ -3233,10 +3410,12 @@
             <w:tcW w:type="dxa" w:w="2880"/>
             <w:vAlign w:val="center"/>
             <w:tcBorders>
-              <w:left w:val="nil"/>
               <w:top w:val="single" w:sz="4" w:space="0" w:color="auto"/>
               <w:bottom w:val="single" w:sz="4" w:space="0" w:color="auto"/>
+              <w:left w:val="nil"/>
               <w:right w:val="single" w:sz="4" w:space="0" w:color="auto"/>
+              <w:start w:val="nil"/>
+              <w:end w:val="single" w:sz="4" w:space="0" w:color="auto"/>
             </w:tcBorders>
           </w:tcPr>
           <w:p>
@@ -3260,10 +3439,12 @@
             <w:gridSpan w:val="2"/>
             <w:vAlign w:val="center"/>
             <w:tcBorders>
-              <w:right w:val="nil"/>
               <w:top w:val="single" w:sz="4" w:space="0" w:color="auto"/>
               <w:bottom w:val="single" w:sz="4" w:space="0" w:color="auto"/>
               <w:left w:val="single" w:sz="4" w:space="0" w:color="auto"/>
+              <w:right w:val="nil"/>
+              <w:start w:val="single" w:sz="4" w:space="0" w:color="auto"/>
+              <w:end w:val="nil"/>
             </w:tcBorders>
           </w:tcPr>
           <w:p>
@@ -3288,10 +3469,12 @@
             <w:tcW w:type="dxa" w:w="2880"/>
             <w:vAlign w:val="center"/>
             <w:tcBorders>
-              <w:left w:val="nil"/>
               <w:top w:val="single" w:sz="4" w:space="0" w:color="auto"/>
               <w:bottom w:val="single" w:sz="4" w:space="0" w:color="auto"/>
+              <w:left w:val="nil"/>
               <w:right w:val="single" w:sz="4" w:space="0" w:color="auto"/>
+              <w:start w:val="nil"/>
+              <w:end w:val="single" w:sz="4" w:space="0" w:color="auto"/>
             </w:tcBorders>
           </w:tcPr>
           <w:p>
@@ -3315,10 +3498,12 @@
             <w:gridSpan w:val="2"/>
             <w:vAlign w:val="center"/>
             <w:tcBorders>
-              <w:right w:val="nil"/>
               <w:top w:val="single" w:sz="4" w:space="0" w:color="auto"/>
               <w:bottom w:val="single" w:sz="4" w:space="0" w:color="auto"/>
               <w:left w:val="single" w:sz="4" w:space="0" w:color="auto"/>
+              <w:right w:val="nil"/>
+              <w:start w:val="single" w:sz="4" w:space="0" w:color="auto"/>
+              <w:end w:val="nil"/>
             </w:tcBorders>
           </w:tcPr>
           <w:p>
@@ -3343,10 +3528,12 @@
             <w:tcW w:type="dxa" w:w="2880"/>
             <w:vAlign w:val="center"/>
             <w:tcBorders>
-              <w:left w:val="nil"/>
               <w:top w:val="single" w:sz="4" w:space="0" w:color="auto"/>
               <w:bottom w:val="single" w:sz="4" w:space="0" w:color="auto"/>
+              <w:left w:val="nil"/>
               <w:right w:val="single" w:sz="4" w:space="0" w:color="auto"/>
+              <w:start w:val="nil"/>
+              <w:end w:val="single" w:sz="4" w:space="0" w:color="auto"/>
             </w:tcBorders>
           </w:tcPr>
           <w:p>
@@ -3370,10 +3557,12 @@
             <w:gridSpan w:val="2"/>
             <w:vAlign w:val="center"/>
             <w:tcBorders>
-              <w:right w:val="nil"/>
               <w:top w:val="single" w:sz="4" w:space="0" w:color="auto"/>
               <w:bottom w:val="single" w:sz="4" w:space="0" w:color="auto"/>
               <w:left w:val="single" w:sz="4" w:space="0" w:color="auto"/>
+              <w:right w:val="nil"/>
+              <w:start w:val="single" w:sz="4" w:space="0" w:color="auto"/>
+              <w:end w:val="nil"/>
             </w:tcBorders>
           </w:tcPr>
           <w:p>
@@ -3399,10 +3588,12 @@
             <w:vMerge w:val="restart"/>
             <w:vAlign w:val="center"/>
             <w:tcBorders>
-              <w:left w:val="nil"/>
               <w:top w:val="single" w:sz="4" w:space="0" w:color="auto"/>
               <w:bottom w:val="single" w:sz="4" w:space="0" w:color="auto"/>
+              <w:left w:val="nil"/>
               <w:right w:val="single" w:sz="4" w:space="0" w:color="auto"/>
+              <w:start w:val="nil"/>
+              <w:end w:val="single" w:sz="4" w:space="0" w:color="auto"/>
             </w:tcBorders>
           </w:tcPr>
           <w:p>
@@ -3429,6 +3620,8 @@
               <w:bottom w:val="single" w:sz="4" w:space="0" w:color="auto"/>
               <w:left w:val="single" w:sz="4" w:space="0" w:color="auto"/>
               <w:right w:val="single" w:sz="4" w:space="0" w:color="auto"/>
+              <w:start w:val="single" w:sz="4" w:space="0" w:color="auto"/>
+              <w:end w:val="single" w:sz="4" w:space="0" w:color="auto"/>
             </w:tcBorders>
           </w:tcPr>
           <w:p>
@@ -3451,10 +3644,12 @@
             <w:tcW w:type="dxa" w:w="2880"/>
             <w:vAlign w:val="center"/>
             <w:tcBorders>
-              <w:right w:val="nil"/>
               <w:top w:val="single" w:sz="4" w:space="0" w:color="auto"/>
               <w:bottom w:val="single" w:sz="4" w:space="0" w:color="auto"/>
               <w:left w:val="single" w:sz="4" w:space="0" w:color="auto"/>
+              <w:right w:val="nil"/>
+              <w:start w:val="single" w:sz="4" w:space="0" w:color="auto"/>
+              <w:end w:val="nil"/>
             </w:tcBorders>
           </w:tcPr>
           <w:p>
@@ -3490,6 +3685,8 @@
               <w:bottom w:val="single" w:sz="4" w:space="0" w:color="auto"/>
               <w:left w:val="single" w:sz="4" w:space="0" w:color="auto"/>
               <w:right w:val="single" w:sz="4" w:space="0" w:color="auto"/>
+              <w:start w:val="single" w:sz="4" w:space="0" w:color="auto"/>
+              <w:end w:val="single" w:sz="4" w:space="0" w:color="auto"/>
             </w:tcBorders>
           </w:tcPr>
           <w:p>
@@ -3512,10 +3709,12 @@
             <w:tcW w:type="dxa" w:w="2880"/>
             <w:vAlign w:val="center"/>
             <w:tcBorders>
-              <w:right w:val="nil"/>
               <w:top w:val="single" w:sz="4" w:space="0" w:color="auto"/>
               <w:bottom w:val="single" w:sz="4" w:space="0" w:color="auto"/>
               <w:left w:val="single" w:sz="4" w:space="0" w:color="auto"/>
+              <w:right w:val="nil"/>
+              <w:start w:val="single" w:sz="4" w:space="0" w:color="auto"/>
+              <w:end w:val="nil"/>
             </w:tcBorders>
           </w:tcPr>
           <w:p>
@@ -3551,6 +3750,8 @@
               <w:bottom w:val="single" w:sz="4" w:space="0" w:color="auto"/>
               <w:left w:val="single" w:sz="4" w:space="0" w:color="auto"/>
               <w:right w:val="single" w:sz="4" w:space="0" w:color="auto"/>
+              <w:start w:val="single" w:sz="4" w:space="0" w:color="auto"/>
+              <w:end w:val="single" w:sz="4" w:space="0" w:color="auto"/>
             </w:tcBorders>
           </w:tcPr>
           <w:p>
@@ -3573,10 +3774,12 @@
             <w:tcW w:type="dxa" w:w="2880"/>
             <w:vAlign w:val="center"/>
             <w:tcBorders>
-              <w:right w:val="nil"/>
               <w:top w:val="single" w:sz="4" w:space="0" w:color="auto"/>
               <w:bottom w:val="single" w:sz="4" w:space="0" w:color="auto"/>
               <w:left w:val="single" w:sz="4" w:space="0" w:color="auto"/>
+              <w:right w:val="nil"/>
+              <w:start w:val="single" w:sz="4" w:space="0" w:color="auto"/>
+              <w:end w:val="nil"/>
             </w:tcBorders>
           </w:tcPr>
           <w:p>
@@ -3612,6 +3815,8 @@
               <w:bottom w:val="single" w:sz="4" w:space="0" w:color="auto"/>
               <w:left w:val="single" w:sz="4" w:space="0" w:color="auto"/>
               <w:right w:val="single" w:sz="4" w:space="0" w:color="auto"/>
+              <w:start w:val="single" w:sz="4" w:space="0" w:color="auto"/>
+              <w:end w:val="single" w:sz="4" w:space="0" w:color="auto"/>
             </w:tcBorders>
           </w:tcPr>
           <w:p>
@@ -3634,10 +3839,12 @@
             <w:tcW w:type="dxa" w:w="2880"/>
             <w:vAlign w:val="center"/>
             <w:tcBorders>
-              <w:right w:val="nil"/>
               <w:top w:val="single" w:sz="4" w:space="0" w:color="auto"/>
               <w:bottom w:val="single" w:sz="4" w:space="0" w:color="auto"/>
               <w:left w:val="single" w:sz="4" w:space="0" w:color="auto"/>
+              <w:right w:val="nil"/>
+              <w:start w:val="single" w:sz="4" w:space="0" w:color="auto"/>
+              <w:end w:val="nil"/>
             </w:tcBorders>
           </w:tcPr>
           <w:p>
@@ -3673,6 +3880,8 @@
               <w:bottom w:val="single" w:sz="4" w:space="0" w:color="auto"/>
               <w:left w:val="single" w:sz="4" w:space="0" w:color="auto"/>
               <w:right w:val="single" w:sz="4" w:space="0" w:color="auto"/>
+              <w:start w:val="single" w:sz="4" w:space="0" w:color="auto"/>
+              <w:end w:val="single" w:sz="4" w:space="0" w:color="auto"/>
             </w:tcBorders>
           </w:tcPr>
           <w:p>
@@ -3695,10 +3904,12 @@
             <w:tcW w:type="dxa" w:w="2880"/>
             <w:vAlign w:val="center"/>
             <w:tcBorders>
-              <w:right w:val="nil"/>
               <w:top w:val="single" w:sz="4" w:space="0" w:color="auto"/>
               <w:bottom w:val="single" w:sz="4" w:space="0" w:color="auto"/>
               <w:left w:val="single" w:sz="4" w:space="0" w:color="auto"/>
+              <w:right w:val="nil"/>
+              <w:start w:val="single" w:sz="4" w:space="0" w:color="auto"/>
+              <w:end w:val="nil"/>
             </w:tcBorders>
           </w:tcPr>
           <w:p>
@@ -3734,6 +3945,8 @@
               <w:bottom w:val="single" w:sz="4" w:space="0" w:color="auto"/>
               <w:left w:val="single" w:sz="4" w:space="0" w:color="auto"/>
               <w:right w:val="single" w:sz="4" w:space="0" w:color="auto"/>
+              <w:start w:val="single" w:sz="4" w:space="0" w:color="auto"/>
+              <w:end w:val="single" w:sz="4" w:space="0" w:color="auto"/>
             </w:tcBorders>
           </w:tcPr>
           <w:p>
@@ -3756,10 +3969,12 @@
             <w:tcW w:type="dxa" w:w="2880"/>
             <w:vAlign w:val="center"/>
             <w:tcBorders>
-              <w:right w:val="nil"/>
               <w:top w:val="single" w:sz="4" w:space="0" w:color="auto"/>
               <w:bottom w:val="single" w:sz="4" w:space="0" w:color="auto"/>
               <w:left w:val="single" w:sz="4" w:space="0" w:color="auto"/>
+              <w:right w:val="nil"/>
+              <w:start w:val="single" w:sz="4" w:space="0" w:color="auto"/>
+              <w:end w:val="nil"/>
             </w:tcBorders>
           </w:tcPr>
           <w:p>
@@ -3785,10 +4000,12 @@
             <w:vMerge w:val="restart"/>
             <w:vAlign w:val="center"/>
             <w:tcBorders>
-              <w:left w:val="nil"/>
               <w:top w:val="single" w:sz="4" w:space="0" w:color="auto"/>
               <w:bottom w:val="single" w:sz="4" w:space="0" w:color="auto"/>
+              <w:left w:val="nil"/>
               <w:right w:val="single" w:sz="4" w:space="0" w:color="auto"/>
+              <w:start w:val="nil"/>
+              <w:end w:val="single" w:sz="4" w:space="0" w:color="auto"/>
             </w:tcBorders>
           </w:tcPr>
           <w:p>
@@ -3815,6 +4032,8 @@
               <w:bottom w:val="single" w:sz="4" w:space="0" w:color="auto"/>
               <w:left w:val="single" w:sz="4" w:space="0" w:color="auto"/>
               <w:right w:val="single" w:sz="4" w:space="0" w:color="auto"/>
+              <w:start w:val="single" w:sz="4" w:space="0" w:color="auto"/>
+              <w:end w:val="single" w:sz="4" w:space="0" w:color="auto"/>
             </w:tcBorders>
           </w:tcPr>
           <w:p>
@@ -3837,10 +4056,12 @@
             <w:tcW w:type="dxa" w:w="2880"/>
             <w:vAlign w:val="center"/>
             <w:tcBorders>
-              <w:right w:val="nil"/>
               <w:top w:val="single" w:sz="4" w:space="0" w:color="auto"/>
               <w:bottom w:val="single" w:sz="4" w:space="0" w:color="auto"/>
               <w:left w:val="single" w:sz="4" w:space="0" w:color="auto"/>
+              <w:right w:val="nil"/>
+              <w:start w:val="single" w:sz="4" w:space="0" w:color="auto"/>
+              <w:end w:val="nil"/>
             </w:tcBorders>
           </w:tcPr>
           <w:p>
@@ -3876,6 +4097,8 @@
               <w:bottom w:val="single" w:sz="4" w:space="0" w:color="auto"/>
               <w:left w:val="single" w:sz="4" w:space="0" w:color="auto"/>
               <w:right w:val="single" w:sz="4" w:space="0" w:color="auto"/>
+              <w:start w:val="single" w:sz="4" w:space="0" w:color="auto"/>
+              <w:end w:val="single" w:sz="4" w:space="0" w:color="auto"/>
             </w:tcBorders>
           </w:tcPr>
           <w:p>
@@ -3898,10 +4121,12 @@
             <w:tcW w:type="dxa" w:w="2880"/>
             <w:vAlign w:val="center"/>
             <w:tcBorders>
-              <w:right w:val="nil"/>
               <w:top w:val="single" w:sz="4" w:space="0" w:color="auto"/>
               <w:bottom w:val="single" w:sz="4" w:space="0" w:color="auto"/>
               <w:left w:val="single" w:sz="4" w:space="0" w:color="auto"/>
+              <w:right w:val="nil"/>
+              <w:start w:val="single" w:sz="4" w:space="0" w:color="auto"/>
+              <w:end w:val="nil"/>
             </w:tcBorders>
           </w:tcPr>
           <w:p>
@@ -3937,6 +4162,8 @@
               <w:bottom w:val="single" w:sz="4" w:space="0" w:color="auto"/>
               <w:left w:val="single" w:sz="4" w:space="0" w:color="auto"/>
               <w:right w:val="single" w:sz="4" w:space="0" w:color="auto"/>
+              <w:start w:val="single" w:sz="4" w:space="0" w:color="auto"/>
+              <w:end w:val="single" w:sz="4" w:space="0" w:color="auto"/>
             </w:tcBorders>
           </w:tcPr>
           <w:p>
@@ -3959,10 +4186,12 @@
             <w:tcW w:type="dxa" w:w="2880"/>
             <w:vAlign w:val="center"/>
             <w:tcBorders>
-              <w:right w:val="nil"/>
               <w:top w:val="single" w:sz="4" w:space="0" w:color="auto"/>
               <w:bottom w:val="single" w:sz="4" w:space="0" w:color="auto"/>
               <w:left w:val="single" w:sz="4" w:space="0" w:color="auto"/>
+              <w:right w:val="nil"/>
+              <w:start w:val="single" w:sz="4" w:space="0" w:color="auto"/>
+              <w:end w:val="nil"/>
             </w:tcBorders>
           </w:tcPr>
           <w:p>
@@ -4004,10 +4233,12 @@
             <w:tcW w:type="dxa" w:w="2880"/>
             <w:vAlign w:val="center"/>
             <w:tcBorders>
-              <w:left w:val="nil"/>
               <w:top w:val="single" w:sz="4" w:space="0" w:color="auto"/>
               <w:bottom w:val="single" w:sz="4" w:space="0" w:color="auto"/>
+              <w:left w:val="nil"/>
               <w:right w:val="single" w:sz="4" w:space="0" w:color="auto"/>
+              <w:start w:val="nil"/>
+              <w:end w:val="single" w:sz="4" w:space="0" w:color="auto"/>
             </w:tcBorders>
           </w:tcPr>
           <w:p>
@@ -4034,6 +4265,8 @@
               <w:bottom w:val="single" w:sz="4" w:space="0" w:color="auto"/>
               <w:left w:val="single" w:sz="4" w:space="0" w:color="auto"/>
               <w:right w:val="single" w:sz="4" w:space="0" w:color="auto"/>
+              <w:start w:val="single" w:sz="4" w:space="0" w:color="auto"/>
+              <w:end w:val="single" w:sz="4" w:space="0" w:color="auto"/>
             </w:tcBorders>
           </w:tcPr>
           <w:p>
@@ -4056,10 +4289,12 @@
             <w:tcW w:type="dxa" w:w="2880"/>
             <w:vAlign w:val="center"/>
             <w:tcBorders>
-              <w:right w:val="nil"/>
               <w:top w:val="single" w:sz="4" w:space="0" w:color="auto"/>
               <w:bottom w:val="single" w:sz="4" w:space="0" w:color="auto"/>
               <w:left w:val="single" w:sz="4" w:space="0" w:color="auto"/>
+              <w:right w:val="nil"/>
+              <w:start w:val="single" w:sz="4" w:space="0" w:color="auto"/>
+              <w:end w:val="nil"/>
             </w:tcBorders>
           </w:tcPr>
           <w:p>
@@ -4084,10 +4319,12 @@
             <w:tcW w:type="dxa" w:w="2880"/>
             <w:vAlign w:val="center"/>
             <w:tcBorders>
-              <w:left w:val="nil"/>
               <w:top w:val="single" w:sz="4" w:space="0" w:color="auto"/>
               <w:bottom w:val="single" w:sz="4" w:space="0" w:color="auto"/>
+              <w:left w:val="nil"/>
               <w:right w:val="single" w:sz="4" w:space="0" w:color="auto"/>
+              <w:start w:val="nil"/>
+              <w:end w:val="single" w:sz="4" w:space="0" w:color="auto"/>
             </w:tcBorders>
           </w:tcPr>
           <w:p>
@@ -4113,6 +4350,8 @@
               <w:bottom w:val="single" w:sz="4" w:space="0" w:color="auto"/>
               <w:left w:val="single" w:sz="4" w:space="0" w:color="auto"/>
               <w:right w:val="single" w:sz="4" w:space="0" w:color="auto"/>
+              <w:start w:val="single" w:sz="4" w:space="0" w:color="auto"/>
+              <w:end w:val="single" w:sz="4" w:space="0" w:color="auto"/>
             </w:tcBorders>
           </w:tcPr>
           <w:p>
@@ -4135,10 +4374,12 @@
             <w:tcW w:type="dxa" w:w="2880"/>
             <w:vAlign w:val="center"/>
             <w:tcBorders>
-              <w:right w:val="nil"/>
               <w:top w:val="single" w:sz="4" w:space="0" w:color="auto"/>
               <w:bottom w:val="single" w:sz="4" w:space="0" w:color="auto"/>
               <w:left w:val="single" w:sz="4" w:space="0" w:color="auto"/>
+              <w:right w:val="nil"/>
+              <w:start w:val="single" w:sz="4" w:space="0" w:color="auto"/>
+              <w:end w:val="nil"/>
             </w:tcBorders>
           </w:tcPr>
           <w:p>
@@ -4163,10 +4404,12 @@
             <w:tcW w:type="dxa" w:w="2880"/>
             <w:vAlign w:val="center"/>
             <w:tcBorders>
-              <w:left w:val="nil"/>
               <w:top w:val="single" w:sz="4" w:space="0" w:color="auto"/>
               <w:bottom w:val="single" w:sz="4" w:space="0" w:color="auto"/>
+              <w:left w:val="nil"/>
               <w:right w:val="single" w:sz="4" w:space="0" w:color="auto"/>
+              <w:start w:val="nil"/>
+              <w:end w:val="single" w:sz="4" w:space="0" w:color="auto"/>
             </w:tcBorders>
           </w:tcPr>
           <w:p>
@@ -4192,6 +4435,8 @@
               <w:bottom w:val="single" w:sz="4" w:space="0" w:color="auto"/>
               <w:left w:val="single" w:sz="4" w:space="0" w:color="auto"/>
               <w:right w:val="single" w:sz="4" w:space="0" w:color="auto"/>
+              <w:start w:val="single" w:sz="4" w:space="0" w:color="auto"/>
+              <w:end w:val="single" w:sz="4" w:space="0" w:color="auto"/>
             </w:tcBorders>
           </w:tcPr>
           <w:p>
@@ -4214,10 +4459,12 @@
             <w:tcW w:type="dxa" w:w="2880"/>
             <w:vAlign w:val="center"/>
             <w:tcBorders>
-              <w:right w:val="nil"/>
               <w:top w:val="single" w:sz="4" w:space="0" w:color="auto"/>
               <w:bottom w:val="single" w:sz="4" w:space="0" w:color="auto"/>
               <w:left w:val="single" w:sz="4" w:space="0" w:color="auto"/>
+              <w:right w:val="nil"/>
+              <w:start w:val="single" w:sz="4" w:space="0" w:color="auto"/>
+              <w:end w:val="nil"/>
             </w:tcBorders>
           </w:tcPr>
           <w:p>
@@ -4287,10 +4534,12 @@
             <w:tcW w:type="dxa" w:w="2880"/>
             <w:vAlign w:val="center"/>
             <w:tcBorders>
-              <w:left w:val="nil"/>
               <w:top w:val="single" w:sz="4" w:space="0" w:color="auto"/>
               <w:bottom w:val="single" w:sz="4" w:space="0" w:color="auto"/>
+              <w:left w:val="nil"/>
               <w:right w:val="single" w:sz="4" w:space="0" w:color="auto"/>
+              <w:start w:val="nil"/>
+              <w:end w:val="single" w:sz="4" w:space="0" w:color="auto"/>
             </w:tcBorders>
           </w:tcPr>
           <w:p>
@@ -4314,10 +4563,12 @@
             <w:gridSpan w:val="2"/>
             <w:vAlign w:val="center"/>
             <w:tcBorders>
-              <w:right w:val="nil"/>
               <w:top w:val="single" w:sz="4" w:space="0" w:color="auto"/>
               <w:bottom w:val="single" w:sz="4" w:space="0" w:color="auto"/>
               <w:left w:val="single" w:sz="4" w:space="0" w:color="auto"/>
+              <w:right w:val="nil"/>
+              <w:start w:val="single" w:sz="4" w:space="0" w:color="auto"/>
+              <w:end w:val="nil"/>
             </w:tcBorders>
           </w:tcPr>
           <w:p>
@@ -4342,10 +4593,12 @@
             <w:tcW w:type="dxa" w:w="2880"/>
             <w:vAlign w:val="center"/>
             <w:tcBorders>
-              <w:left w:val="nil"/>
               <w:top w:val="single" w:sz="4" w:space="0" w:color="auto"/>
               <w:bottom w:val="single" w:sz="4" w:space="0" w:color="auto"/>
+              <w:left w:val="nil"/>
               <w:right w:val="single" w:sz="4" w:space="0" w:color="auto"/>
+              <w:start w:val="nil"/>
+              <w:end w:val="single" w:sz="4" w:space="0" w:color="auto"/>
             </w:tcBorders>
           </w:tcPr>
           <w:p>
@@ -4369,10 +4622,12 @@
             <w:gridSpan w:val="2"/>
             <w:vAlign w:val="center"/>
             <w:tcBorders>
-              <w:right w:val="nil"/>
               <w:top w:val="single" w:sz="4" w:space="0" w:color="auto"/>
               <w:bottom w:val="single" w:sz="4" w:space="0" w:color="auto"/>
               <w:left w:val="single" w:sz="4" w:space="0" w:color="auto"/>
+              <w:right w:val="nil"/>
+              <w:start w:val="single" w:sz="4" w:space="0" w:color="auto"/>
+              <w:end w:val="nil"/>
             </w:tcBorders>
           </w:tcPr>
           <w:p>
@@ -4397,10 +4652,12 @@
             <w:tcW w:type="dxa" w:w="2880"/>
             <w:vAlign w:val="center"/>
             <w:tcBorders>
-              <w:left w:val="nil"/>
               <w:top w:val="single" w:sz="4" w:space="0" w:color="auto"/>
               <w:bottom w:val="single" w:sz="4" w:space="0" w:color="auto"/>
+              <w:left w:val="nil"/>
               <w:right w:val="single" w:sz="4" w:space="0" w:color="auto"/>
+              <w:start w:val="nil"/>
+              <w:end w:val="single" w:sz="4" w:space="0" w:color="auto"/>
             </w:tcBorders>
           </w:tcPr>
           <w:p>
@@ -4424,10 +4681,12 @@
             <w:gridSpan w:val="2"/>
             <w:vAlign w:val="center"/>
             <w:tcBorders>
-              <w:right w:val="nil"/>
               <w:top w:val="single" w:sz="4" w:space="0" w:color="auto"/>
               <w:bottom w:val="single" w:sz="4" w:space="0" w:color="auto"/>
               <w:left w:val="single" w:sz="4" w:space="0" w:color="auto"/>
+              <w:right w:val="nil"/>
+              <w:start w:val="single" w:sz="4" w:space="0" w:color="auto"/>
+              <w:end w:val="nil"/>
             </w:tcBorders>
           </w:tcPr>
           <w:p>
@@ -4452,10 +4711,12 @@
             <w:tcW w:type="dxa" w:w="2880"/>
             <w:vAlign w:val="center"/>
             <w:tcBorders>
-              <w:left w:val="nil"/>
               <w:top w:val="single" w:sz="4" w:space="0" w:color="auto"/>
               <w:bottom w:val="single" w:sz="4" w:space="0" w:color="auto"/>
+              <w:left w:val="nil"/>
               <w:right w:val="single" w:sz="4" w:space="0" w:color="auto"/>
+              <w:start w:val="nil"/>
+              <w:end w:val="single" w:sz="4" w:space="0" w:color="auto"/>
             </w:tcBorders>
           </w:tcPr>
           <w:p>
@@ -4479,10 +4740,12 @@
             <w:gridSpan w:val="2"/>
             <w:vAlign w:val="center"/>
             <w:tcBorders>
-              <w:right w:val="nil"/>
               <w:top w:val="single" w:sz="4" w:space="0" w:color="auto"/>
               <w:bottom w:val="single" w:sz="4" w:space="0" w:color="auto"/>
               <w:left w:val="single" w:sz="4" w:space="0" w:color="auto"/>
+              <w:right w:val="nil"/>
+              <w:start w:val="single" w:sz="4" w:space="0" w:color="auto"/>
+              <w:end w:val="nil"/>
             </w:tcBorders>
           </w:tcPr>
           <w:p>
@@ -4507,10 +4770,12 @@
             <w:tcW w:type="dxa" w:w="2880"/>
             <w:vAlign w:val="center"/>
             <w:tcBorders>
-              <w:left w:val="nil"/>
               <w:top w:val="single" w:sz="4" w:space="0" w:color="auto"/>
               <w:bottom w:val="single" w:sz="4" w:space="0" w:color="auto"/>
+              <w:left w:val="nil"/>
               <w:right w:val="single" w:sz="4" w:space="0" w:color="auto"/>
+              <w:start w:val="nil"/>
+              <w:end w:val="single" w:sz="4" w:space="0" w:color="auto"/>
             </w:tcBorders>
           </w:tcPr>
           <w:p>
@@ -4534,10 +4799,12 @@
             <w:gridSpan w:val="2"/>
             <w:vAlign w:val="center"/>
             <w:tcBorders>
-              <w:right w:val="nil"/>
               <w:top w:val="single" w:sz="4" w:space="0" w:color="auto"/>
               <w:bottom w:val="single" w:sz="4" w:space="0" w:color="auto"/>
               <w:left w:val="single" w:sz="4" w:space="0" w:color="auto"/>
+              <w:right w:val="nil"/>
+              <w:start w:val="single" w:sz="4" w:space="0" w:color="auto"/>
+              <w:end w:val="nil"/>
             </w:tcBorders>
           </w:tcPr>
           <w:p>
@@ -4562,10 +4829,12 @@
             <w:tcW w:type="dxa" w:w="2880"/>
             <w:vAlign w:val="center"/>
             <w:tcBorders>
-              <w:left w:val="nil"/>
               <w:top w:val="single" w:sz="4" w:space="0" w:color="auto"/>
               <w:bottom w:val="single" w:sz="4" w:space="0" w:color="auto"/>
+              <w:left w:val="nil"/>
               <w:right w:val="single" w:sz="4" w:space="0" w:color="auto"/>
+              <w:start w:val="nil"/>
+              <w:end w:val="single" w:sz="4" w:space="0" w:color="auto"/>
             </w:tcBorders>
           </w:tcPr>
           <w:p>
@@ -4589,10 +4858,12 @@
             <w:gridSpan w:val="2"/>
             <w:vAlign w:val="center"/>
             <w:tcBorders>
-              <w:right w:val="nil"/>
               <w:top w:val="single" w:sz="4" w:space="0" w:color="auto"/>
               <w:bottom w:val="single" w:sz="4" w:space="0" w:color="auto"/>
               <w:left w:val="single" w:sz="4" w:space="0" w:color="auto"/>
+              <w:right w:val="nil"/>
+              <w:start w:val="single" w:sz="4" w:space="0" w:color="auto"/>
+              <w:end w:val="nil"/>
             </w:tcBorders>
           </w:tcPr>
           <w:p>
@@ -4618,10 +4889,12 @@
             <w:vMerge w:val="restart"/>
             <w:vAlign w:val="center"/>
             <w:tcBorders>
-              <w:left w:val="nil"/>
               <w:top w:val="single" w:sz="4" w:space="0" w:color="auto"/>
               <w:bottom w:val="single" w:sz="4" w:space="0" w:color="auto"/>
+              <w:left w:val="nil"/>
               <w:right w:val="single" w:sz="4" w:space="0" w:color="auto"/>
+              <w:start w:val="nil"/>
+              <w:end w:val="single" w:sz="4" w:space="0" w:color="auto"/>
             </w:tcBorders>
           </w:tcPr>
           <w:p>
@@ -4648,6 +4921,8 @@
               <w:bottom w:val="single" w:sz="4" w:space="0" w:color="auto"/>
               <w:left w:val="single" w:sz="4" w:space="0" w:color="auto"/>
               <w:right w:val="single" w:sz="4" w:space="0" w:color="auto"/>
+              <w:start w:val="single" w:sz="4" w:space="0" w:color="auto"/>
+              <w:end w:val="single" w:sz="4" w:space="0" w:color="auto"/>
             </w:tcBorders>
           </w:tcPr>
           <w:p>
@@ -4670,10 +4945,12 @@
             <w:tcW w:type="dxa" w:w="2880"/>
             <w:vAlign w:val="center"/>
             <w:tcBorders>
-              <w:right w:val="nil"/>
               <w:top w:val="single" w:sz="4" w:space="0" w:color="auto"/>
               <w:bottom w:val="single" w:sz="4" w:space="0" w:color="auto"/>
               <w:left w:val="single" w:sz="4" w:space="0" w:color="auto"/>
+              <w:right w:val="nil"/>
+              <w:start w:val="single" w:sz="4" w:space="0" w:color="auto"/>
+              <w:end w:val="nil"/>
             </w:tcBorders>
           </w:tcPr>
           <w:p>
@@ -4709,6 +4986,8 @@
               <w:bottom w:val="single" w:sz="4" w:space="0" w:color="auto"/>
               <w:left w:val="single" w:sz="4" w:space="0" w:color="auto"/>
               <w:right w:val="single" w:sz="4" w:space="0" w:color="auto"/>
+              <w:start w:val="single" w:sz="4" w:space="0" w:color="auto"/>
+              <w:end w:val="single" w:sz="4" w:space="0" w:color="auto"/>
             </w:tcBorders>
           </w:tcPr>
           <w:p>
@@ -4731,10 +5010,12 @@
             <w:tcW w:type="dxa" w:w="2880"/>
             <w:vAlign w:val="center"/>
             <w:tcBorders>
-              <w:right w:val="nil"/>
               <w:top w:val="single" w:sz="4" w:space="0" w:color="auto"/>
               <w:bottom w:val="single" w:sz="4" w:space="0" w:color="auto"/>
               <w:left w:val="single" w:sz="4" w:space="0" w:color="auto"/>
+              <w:right w:val="nil"/>
+              <w:start w:val="single" w:sz="4" w:space="0" w:color="auto"/>
+              <w:end w:val="nil"/>
             </w:tcBorders>
           </w:tcPr>
           <w:p>
@@ -4770,6 +5051,8 @@
               <w:bottom w:val="single" w:sz="4" w:space="0" w:color="auto"/>
               <w:left w:val="single" w:sz="4" w:space="0" w:color="auto"/>
               <w:right w:val="single" w:sz="4" w:space="0" w:color="auto"/>
+              <w:start w:val="single" w:sz="4" w:space="0" w:color="auto"/>
+              <w:end w:val="single" w:sz="4" w:space="0" w:color="auto"/>
             </w:tcBorders>
           </w:tcPr>
           <w:p>
@@ -4792,10 +5075,12 @@
             <w:tcW w:type="dxa" w:w="2880"/>
             <w:vAlign w:val="center"/>
             <w:tcBorders>
-              <w:right w:val="nil"/>
               <w:top w:val="single" w:sz="4" w:space="0" w:color="auto"/>
               <w:bottom w:val="single" w:sz="4" w:space="0" w:color="auto"/>
               <w:left w:val="single" w:sz="4" w:space="0" w:color="auto"/>
+              <w:right w:val="nil"/>
+              <w:start w:val="single" w:sz="4" w:space="0" w:color="auto"/>
+              <w:end w:val="nil"/>
             </w:tcBorders>
           </w:tcPr>
           <w:p>
@@ -4831,6 +5116,8 @@
               <w:bottom w:val="single" w:sz="4" w:space="0" w:color="auto"/>
               <w:left w:val="single" w:sz="4" w:space="0" w:color="auto"/>
               <w:right w:val="single" w:sz="4" w:space="0" w:color="auto"/>
+              <w:start w:val="single" w:sz="4" w:space="0" w:color="auto"/>
+              <w:end w:val="single" w:sz="4" w:space="0" w:color="auto"/>
             </w:tcBorders>
           </w:tcPr>
           <w:p>
@@ -4853,10 +5140,12 @@
             <w:tcW w:type="dxa" w:w="2880"/>
             <w:vAlign w:val="center"/>
             <w:tcBorders>
-              <w:right w:val="nil"/>
               <w:top w:val="single" w:sz="4" w:space="0" w:color="auto"/>
               <w:bottom w:val="single" w:sz="4" w:space="0" w:color="auto"/>
               <w:left w:val="single" w:sz="4" w:space="0" w:color="auto"/>
+              <w:right w:val="nil"/>
+              <w:start w:val="single" w:sz="4" w:space="0" w:color="auto"/>
+              <w:end w:val="nil"/>
             </w:tcBorders>
           </w:tcPr>
           <w:p>
@@ -4892,6 +5181,8 @@
               <w:bottom w:val="single" w:sz="4" w:space="0" w:color="auto"/>
               <w:left w:val="single" w:sz="4" w:space="0" w:color="auto"/>
               <w:right w:val="single" w:sz="4" w:space="0" w:color="auto"/>
+              <w:start w:val="single" w:sz="4" w:space="0" w:color="auto"/>
+              <w:end w:val="single" w:sz="4" w:space="0" w:color="auto"/>
             </w:tcBorders>
           </w:tcPr>
           <w:p>
@@ -4914,10 +5205,12 @@
             <w:tcW w:type="dxa" w:w="2880"/>
             <w:vAlign w:val="center"/>
             <w:tcBorders>
-              <w:right w:val="nil"/>
               <w:top w:val="single" w:sz="4" w:space="0" w:color="auto"/>
               <w:bottom w:val="single" w:sz="4" w:space="0" w:color="auto"/>
               <w:left w:val="single" w:sz="4" w:space="0" w:color="auto"/>
+              <w:right w:val="nil"/>
+              <w:start w:val="single" w:sz="4" w:space="0" w:color="auto"/>
+              <w:end w:val="nil"/>
             </w:tcBorders>
           </w:tcPr>
           <w:p>
@@ -4953,6 +5246,8 @@
               <w:bottom w:val="single" w:sz="4" w:space="0" w:color="auto"/>
               <w:left w:val="single" w:sz="4" w:space="0" w:color="auto"/>
               <w:right w:val="single" w:sz="4" w:space="0" w:color="auto"/>
+              <w:start w:val="single" w:sz="4" w:space="0" w:color="auto"/>
+              <w:end w:val="single" w:sz="4" w:space="0" w:color="auto"/>
             </w:tcBorders>
           </w:tcPr>
           <w:p>
@@ -4975,10 +5270,12 @@
             <w:tcW w:type="dxa" w:w="2880"/>
             <w:vAlign w:val="center"/>
             <w:tcBorders>
-              <w:right w:val="nil"/>
               <w:top w:val="single" w:sz="4" w:space="0" w:color="auto"/>
               <w:bottom w:val="single" w:sz="4" w:space="0" w:color="auto"/>
               <w:left w:val="single" w:sz="4" w:space="0" w:color="auto"/>
+              <w:right w:val="nil"/>
+              <w:start w:val="single" w:sz="4" w:space="0" w:color="auto"/>
+              <w:end w:val="nil"/>
             </w:tcBorders>
           </w:tcPr>
           <w:p>
@@ -5004,10 +5301,12 @@
             <w:vMerge w:val="restart"/>
             <w:vAlign w:val="center"/>
             <w:tcBorders>
-              <w:left w:val="nil"/>
               <w:top w:val="single" w:sz="4" w:space="0" w:color="auto"/>
               <w:bottom w:val="single" w:sz="4" w:space="0" w:color="auto"/>
+              <w:left w:val="nil"/>
               <w:right w:val="single" w:sz="4" w:space="0" w:color="auto"/>
+              <w:start w:val="nil"/>
+              <w:end w:val="single" w:sz="4" w:space="0" w:color="auto"/>
             </w:tcBorders>
           </w:tcPr>
           <w:p>
@@ -5034,6 +5333,8 @@
               <w:bottom w:val="single" w:sz="4" w:space="0" w:color="auto"/>
               <w:left w:val="single" w:sz="4" w:space="0" w:color="auto"/>
               <w:right w:val="single" w:sz="4" w:space="0" w:color="auto"/>
+              <w:start w:val="single" w:sz="4" w:space="0" w:color="auto"/>
+              <w:end w:val="single" w:sz="4" w:space="0" w:color="auto"/>
             </w:tcBorders>
           </w:tcPr>
           <w:p>
@@ -5056,10 +5357,12 @@
             <w:tcW w:type="dxa" w:w="2880"/>
             <w:vAlign w:val="center"/>
             <w:tcBorders>
-              <w:right w:val="nil"/>
               <w:top w:val="single" w:sz="4" w:space="0" w:color="auto"/>
               <w:bottom w:val="single" w:sz="4" w:space="0" w:color="auto"/>
               <w:left w:val="single" w:sz="4" w:space="0" w:color="auto"/>
+              <w:right w:val="nil"/>
+              <w:start w:val="single" w:sz="4" w:space="0" w:color="auto"/>
+              <w:end w:val="nil"/>
             </w:tcBorders>
           </w:tcPr>
           <w:p>
@@ -5095,6 +5398,8 @@
               <w:bottom w:val="single" w:sz="4" w:space="0" w:color="auto"/>
               <w:left w:val="single" w:sz="4" w:space="0" w:color="auto"/>
               <w:right w:val="single" w:sz="4" w:space="0" w:color="auto"/>
+              <w:start w:val="single" w:sz="4" w:space="0" w:color="auto"/>
+              <w:end w:val="single" w:sz="4" w:space="0" w:color="auto"/>
             </w:tcBorders>
           </w:tcPr>
           <w:p>
@@ -5117,10 +5422,12 @@
             <w:tcW w:type="dxa" w:w="2880"/>
             <w:vAlign w:val="center"/>
             <w:tcBorders>
-              <w:right w:val="nil"/>
               <w:top w:val="single" w:sz="4" w:space="0" w:color="auto"/>
               <w:bottom w:val="single" w:sz="4" w:space="0" w:color="auto"/>
               <w:left w:val="single" w:sz="4" w:space="0" w:color="auto"/>
+              <w:right w:val="nil"/>
+              <w:start w:val="single" w:sz="4" w:space="0" w:color="auto"/>
+              <w:end w:val="nil"/>
             </w:tcBorders>
           </w:tcPr>
           <w:p>
@@ -5156,6 +5463,8 @@
               <w:bottom w:val="single" w:sz="4" w:space="0" w:color="auto"/>
               <w:left w:val="single" w:sz="4" w:space="0" w:color="auto"/>
               <w:right w:val="single" w:sz="4" w:space="0" w:color="auto"/>
+              <w:start w:val="single" w:sz="4" w:space="0" w:color="auto"/>
+              <w:end w:val="single" w:sz="4" w:space="0" w:color="auto"/>
             </w:tcBorders>
           </w:tcPr>
           <w:p>
@@ -5178,10 +5487,12 @@
             <w:tcW w:type="dxa" w:w="2880"/>
             <w:vAlign w:val="center"/>
             <w:tcBorders>
-              <w:right w:val="nil"/>
               <w:top w:val="single" w:sz="4" w:space="0" w:color="auto"/>
               <w:bottom w:val="single" w:sz="4" w:space="0" w:color="auto"/>
               <w:left w:val="single" w:sz="4" w:space="0" w:color="auto"/>
+              <w:right w:val="nil"/>
+              <w:start w:val="single" w:sz="4" w:space="0" w:color="auto"/>
+              <w:end w:val="nil"/>
             </w:tcBorders>
           </w:tcPr>
           <w:p>
@@ -5223,10 +5534,12 @@
             <w:tcW w:type="dxa" w:w="2880"/>
             <w:vAlign w:val="center"/>
             <w:tcBorders>
-              <w:left w:val="nil"/>
               <w:top w:val="single" w:sz="4" w:space="0" w:color="auto"/>
               <w:bottom w:val="single" w:sz="4" w:space="0" w:color="auto"/>
+              <w:left w:val="nil"/>
               <w:right w:val="single" w:sz="4" w:space="0" w:color="auto"/>
+              <w:start w:val="nil"/>
+              <w:end w:val="single" w:sz="4" w:space="0" w:color="auto"/>
             </w:tcBorders>
           </w:tcPr>
           <w:p>
@@ -5253,6 +5566,8 @@
               <w:bottom w:val="single" w:sz="4" w:space="0" w:color="auto"/>
               <w:left w:val="single" w:sz="4" w:space="0" w:color="auto"/>
               <w:right w:val="single" w:sz="4" w:space="0" w:color="auto"/>
+              <w:start w:val="single" w:sz="4" w:space="0" w:color="auto"/>
+              <w:end w:val="single" w:sz="4" w:space="0" w:color="auto"/>
             </w:tcBorders>
           </w:tcPr>
           <w:p>
@@ -5275,10 +5590,12 @@
             <w:tcW w:type="dxa" w:w="2880"/>
             <w:vAlign w:val="center"/>
             <w:tcBorders>
-              <w:right w:val="nil"/>
               <w:top w:val="single" w:sz="4" w:space="0" w:color="auto"/>
               <w:bottom w:val="single" w:sz="4" w:space="0" w:color="auto"/>
               <w:left w:val="single" w:sz="4" w:space="0" w:color="auto"/>
+              <w:right w:val="nil"/>
+              <w:start w:val="single" w:sz="4" w:space="0" w:color="auto"/>
+              <w:end w:val="nil"/>
             </w:tcBorders>
           </w:tcPr>
           <w:p>
@@ -5303,10 +5620,12 @@
             <w:tcW w:type="dxa" w:w="2880"/>
             <w:vAlign w:val="center"/>
             <w:tcBorders>
-              <w:left w:val="nil"/>
               <w:top w:val="single" w:sz="4" w:space="0" w:color="auto"/>
               <w:bottom w:val="single" w:sz="4" w:space="0" w:color="auto"/>
+              <w:left w:val="nil"/>
               <w:right w:val="single" w:sz="4" w:space="0" w:color="auto"/>
+              <w:start w:val="nil"/>
+              <w:end w:val="single" w:sz="4" w:space="0" w:color="auto"/>
             </w:tcBorders>
           </w:tcPr>
           <w:p>
@@ -5332,6 +5651,8 @@
               <w:bottom w:val="single" w:sz="4" w:space="0" w:color="auto"/>
               <w:left w:val="single" w:sz="4" w:space="0" w:color="auto"/>
               <w:right w:val="single" w:sz="4" w:space="0" w:color="auto"/>
+              <w:start w:val="single" w:sz="4" w:space="0" w:color="auto"/>
+              <w:end w:val="single" w:sz="4" w:space="0" w:color="auto"/>
             </w:tcBorders>
           </w:tcPr>
           <w:p>
@@ -5354,10 +5675,12 @@
             <w:tcW w:type="dxa" w:w="2880"/>
             <w:vAlign w:val="center"/>
             <w:tcBorders>
-              <w:right w:val="nil"/>
               <w:top w:val="single" w:sz="4" w:space="0" w:color="auto"/>
               <w:bottom w:val="single" w:sz="4" w:space="0" w:color="auto"/>
               <w:left w:val="single" w:sz="4" w:space="0" w:color="auto"/>
+              <w:right w:val="nil"/>
+              <w:start w:val="single" w:sz="4" w:space="0" w:color="auto"/>
+              <w:end w:val="nil"/>
             </w:tcBorders>
           </w:tcPr>
           <w:p>
@@ -5382,10 +5705,12 @@
             <w:tcW w:type="dxa" w:w="2880"/>
             <w:vAlign w:val="center"/>
             <w:tcBorders>
-              <w:left w:val="nil"/>
               <w:top w:val="single" w:sz="4" w:space="0" w:color="auto"/>
               <w:bottom w:val="single" w:sz="4" w:space="0" w:color="auto"/>
+              <w:left w:val="nil"/>
               <w:right w:val="single" w:sz="4" w:space="0" w:color="auto"/>
+              <w:start w:val="nil"/>
+              <w:end w:val="single" w:sz="4" w:space="0" w:color="auto"/>
             </w:tcBorders>
           </w:tcPr>
           <w:p>
@@ -5411,6 +5736,8 @@
               <w:bottom w:val="single" w:sz="4" w:space="0" w:color="auto"/>
               <w:left w:val="single" w:sz="4" w:space="0" w:color="auto"/>
               <w:right w:val="single" w:sz="4" w:space="0" w:color="auto"/>
+              <w:start w:val="single" w:sz="4" w:space="0" w:color="auto"/>
+              <w:end w:val="single" w:sz="4" w:space="0" w:color="auto"/>
             </w:tcBorders>
           </w:tcPr>
           <w:p>
@@ -5433,10 +5760,12 @@
             <w:tcW w:type="dxa" w:w="2880"/>
             <w:vAlign w:val="center"/>
             <w:tcBorders>
-              <w:right w:val="nil"/>
               <w:top w:val="single" w:sz="4" w:space="0" w:color="auto"/>
               <w:bottom w:val="single" w:sz="4" w:space="0" w:color="auto"/>
               <w:left w:val="single" w:sz="4" w:space="0" w:color="auto"/>
+              <w:right w:val="nil"/>
+              <w:start w:val="single" w:sz="4" w:space="0" w:color="auto"/>
+              <w:end w:val="nil"/>
             </w:tcBorders>
           </w:tcPr>
           <w:p>
@@ -5506,10 +5835,12 @@
             <w:tcW w:type="dxa" w:w="2880"/>
             <w:vAlign w:val="center"/>
             <w:tcBorders>
-              <w:left w:val="nil"/>
               <w:top w:val="single" w:sz="4" w:space="0" w:color="auto"/>
               <w:bottom w:val="single" w:sz="4" w:space="0" w:color="auto"/>
+              <w:left w:val="nil"/>
               <w:right w:val="single" w:sz="4" w:space="0" w:color="auto"/>
+              <w:start w:val="nil"/>
+              <w:end w:val="single" w:sz="4" w:space="0" w:color="auto"/>
             </w:tcBorders>
           </w:tcPr>
           <w:p>
@@ -5533,10 +5864,12 @@
             <w:gridSpan w:val="2"/>
             <w:vAlign w:val="center"/>
             <w:tcBorders>
-              <w:right w:val="nil"/>
               <w:top w:val="single" w:sz="4" w:space="0" w:color="auto"/>
               <w:bottom w:val="single" w:sz="4" w:space="0" w:color="auto"/>
               <w:left w:val="single" w:sz="4" w:space="0" w:color="auto"/>
+              <w:right w:val="nil"/>
+              <w:start w:val="single" w:sz="4" w:space="0" w:color="auto"/>
+              <w:end w:val="nil"/>
             </w:tcBorders>
           </w:tcPr>
           <w:p>
@@ -5561,10 +5894,12 @@
             <w:tcW w:type="dxa" w:w="2880"/>
             <w:vAlign w:val="center"/>
             <w:tcBorders>
-              <w:left w:val="nil"/>
               <w:top w:val="single" w:sz="4" w:space="0" w:color="auto"/>
               <w:bottom w:val="single" w:sz="4" w:space="0" w:color="auto"/>
+              <w:left w:val="nil"/>
               <w:right w:val="single" w:sz="4" w:space="0" w:color="auto"/>
+              <w:start w:val="nil"/>
+              <w:end w:val="single" w:sz="4" w:space="0" w:color="auto"/>
             </w:tcBorders>
           </w:tcPr>
           <w:p>
@@ -5588,10 +5923,12 @@
             <w:gridSpan w:val="2"/>
             <w:vAlign w:val="center"/>
             <w:tcBorders>
-              <w:right w:val="nil"/>
               <w:top w:val="single" w:sz="4" w:space="0" w:color="auto"/>
               <w:bottom w:val="single" w:sz="4" w:space="0" w:color="auto"/>
               <w:left w:val="single" w:sz="4" w:space="0" w:color="auto"/>
+              <w:right w:val="nil"/>
+              <w:start w:val="single" w:sz="4" w:space="0" w:color="auto"/>
+              <w:end w:val="nil"/>
             </w:tcBorders>
           </w:tcPr>
           <w:p>
@@ -5616,10 +5953,12 @@
             <w:tcW w:type="dxa" w:w="2880"/>
             <w:vAlign w:val="center"/>
             <w:tcBorders>
-              <w:left w:val="nil"/>
               <w:top w:val="single" w:sz="4" w:space="0" w:color="auto"/>
               <w:bottom w:val="single" w:sz="4" w:space="0" w:color="auto"/>
+              <w:left w:val="nil"/>
               <w:right w:val="single" w:sz="4" w:space="0" w:color="auto"/>
+              <w:start w:val="nil"/>
+              <w:end w:val="single" w:sz="4" w:space="0" w:color="auto"/>
             </w:tcBorders>
           </w:tcPr>
           <w:p>
@@ -5643,10 +5982,12 @@
             <w:gridSpan w:val="2"/>
             <w:vAlign w:val="center"/>
             <w:tcBorders>
-              <w:right w:val="nil"/>
               <w:top w:val="single" w:sz="4" w:space="0" w:color="auto"/>
               <w:bottom w:val="single" w:sz="4" w:space="0" w:color="auto"/>
               <w:left w:val="single" w:sz="4" w:space="0" w:color="auto"/>
+              <w:right w:val="nil"/>
+              <w:start w:val="single" w:sz="4" w:space="0" w:color="auto"/>
+              <w:end w:val="nil"/>
             </w:tcBorders>
           </w:tcPr>
           <w:p>
@@ -5671,10 +6012,12 @@
             <w:tcW w:type="dxa" w:w="2880"/>
             <w:vAlign w:val="center"/>
             <w:tcBorders>
-              <w:left w:val="nil"/>
               <w:top w:val="single" w:sz="4" w:space="0" w:color="auto"/>
               <w:bottom w:val="single" w:sz="4" w:space="0" w:color="auto"/>
+              <w:left w:val="nil"/>
               <w:right w:val="single" w:sz="4" w:space="0" w:color="auto"/>
+              <w:start w:val="nil"/>
+              <w:end w:val="single" w:sz="4" w:space="0" w:color="auto"/>
             </w:tcBorders>
           </w:tcPr>
           <w:p>
@@ -5698,10 +6041,12 @@
             <w:gridSpan w:val="2"/>
             <w:vAlign w:val="center"/>
             <w:tcBorders>
-              <w:right w:val="nil"/>
               <w:top w:val="single" w:sz="4" w:space="0" w:color="auto"/>
               <w:bottom w:val="single" w:sz="4" w:space="0" w:color="auto"/>
               <w:left w:val="single" w:sz="4" w:space="0" w:color="auto"/>
+              <w:right w:val="nil"/>
+              <w:start w:val="single" w:sz="4" w:space="0" w:color="auto"/>
+              <w:end w:val="nil"/>
             </w:tcBorders>
           </w:tcPr>
           <w:p>
@@ -5726,10 +6071,12 @@
             <w:tcW w:type="dxa" w:w="2880"/>
             <w:vAlign w:val="center"/>
             <w:tcBorders>
-              <w:left w:val="nil"/>
               <w:top w:val="single" w:sz="4" w:space="0" w:color="auto"/>
               <w:bottom w:val="single" w:sz="4" w:space="0" w:color="auto"/>
+              <w:left w:val="nil"/>
               <w:right w:val="single" w:sz="4" w:space="0" w:color="auto"/>
+              <w:start w:val="nil"/>
+              <w:end w:val="single" w:sz="4" w:space="0" w:color="auto"/>
             </w:tcBorders>
           </w:tcPr>
           <w:p>
@@ -5753,10 +6100,12 @@
             <w:gridSpan w:val="2"/>
             <w:vAlign w:val="center"/>
             <w:tcBorders>
-              <w:right w:val="nil"/>
               <w:top w:val="single" w:sz="4" w:space="0" w:color="auto"/>
               <w:bottom w:val="single" w:sz="4" w:space="0" w:color="auto"/>
               <w:left w:val="single" w:sz="4" w:space="0" w:color="auto"/>
+              <w:right w:val="nil"/>
+              <w:start w:val="single" w:sz="4" w:space="0" w:color="auto"/>
+              <w:end w:val="nil"/>
             </w:tcBorders>
           </w:tcPr>
           <w:p>
@@ -5781,10 +6130,12 @@
             <w:tcW w:type="dxa" w:w="2880"/>
             <w:vAlign w:val="center"/>
             <w:tcBorders>
-              <w:left w:val="nil"/>
               <w:top w:val="single" w:sz="4" w:space="0" w:color="auto"/>
               <w:bottom w:val="single" w:sz="4" w:space="0" w:color="auto"/>
+              <w:left w:val="nil"/>
               <w:right w:val="single" w:sz="4" w:space="0" w:color="auto"/>
+              <w:start w:val="nil"/>
+              <w:end w:val="single" w:sz="4" w:space="0" w:color="auto"/>
             </w:tcBorders>
           </w:tcPr>
           <w:p>
@@ -5808,10 +6159,12 @@
             <w:gridSpan w:val="2"/>
             <w:vAlign w:val="center"/>
             <w:tcBorders>
-              <w:right w:val="nil"/>
               <w:top w:val="single" w:sz="4" w:space="0" w:color="auto"/>
               <w:bottom w:val="single" w:sz="4" w:space="0" w:color="auto"/>
               <w:left w:val="single" w:sz="4" w:space="0" w:color="auto"/>
+              <w:right w:val="nil"/>
+              <w:start w:val="single" w:sz="4" w:space="0" w:color="auto"/>
+              <w:end w:val="nil"/>
             </w:tcBorders>
           </w:tcPr>
           <w:p>
@@ -5837,10 +6190,12 @@
             <w:vMerge w:val="restart"/>
             <w:vAlign w:val="center"/>
             <w:tcBorders>
-              <w:left w:val="nil"/>
               <w:top w:val="single" w:sz="4" w:space="0" w:color="auto"/>
               <w:bottom w:val="single" w:sz="4" w:space="0" w:color="auto"/>
+              <w:left w:val="nil"/>
               <w:right w:val="single" w:sz="4" w:space="0" w:color="auto"/>
+              <w:start w:val="nil"/>
+              <w:end w:val="single" w:sz="4" w:space="0" w:color="auto"/>
             </w:tcBorders>
           </w:tcPr>
           <w:p>
@@ -5867,6 +6222,8 @@
               <w:bottom w:val="single" w:sz="4" w:space="0" w:color="auto"/>
               <w:left w:val="single" w:sz="4" w:space="0" w:color="auto"/>
               <w:right w:val="single" w:sz="4" w:space="0" w:color="auto"/>
+              <w:start w:val="single" w:sz="4" w:space="0" w:color="auto"/>
+              <w:end w:val="single" w:sz="4" w:space="0" w:color="auto"/>
             </w:tcBorders>
           </w:tcPr>
           <w:p>
@@ -5889,10 +6246,12 @@
             <w:tcW w:type="dxa" w:w="2880"/>
             <w:vAlign w:val="center"/>
             <w:tcBorders>
-              <w:right w:val="nil"/>
               <w:top w:val="single" w:sz="4" w:space="0" w:color="auto"/>
               <w:bottom w:val="single" w:sz="4" w:space="0" w:color="auto"/>
               <w:left w:val="single" w:sz="4" w:space="0" w:color="auto"/>
+              <w:right w:val="nil"/>
+              <w:start w:val="single" w:sz="4" w:space="0" w:color="auto"/>
+              <w:end w:val="nil"/>
             </w:tcBorders>
           </w:tcPr>
           <w:p>
@@ -5928,6 +6287,8 @@
               <w:bottom w:val="single" w:sz="4" w:space="0" w:color="auto"/>
               <w:left w:val="single" w:sz="4" w:space="0" w:color="auto"/>
               <w:right w:val="single" w:sz="4" w:space="0" w:color="auto"/>
+              <w:start w:val="single" w:sz="4" w:space="0" w:color="auto"/>
+              <w:end w:val="single" w:sz="4" w:space="0" w:color="auto"/>
             </w:tcBorders>
           </w:tcPr>
           <w:p>
@@ -5950,10 +6311,12 @@
             <w:tcW w:type="dxa" w:w="2880"/>
             <w:vAlign w:val="center"/>
             <w:tcBorders>
-              <w:right w:val="nil"/>
               <w:top w:val="single" w:sz="4" w:space="0" w:color="auto"/>
               <w:bottom w:val="single" w:sz="4" w:space="0" w:color="auto"/>
               <w:left w:val="single" w:sz="4" w:space="0" w:color="auto"/>
+              <w:right w:val="nil"/>
+              <w:start w:val="single" w:sz="4" w:space="0" w:color="auto"/>
+              <w:end w:val="nil"/>
             </w:tcBorders>
           </w:tcPr>
           <w:p>
@@ -5989,6 +6352,8 @@
               <w:bottom w:val="single" w:sz="4" w:space="0" w:color="auto"/>
               <w:left w:val="single" w:sz="4" w:space="0" w:color="auto"/>
               <w:right w:val="single" w:sz="4" w:space="0" w:color="auto"/>
+              <w:start w:val="single" w:sz="4" w:space="0" w:color="auto"/>
+              <w:end w:val="single" w:sz="4" w:space="0" w:color="auto"/>
             </w:tcBorders>
           </w:tcPr>
           <w:p>
@@ -6011,10 +6376,12 @@
             <w:tcW w:type="dxa" w:w="2880"/>
             <w:vAlign w:val="center"/>
             <w:tcBorders>
-              <w:right w:val="nil"/>
               <w:top w:val="single" w:sz="4" w:space="0" w:color="auto"/>
               <w:bottom w:val="single" w:sz="4" w:space="0" w:color="auto"/>
               <w:left w:val="single" w:sz="4" w:space="0" w:color="auto"/>
+              <w:right w:val="nil"/>
+              <w:start w:val="single" w:sz="4" w:space="0" w:color="auto"/>
+              <w:end w:val="nil"/>
             </w:tcBorders>
           </w:tcPr>
           <w:p>
@@ -6050,6 +6417,8 @@
               <w:bottom w:val="single" w:sz="4" w:space="0" w:color="auto"/>
               <w:left w:val="single" w:sz="4" w:space="0" w:color="auto"/>
               <w:right w:val="single" w:sz="4" w:space="0" w:color="auto"/>
+              <w:start w:val="single" w:sz="4" w:space="0" w:color="auto"/>
+              <w:end w:val="single" w:sz="4" w:space="0" w:color="auto"/>
             </w:tcBorders>
           </w:tcPr>
           <w:p>
@@ -6072,10 +6441,12 @@
             <w:tcW w:type="dxa" w:w="2880"/>
             <w:vAlign w:val="center"/>
             <w:tcBorders>
-              <w:right w:val="nil"/>
               <w:top w:val="single" w:sz="4" w:space="0" w:color="auto"/>
               <w:bottom w:val="single" w:sz="4" w:space="0" w:color="auto"/>
               <w:left w:val="single" w:sz="4" w:space="0" w:color="auto"/>
+              <w:right w:val="nil"/>
+              <w:start w:val="single" w:sz="4" w:space="0" w:color="auto"/>
+              <w:end w:val="nil"/>
             </w:tcBorders>
           </w:tcPr>
           <w:p>
@@ -6111,6 +6482,8 @@
               <w:bottom w:val="single" w:sz="4" w:space="0" w:color="auto"/>
               <w:left w:val="single" w:sz="4" w:space="0" w:color="auto"/>
               <w:right w:val="single" w:sz="4" w:space="0" w:color="auto"/>
+              <w:start w:val="single" w:sz="4" w:space="0" w:color="auto"/>
+              <w:end w:val="single" w:sz="4" w:space="0" w:color="auto"/>
             </w:tcBorders>
           </w:tcPr>
           <w:p>
@@ -6133,10 +6506,12 @@
             <w:tcW w:type="dxa" w:w="2880"/>
             <w:vAlign w:val="center"/>
             <w:tcBorders>
-              <w:right w:val="nil"/>
               <w:top w:val="single" w:sz="4" w:space="0" w:color="auto"/>
               <w:bottom w:val="single" w:sz="4" w:space="0" w:color="auto"/>
               <w:left w:val="single" w:sz="4" w:space="0" w:color="auto"/>
+              <w:right w:val="nil"/>
+              <w:start w:val="single" w:sz="4" w:space="0" w:color="auto"/>
+              <w:end w:val="nil"/>
             </w:tcBorders>
           </w:tcPr>
           <w:p>
@@ -6172,6 +6547,8 @@
               <w:bottom w:val="single" w:sz="4" w:space="0" w:color="auto"/>
               <w:left w:val="single" w:sz="4" w:space="0" w:color="auto"/>
               <w:right w:val="single" w:sz="4" w:space="0" w:color="auto"/>
+              <w:start w:val="single" w:sz="4" w:space="0" w:color="auto"/>
+              <w:end w:val="single" w:sz="4" w:space="0" w:color="auto"/>
             </w:tcBorders>
           </w:tcPr>
           <w:p>
@@ -6194,10 +6571,12 @@
             <w:tcW w:type="dxa" w:w="2880"/>
             <w:vAlign w:val="center"/>
             <w:tcBorders>
-              <w:right w:val="nil"/>
               <w:top w:val="single" w:sz="4" w:space="0" w:color="auto"/>
               <w:bottom w:val="single" w:sz="4" w:space="0" w:color="auto"/>
               <w:left w:val="single" w:sz="4" w:space="0" w:color="auto"/>
+              <w:right w:val="nil"/>
+              <w:start w:val="single" w:sz="4" w:space="0" w:color="auto"/>
+              <w:end w:val="nil"/>
             </w:tcBorders>
           </w:tcPr>
           <w:p>
@@ -6223,10 +6602,12 @@
             <w:vMerge w:val="restart"/>
             <w:vAlign w:val="center"/>
             <w:tcBorders>
-              <w:left w:val="nil"/>
               <w:top w:val="single" w:sz="4" w:space="0" w:color="auto"/>
               <w:bottom w:val="single" w:sz="4" w:space="0" w:color="auto"/>
+              <w:left w:val="nil"/>
               <w:right w:val="single" w:sz="4" w:space="0" w:color="auto"/>
+              <w:start w:val="nil"/>
+              <w:end w:val="single" w:sz="4" w:space="0" w:color="auto"/>
             </w:tcBorders>
           </w:tcPr>
           <w:p>
@@ -6253,6 +6634,8 @@
               <w:bottom w:val="single" w:sz="4" w:space="0" w:color="auto"/>
               <w:left w:val="single" w:sz="4" w:space="0" w:color="auto"/>
               <w:right w:val="single" w:sz="4" w:space="0" w:color="auto"/>
+              <w:start w:val="single" w:sz="4" w:space="0" w:color="auto"/>
+              <w:end w:val="single" w:sz="4" w:space="0" w:color="auto"/>
             </w:tcBorders>
           </w:tcPr>
           <w:p>
@@ -6275,10 +6658,12 @@
             <w:tcW w:type="dxa" w:w="2880"/>
             <w:vAlign w:val="center"/>
             <w:tcBorders>
-              <w:right w:val="nil"/>
               <w:top w:val="single" w:sz="4" w:space="0" w:color="auto"/>
               <w:bottom w:val="single" w:sz="4" w:space="0" w:color="auto"/>
               <w:left w:val="single" w:sz="4" w:space="0" w:color="auto"/>
+              <w:right w:val="nil"/>
+              <w:start w:val="single" w:sz="4" w:space="0" w:color="auto"/>
+              <w:end w:val="nil"/>
             </w:tcBorders>
           </w:tcPr>
           <w:p>
@@ -6314,6 +6699,8 @@
               <w:bottom w:val="single" w:sz="4" w:space="0" w:color="auto"/>
               <w:left w:val="single" w:sz="4" w:space="0" w:color="auto"/>
               <w:right w:val="single" w:sz="4" w:space="0" w:color="auto"/>
+              <w:start w:val="single" w:sz="4" w:space="0" w:color="auto"/>
+              <w:end w:val="single" w:sz="4" w:space="0" w:color="auto"/>
             </w:tcBorders>
           </w:tcPr>
           <w:p>
@@ -6336,10 +6723,12 @@
             <w:tcW w:type="dxa" w:w="2880"/>
             <w:vAlign w:val="center"/>
             <w:tcBorders>
-              <w:right w:val="nil"/>
               <w:top w:val="single" w:sz="4" w:space="0" w:color="auto"/>
               <w:bottom w:val="single" w:sz="4" w:space="0" w:color="auto"/>
               <w:left w:val="single" w:sz="4" w:space="0" w:color="auto"/>
+              <w:right w:val="nil"/>
+              <w:start w:val="single" w:sz="4" w:space="0" w:color="auto"/>
+              <w:end w:val="nil"/>
             </w:tcBorders>
           </w:tcPr>
           <w:p>
@@ -6375,6 +6764,8 @@
               <w:bottom w:val="single" w:sz="4" w:space="0" w:color="auto"/>
               <w:left w:val="single" w:sz="4" w:space="0" w:color="auto"/>
               <w:right w:val="single" w:sz="4" w:space="0" w:color="auto"/>
+              <w:start w:val="single" w:sz="4" w:space="0" w:color="auto"/>
+              <w:end w:val="single" w:sz="4" w:space="0" w:color="auto"/>
             </w:tcBorders>
           </w:tcPr>
           <w:p>
@@ -6397,10 +6788,12 @@
             <w:tcW w:type="dxa" w:w="2880"/>
             <w:vAlign w:val="center"/>
             <w:tcBorders>
-              <w:right w:val="nil"/>
               <w:top w:val="single" w:sz="4" w:space="0" w:color="auto"/>
               <w:bottom w:val="single" w:sz="4" w:space="0" w:color="auto"/>
               <w:left w:val="single" w:sz="4" w:space="0" w:color="auto"/>
+              <w:right w:val="nil"/>
+              <w:start w:val="single" w:sz="4" w:space="0" w:color="auto"/>
+              <w:end w:val="nil"/>
             </w:tcBorders>
           </w:tcPr>
           <w:p>
@@ -6442,10 +6835,12 @@
             <w:tcW w:type="dxa" w:w="2880"/>
             <w:vAlign w:val="center"/>
             <w:tcBorders>
-              <w:left w:val="nil"/>
               <w:top w:val="single" w:sz="4" w:space="0" w:color="auto"/>
               <w:bottom w:val="single" w:sz="4" w:space="0" w:color="auto"/>
+              <w:left w:val="nil"/>
               <w:right w:val="single" w:sz="4" w:space="0" w:color="auto"/>
+              <w:start w:val="nil"/>
+              <w:end w:val="single" w:sz="4" w:space="0" w:color="auto"/>
             </w:tcBorders>
           </w:tcPr>
           <w:p>
@@ -6472,6 +6867,8 @@
               <w:bottom w:val="single" w:sz="4" w:space="0" w:color="auto"/>
               <w:left w:val="single" w:sz="4" w:space="0" w:color="auto"/>
               <w:right w:val="single" w:sz="4" w:space="0" w:color="auto"/>
+              <w:start w:val="single" w:sz="4" w:space="0" w:color="auto"/>
+              <w:end w:val="single" w:sz="4" w:space="0" w:color="auto"/>
             </w:tcBorders>
           </w:tcPr>
           <w:p>
@@ -6494,10 +6891,12 @@
             <w:tcW w:type="dxa" w:w="2880"/>
             <w:vAlign w:val="center"/>
             <w:tcBorders>
-              <w:right w:val="nil"/>
               <w:top w:val="single" w:sz="4" w:space="0" w:color="auto"/>
               <w:bottom w:val="single" w:sz="4" w:space="0" w:color="auto"/>
               <w:left w:val="single" w:sz="4" w:space="0" w:color="auto"/>
+              <w:right w:val="nil"/>
+              <w:start w:val="single" w:sz="4" w:space="0" w:color="auto"/>
+              <w:end w:val="nil"/>
             </w:tcBorders>
           </w:tcPr>
           <w:p>
@@ -6522,10 +6921,12 @@
             <w:tcW w:type="dxa" w:w="2880"/>
             <w:vAlign w:val="center"/>
             <w:tcBorders>
-              <w:left w:val="nil"/>
               <w:top w:val="single" w:sz="4" w:space="0" w:color="auto"/>
               <w:bottom w:val="single" w:sz="4" w:space="0" w:color="auto"/>
+              <w:left w:val="nil"/>
               <w:right w:val="single" w:sz="4" w:space="0" w:color="auto"/>
+              <w:start w:val="nil"/>
+              <w:end w:val="single" w:sz="4" w:space="0" w:color="auto"/>
             </w:tcBorders>
           </w:tcPr>
           <w:p>
@@ -6551,6 +6952,8 @@
               <w:bottom w:val="single" w:sz="4" w:space="0" w:color="auto"/>
               <w:left w:val="single" w:sz="4" w:space="0" w:color="auto"/>
               <w:right w:val="single" w:sz="4" w:space="0" w:color="auto"/>
+              <w:start w:val="single" w:sz="4" w:space="0" w:color="auto"/>
+              <w:end w:val="single" w:sz="4" w:space="0" w:color="auto"/>
             </w:tcBorders>
           </w:tcPr>
           <w:p>
@@ -6573,10 +6976,12 @@
             <w:tcW w:type="dxa" w:w="2880"/>
             <w:vAlign w:val="center"/>
             <w:tcBorders>
-              <w:right w:val="nil"/>
               <w:top w:val="single" w:sz="4" w:space="0" w:color="auto"/>
               <w:bottom w:val="single" w:sz="4" w:space="0" w:color="auto"/>
               <w:left w:val="single" w:sz="4" w:space="0" w:color="auto"/>
+              <w:right w:val="nil"/>
+              <w:start w:val="single" w:sz="4" w:space="0" w:color="auto"/>
+              <w:end w:val="nil"/>
             </w:tcBorders>
           </w:tcPr>
           <w:p>
@@ -6601,10 +7006,12 @@
             <w:tcW w:type="dxa" w:w="2880"/>
             <w:vAlign w:val="center"/>
             <w:tcBorders>
-              <w:left w:val="nil"/>
               <w:top w:val="single" w:sz="4" w:space="0" w:color="auto"/>
               <w:bottom w:val="single" w:sz="4" w:space="0" w:color="auto"/>
+              <w:left w:val="nil"/>
               <w:right w:val="single" w:sz="4" w:space="0" w:color="auto"/>
+              <w:start w:val="nil"/>
+              <w:end w:val="single" w:sz="4" w:space="0" w:color="auto"/>
             </w:tcBorders>
           </w:tcPr>
           <w:p>
@@ -6630,6 +7037,8 @@
               <w:bottom w:val="single" w:sz="4" w:space="0" w:color="auto"/>
               <w:left w:val="single" w:sz="4" w:space="0" w:color="auto"/>
               <w:right w:val="single" w:sz="4" w:space="0" w:color="auto"/>
+              <w:start w:val="single" w:sz="4" w:space="0" w:color="auto"/>
+              <w:end w:val="single" w:sz="4" w:space="0" w:color="auto"/>
             </w:tcBorders>
           </w:tcPr>
           <w:p>
@@ -6652,10 +7061,12 @@
             <w:tcW w:type="dxa" w:w="2880"/>
             <w:vAlign w:val="center"/>
             <w:tcBorders>
-              <w:right w:val="nil"/>
               <w:top w:val="single" w:sz="4" w:space="0" w:color="auto"/>
               <w:bottom w:val="single" w:sz="4" w:space="0" w:color="auto"/>
               <w:left w:val="single" w:sz="4" w:space="0" w:color="auto"/>
+              <w:right w:val="nil"/>
+              <w:start w:val="single" w:sz="4" w:space="0" w:color="auto"/>
+              <w:end w:val="nil"/>
             </w:tcBorders>
           </w:tcPr>
           <w:p>
@@ -7948,9 +8359,14 @@
     </w:p>
     <w:tbl>
       <w:tblPr>
-        <w:tblStyle w:val="TableGrid"/>
         <w:tblW w:type="auto" w:w="0"/>
         <w:tblLook w:firstColumn="1" w:firstRow="1" w:lastColumn="0" w:lastRow="0" w:noHBand="0" w:noVBand="1" w:val="04A0"/>
+        <w:tblBorders>
+          <w:left w:val="nil"/>
+          <w:right w:val="nil"/>
+          <w:start w:val="nil"/>
+          <w:end w:val="nil"/>
+        </w:tblBorders>
       </w:tblPr>
       <w:tblGrid>
         <w:gridCol w:w="2160"/>
@@ -7963,6 +8379,14 @@
           <w:tcPr>
             <w:tcW w:type="dxa" w:w="2160"/>
             <w:vAlign w:val="center"/>
+            <w:tcBorders>
+              <w:top w:val="single" w:sz="4" w:space="0" w:color="auto"/>
+              <w:bottom w:val="single" w:sz="4" w:space="0" w:color="auto"/>
+              <w:left w:val="nil"/>
+              <w:right w:val="single" w:sz="4" w:space="0" w:color="auto"/>
+              <w:start w:val="nil"/>
+              <w:end w:val="single" w:sz="4" w:space="0" w:color="auto"/>
+            </w:tcBorders>
           </w:tcPr>
           <w:p>
             <w:pPr>
@@ -7983,6 +8407,14 @@
           <w:tcPr>
             <w:tcW w:type="dxa" w:w="2160"/>
             <w:vAlign w:val="center"/>
+            <w:tcBorders>
+              <w:top w:val="single" w:sz="4" w:space="0" w:color="auto"/>
+              <w:bottom w:val="single" w:sz="4" w:space="0" w:color="auto"/>
+              <w:left w:val="single" w:sz="4" w:space="0" w:color="auto"/>
+              <w:right w:val="single" w:sz="4" w:space="0" w:color="auto"/>
+              <w:start w:val="single" w:sz="4" w:space="0" w:color="auto"/>
+              <w:end w:val="single" w:sz="4" w:space="0" w:color="auto"/>
+            </w:tcBorders>
           </w:tcPr>
           <w:p>
             <w:pPr>
@@ -8003,6 +8435,14 @@
           <w:tcPr>
             <w:tcW w:type="dxa" w:w="2160"/>
             <w:vAlign w:val="center"/>
+            <w:tcBorders>
+              <w:top w:val="single" w:sz="4" w:space="0" w:color="auto"/>
+              <w:bottom w:val="single" w:sz="4" w:space="0" w:color="auto"/>
+              <w:left w:val="single" w:sz="4" w:space="0" w:color="auto"/>
+              <w:right w:val="single" w:sz="4" w:space="0" w:color="auto"/>
+              <w:start w:val="single" w:sz="4" w:space="0" w:color="auto"/>
+              <w:end w:val="single" w:sz="4" w:space="0" w:color="auto"/>
+            </w:tcBorders>
           </w:tcPr>
           <w:p>
             <w:pPr>
@@ -8023,6 +8463,14 @@
           <w:tcPr>
             <w:tcW w:type="dxa" w:w="2160"/>
             <w:vAlign w:val="center"/>
+            <w:tcBorders>
+              <w:top w:val="single" w:sz="4" w:space="0" w:color="auto"/>
+              <w:bottom w:val="single" w:sz="4" w:space="0" w:color="auto"/>
+              <w:left w:val="single" w:sz="4" w:space="0" w:color="auto"/>
+              <w:right w:val="nil"/>
+              <w:start w:val="single" w:sz="4" w:space="0" w:color="auto"/>
+              <w:end w:val="nil"/>
+            </w:tcBorders>
           </w:tcPr>
           <w:p>
             <w:pPr>
@@ -8045,6 +8493,14 @@
           <w:tcPr>
             <w:tcW w:type="dxa" w:w="2160"/>
             <w:vAlign w:val="center"/>
+            <w:tcBorders>
+              <w:top w:val="single" w:sz="4" w:space="0" w:color="auto"/>
+              <w:bottom w:val="single" w:sz="4" w:space="0" w:color="auto"/>
+              <w:left w:val="nil"/>
+              <w:right w:val="single" w:sz="4" w:space="0" w:color="auto"/>
+              <w:start w:val="nil"/>
+              <w:end w:val="single" w:sz="4" w:space="0" w:color="auto"/>
+            </w:tcBorders>
           </w:tcPr>
           <w:p>
             <w:pPr>
@@ -8065,6 +8521,14 @@
           <w:tcPr>
             <w:tcW w:type="dxa" w:w="2160"/>
             <w:vAlign w:val="center"/>
+            <w:tcBorders>
+              <w:top w:val="single" w:sz="4" w:space="0" w:color="auto"/>
+              <w:bottom w:val="single" w:sz="4" w:space="0" w:color="auto"/>
+              <w:left w:val="single" w:sz="4" w:space="0" w:color="auto"/>
+              <w:right w:val="single" w:sz="4" w:space="0" w:color="auto"/>
+              <w:start w:val="single" w:sz="4" w:space="0" w:color="auto"/>
+              <w:end w:val="single" w:sz="4" w:space="0" w:color="auto"/>
+            </w:tcBorders>
           </w:tcPr>
           <w:p>
             <w:pPr>
@@ -8085,6 +8549,14 @@
           <w:tcPr>
             <w:tcW w:type="dxa" w:w="2160"/>
             <w:vAlign w:val="center"/>
+            <w:tcBorders>
+              <w:top w:val="single" w:sz="4" w:space="0" w:color="auto"/>
+              <w:bottom w:val="single" w:sz="4" w:space="0" w:color="auto"/>
+              <w:left w:val="single" w:sz="4" w:space="0" w:color="auto"/>
+              <w:right w:val="single" w:sz="4" w:space="0" w:color="auto"/>
+              <w:start w:val="single" w:sz="4" w:space="0" w:color="auto"/>
+              <w:end w:val="single" w:sz="4" w:space="0" w:color="auto"/>
+            </w:tcBorders>
           </w:tcPr>
           <w:p>
             <w:pPr>
@@ -8105,6 +8577,14 @@
           <w:tcPr>
             <w:tcW w:type="dxa" w:w="2160"/>
             <w:vAlign w:val="center"/>
+            <w:tcBorders>
+              <w:top w:val="single" w:sz="4" w:space="0" w:color="auto"/>
+              <w:bottom w:val="single" w:sz="4" w:space="0" w:color="auto"/>
+              <w:left w:val="single" w:sz="4" w:space="0" w:color="auto"/>
+              <w:right w:val="nil"/>
+              <w:start w:val="single" w:sz="4" w:space="0" w:color="auto"/>
+              <w:end w:val="nil"/>
+            </w:tcBorders>
           </w:tcPr>
           <w:p>
             <w:pPr>
@@ -8127,6 +8607,14 @@
           <w:tcPr>
             <w:tcW w:type="dxa" w:w="2160"/>
             <w:vAlign w:val="center"/>
+            <w:tcBorders>
+              <w:top w:val="single" w:sz="4" w:space="0" w:color="auto"/>
+              <w:bottom w:val="single" w:sz="4" w:space="0" w:color="auto"/>
+              <w:left w:val="nil"/>
+              <w:right w:val="single" w:sz="4" w:space="0" w:color="auto"/>
+              <w:start w:val="nil"/>
+              <w:end w:val="single" w:sz="4" w:space="0" w:color="auto"/>
+            </w:tcBorders>
           </w:tcPr>
           <w:p>
             <w:pPr>
@@ -8147,6 +8635,14 @@
           <w:tcPr>
             <w:tcW w:type="dxa" w:w="2160"/>
             <w:vAlign w:val="center"/>
+            <w:tcBorders>
+              <w:top w:val="single" w:sz="4" w:space="0" w:color="auto"/>
+              <w:bottom w:val="single" w:sz="4" w:space="0" w:color="auto"/>
+              <w:left w:val="single" w:sz="4" w:space="0" w:color="auto"/>
+              <w:right w:val="single" w:sz="4" w:space="0" w:color="auto"/>
+              <w:start w:val="single" w:sz="4" w:space="0" w:color="auto"/>
+              <w:end w:val="single" w:sz="4" w:space="0" w:color="auto"/>
+            </w:tcBorders>
           </w:tcPr>
           <w:p>
             <w:pPr>
@@ -8167,6 +8663,14 @@
           <w:tcPr>
             <w:tcW w:type="dxa" w:w="2160"/>
             <w:vAlign w:val="center"/>
+            <w:tcBorders>
+              <w:top w:val="single" w:sz="4" w:space="0" w:color="auto"/>
+              <w:bottom w:val="single" w:sz="4" w:space="0" w:color="auto"/>
+              <w:left w:val="single" w:sz="4" w:space="0" w:color="auto"/>
+              <w:right w:val="single" w:sz="4" w:space="0" w:color="auto"/>
+              <w:start w:val="single" w:sz="4" w:space="0" w:color="auto"/>
+              <w:end w:val="single" w:sz="4" w:space="0" w:color="auto"/>
+            </w:tcBorders>
           </w:tcPr>
           <w:p>
             <w:pPr>
@@ -8187,6 +8691,14 @@
           <w:tcPr>
             <w:tcW w:type="dxa" w:w="2160"/>
             <w:vAlign w:val="center"/>
+            <w:tcBorders>
+              <w:top w:val="single" w:sz="4" w:space="0" w:color="auto"/>
+              <w:bottom w:val="single" w:sz="4" w:space="0" w:color="auto"/>
+              <w:left w:val="single" w:sz="4" w:space="0" w:color="auto"/>
+              <w:right w:val="nil"/>
+              <w:start w:val="single" w:sz="4" w:space="0" w:color="auto"/>
+              <w:end w:val="nil"/>
+            </w:tcBorders>
           </w:tcPr>
           <w:p>
             <w:pPr>
@@ -8209,6 +8721,14 @@
           <w:tcPr>
             <w:tcW w:type="dxa" w:w="2160"/>
             <w:vAlign w:val="center"/>
+            <w:tcBorders>
+              <w:top w:val="single" w:sz="4" w:space="0" w:color="auto"/>
+              <w:bottom w:val="single" w:sz="4" w:space="0" w:color="auto"/>
+              <w:left w:val="nil"/>
+              <w:right w:val="single" w:sz="4" w:space="0" w:color="auto"/>
+              <w:start w:val="nil"/>
+              <w:end w:val="single" w:sz="4" w:space="0" w:color="auto"/>
+            </w:tcBorders>
           </w:tcPr>
           <w:p>
             <w:pPr>
@@ -8229,6 +8749,14 @@
           <w:tcPr>
             <w:tcW w:type="dxa" w:w="2160"/>
             <w:vAlign w:val="center"/>
+            <w:tcBorders>
+              <w:top w:val="single" w:sz="4" w:space="0" w:color="auto"/>
+              <w:bottom w:val="single" w:sz="4" w:space="0" w:color="auto"/>
+              <w:left w:val="single" w:sz="4" w:space="0" w:color="auto"/>
+              <w:right w:val="single" w:sz="4" w:space="0" w:color="auto"/>
+              <w:start w:val="single" w:sz="4" w:space="0" w:color="auto"/>
+              <w:end w:val="single" w:sz="4" w:space="0" w:color="auto"/>
+            </w:tcBorders>
           </w:tcPr>
           <w:p>
             <w:pPr>
@@ -8249,6 +8777,14 @@
           <w:tcPr>
             <w:tcW w:type="dxa" w:w="2160"/>
             <w:vAlign w:val="center"/>
+            <w:tcBorders>
+              <w:top w:val="single" w:sz="4" w:space="0" w:color="auto"/>
+              <w:bottom w:val="single" w:sz="4" w:space="0" w:color="auto"/>
+              <w:left w:val="single" w:sz="4" w:space="0" w:color="auto"/>
+              <w:right w:val="single" w:sz="4" w:space="0" w:color="auto"/>
+              <w:start w:val="single" w:sz="4" w:space="0" w:color="auto"/>
+              <w:end w:val="single" w:sz="4" w:space="0" w:color="auto"/>
+            </w:tcBorders>
           </w:tcPr>
           <w:p>
             <w:pPr>
@@ -8269,6 +8805,14 @@
           <w:tcPr>
             <w:tcW w:type="dxa" w:w="2160"/>
             <w:vAlign w:val="center"/>
+            <w:tcBorders>
+              <w:top w:val="single" w:sz="4" w:space="0" w:color="auto"/>
+              <w:bottom w:val="single" w:sz="4" w:space="0" w:color="auto"/>
+              <w:left w:val="single" w:sz="4" w:space="0" w:color="auto"/>
+              <w:right w:val="nil"/>
+              <w:start w:val="single" w:sz="4" w:space="0" w:color="auto"/>
+              <w:end w:val="nil"/>
+            </w:tcBorders>
           </w:tcPr>
           <w:p>
             <w:pPr>
@@ -8291,6 +8835,14 @@
           <w:tcPr>
             <w:tcW w:type="dxa" w:w="2160"/>
             <w:vAlign w:val="center"/>
+            <w:tcBorders>
+              <w:top w:val="single" w:sz="4" w:space="0" w:color="auto"/>
+              <w:bottom w:val="single" w:sz="4" w:space="0" w:color="auto"/>
+              <w:left w:val="nil"/>
+              <w:right w:val="single" w:sz="4" w:space="0" w:color="auto"/>
+              <w:start w:val="nil"/>
+              <w:end w:val="single" w:sz="4" w:space="0" w:color="auto"/>
+            </w:tcBorders>
           </w:tcPr>
           <w:p>
             <w:pPr>
@@ -8311,6 +8863,14 @@
           <w:tcPr>
             <w:tcW w:type="dxa" w:w="2160"/>
             <w:vAlign w:val="center"/>
+            <w:tcBorders>
+              <w:top w:val="single" w:sz="4" w:space="0" w:color="auto"/>
+              <w:bottom w:val="single" w:sz="4" w:space="0" w:color="auto"/>
+              <w:left w:val="single" w:sz="4" w:space="0" w:color="auto"/>
+              <w:right w:val="single" w:sz="4" w:space="0" w:color="auto"/>
+              <w:start w:val="single" w:sz="4" w:space="0" w:color="auto"/>
+              <w:end w:val="single" w:sz="4" w:space="0" w:color="auto"/>
+            </w:tcBorders>
           </w:tcPr>
           <w:p>
             <w:pPr>
@@ -8331,6 +8891,14 @@
           <w:tcPr>
             <w:tcW w:type="dxa" w:w="2160"/>
             <w:vAlign w:val="center"/>
+            <w:tcBorders>
+              <w:top w:val="single" w:sz="4" w:space="0" w:color="auto"/>
+              <w:bottom w:val="single" w:sz="4" w:space="0" w:color="auto"/>
+              <w:left w:val="single" w:sz="4" w:space="0" w:color="auto"/>
+              <w:right w:val="single" w:sz="4" w:space="0" w:color="auto"/>
+              <w:start w:val="single" w:sz="4" w:space="0" w:color="auto"/>
+              <w:end w:val="single" w:sz="4" w:space="0" w:color="auto"/>
+            </w:tcBorders>
           </w:tcPr>
           <w:p>
             <w:pPr>
@@ -8351,6 +8919,14 @@
           <w:tcPr>
             <w:tcW w:type="dxa" w:w="2160"/>
             <w:vAlign w:val="center"/>
+            <w:tcBorders>
+              <w:top w:val="single" w:sz="4" w:space="0" w:color="auto"/>
+              <w:bottom w:val="single" w:sz="4" w:space="0" w:color="auto"/>
+              <w:left w:val="single" w:sz="4" w:space="0" w:color="auto"/>
+              <w:right w:val="nil"/>
+              <w:start w:val="single" w:sz="4" w:space="0" w:color="auto"/>
+              <w:end w:val="nil"/>
+            </w:tcBorders>
           </w:tcPr>
           <w:p>
             <w:pPr>
@@ -8373,6 +8949,14 @@
           <w:tcPr>
             <w:tcW w:type="dxa" w:w="2160"/>
             <w:vAlign w:val="center"/>
+            <w:tcBorders>
+              <w:top w:val="single" w:sz="4" w:space="0" w:color="auto"/>
+              <w:bottom w:val="single" w:sz="4" w:space="0" w:color="auto"/>
+              <w:left w:val="nil"/>
+              <w:right w:val="single" w:sz="4" w:space="0" w:color="auto"/>
+              <w:start w:val="nil"/>
+              <w:end w:val="single" w:sz="4" w:space="0" w:color="auto"/>
+            </w:tcBorders>
           </w:tcPr>
           <w:p>
             <w:pPr>
@@ -8393,6 +8977,14 @@
           <w:tcPr>
             <w:tcW w:type="dxa" w:w="2160"/>
             <w:vAlign w:val="center"/>
+            <w:tcBorders>
+              <w:top w:val="single" w:sz="4" w:space="0" w:color="auto"/>
+              <w:bottom w:val="single" w:sz="4" w:space="0" w:color="auto"/>
+              <w:left w:val="single" w:sz="4" w:space="0" w:color="auto"/>
+              <w:right w:val="single" w:sz="4" w:space="0" w:color="auto"/>
+              <w:start w:val="single" w:sz="4" w:space="0" w:color="auto"/>
+              <w:end w:val="single" w:sz="4" w:space="0" w:color="auto"/>
+            </w:tcBorders>
           </w:tcPr>
           <w:p>
             <w:pPr>
@@ -8413,6 +9005,14 @@
           <w:tcPr>
             <w:tcW w:type="dxa" w:w="2160"/>
             <w:vAlign w:val="center"/>
+            <w:tcBorders>
+              <w:top w:val="single" w:sz="4" w:space="0" w:color="auto"/>
+              <w:bottom w:val="single" w:sz="4" w:space="0" w:color="auto"/>
+              <w:left w:val="single" w:sz="4" w:space="0" w:color="auto"/>
+              <w:right w:val="single" w:sz="4" w:space="0" w:color="auto"/>
+              <w:start w:val="single" w:sz="4" w:space="0" w:color="auto"/>
+              <w:end w:val="single" w:sz="4" w:space="0" w:color="auto"/>
+            </w:tcBorders>
           </w:tcPr>
           <w:p>
             <w:pPr>
@@ -8433,6 +9033,14 @@
           <w:tcPr>
             <w:tcW w:type="dxa" w:w="2160"/>
             <w:vAlign w:val="center"/>
+            <w:tcBorders>
+              <w:top w:val="single" w:sz="4" w:space="0" w:color="auto"/>
+              <w:bottom w:val="single" w:sz="4" w:space="0" w:color="auto"/>
+              <w:left w:val="single" w:sz="4" w:space="0" w:color="auto"/>
+              <w:right w:val="nil"/>
+              <w:start w:val="single" w:sz="4" w:space="0" w:color="auto"/>
+              <w:end w:val="nil"/>
+            </w:tcBorders>
           </w:tcPr>
           <w:p>
             <w:pPr>
@@ -8481,9 +9089,14 @@
     </w:p>
     <w:tbl>
       <w:tblPr>
-        <w:tblStyle w:val="TableGrid"/>
         <w:tblW w:type="auto" w:w="0"/>
         <w:tblLook w:firstColumn="1" w:firstRow="1" w:lastColumn="0" w:lastRow="0" w:noHBand="0" w:noVBand="1" w:val="04A0"/>
+        <w:tblBorders>
+          <w:left w:val="nil"/>
+          <w:right w:val="nil"/>
+          <w:start w:val="nil"/>
+          <w:end w:val="nil"/>
+        </w:tblBorders>
       </w:tblPr>
       <w:tblGrid>
         <w:gridCol w:w="2160"/>
@@ -8496,6 +9109,14 @@
           <w:tcPr>
             <w:tcW w:type="dxa" w:w="2160"/>
             <w:vAlign w:val="center"/>
+            <w:tcBorders>
+              <w:top w:val="single" w:sz="4" w:space="0" w:color="auto"/>
+              <w:bottom w:val="single" w:sz="4" w:space="0" w:color="auto"/>
+              <w:left w:val="nil"/>
+              <w:right w:val="single" w:sz="4" w:space="0" w:color="auto"/>
+              <w:start w:val="nil"/>
+              <w:end w:val="single" w:sz="4" w:space="0" w:color="auto"/>
+            </w:tcBorders>
           </w:tcPr>
           <w:p>
             <w:pPr>
@@ -8516,6 +9137,14 @@
           <w:tcPr>
             <w:tcW w:type="dxa" w:w="2160"/>
             <w:vAlign w:val="center"/>
+            <w:tcBorders>
+              <w:top w:val="single" w:sz="4" w:space="0" w:color="auto"/>
+              <w:bottom w:val="single" w:sz="4" w:space="0" w:color="auto"/>
+              <w:left w:val="single" w:sz="4" w:space="0" w:color="auto"/>
+              <w:right w:val="single" w:sz="4" w:space="0" w:color="auto"/>
+              <w:start w:val="single" w:sz="4" w:space="0" w:color="auto"/>
+              <w:end w:val="single" w:sz="4" w:space="0" w:color="auto"/>
+            </w:tcBorders>
           </w:tcPr>
           <w:p>
             <w:pPr>
@@ -8536,6 +9165,14 @@
           <w:tcPr>
             <w:tcW w:type="dxa" w:w="2160"/>
             <w:vAlign w:val="center"/>
+            <w:tcBorders>
+              <w:top w:val="single" w:sz="4" w:space="0" w:color="auto"/>
+              <w:bottom w:val="single" w:sz="4" w:space="0" w:color="auto"/>
+              <w:left w:val="single" w:sz="4" w:space="0" w:color="auto"/>
+              <w:right w:val="single" w:sz="4" w:space="0" w:color="auto"/>
+              <w:start w:val="single" w:sz="4" w:space="0" w:color="auto"/>
+              <w:end w:val="single" w:sz="4" w:space="0" w:color="auto"/>
+            </w:tcBorders>
           </w:tcPr>
           <w:p>
             <w:pPr>
@@ -8556,6 +9193,14 @@
           <w:tcPr>
             <w:tcW w:type="dxa" w:w="2160"/>
             <w:vAlign w:val="center"/>
+            <w:tcBorders>
+              <w:top w:val="single" w:sz="4" w:space="0" w:color="auto"/>
+              <w:bottom w:val="single" w:sz="4" w:space="0" w:color="auto"/>
+              <w:left w:val="single" w:sz="4" w:space="0" w:color="auto"/>
+              <w:right w:val="nil"/>
+              <w:start w:val="single" w:sz="4" w:space="0" w:color="auto"/>
+              <w:end w:val="nil"/>
+            </w:tcBorders>
           </w:tcPr>
           <w:p>
             <w:pPr>
@@ -8578,6 +9223,14 @@
           <w:tcPr>
             <w:tcW w:type="dxa" w:w="2160"/>
             <w:vAlign w:val="center"/>
+            <w:tcBorders>
+              <w:top w:val="single" w:sz="4" w:space="0" w:color="auto"/>
+              <w:bottom w:val="single" w:sz="4" w:space="0" w:color="auto"/>
+              <w:left w:val="nil"/>
+              <w:right w:val="single" w:sz="4" w:space="0" w:color="auto"/>
+              <w:start w:val="nil"/>
+              <w:end w:val="single" w:sz="4" w:space="0" w:color="auto"/>
+            </w:tcBorders>
           </w:tcPr>
           <w:p>
             <w:pPr>
@@ -8598,6 +9251,14 @@
           <w:tcPr>
             <w:tcW w:type="dxa" w:w="2160"/>
             <w:vAlign w:val="center"/>
+            <w:tcBorders>
+              <w:top w:val="single" w:sz="4" w:space="0" w:color="auto"/>
+              <w:bottom w:val="single" w:sz="4" w:space="0" w:color="auto"/>
+              <w:left w:val="single" w:sz="4" w:space="0" w:color="auto"/>
+              <w:right w:val="single" w:sz="4" w:space="0" w:color="auto"/>
+              <w:start w:val="single" w:sz="4" w:space="0" w:color="auto"/>
+              <w:end w:val="single" w:sz="4" w:space="0" w:color="auto"/>
+            </w:tcBorders>
           </w:tcPr>
           <w:p>
             <w:pPr>
@@ -8618,6 +9279,14 @@
           <w:tcPr>
             <w:tcW w:type="dxa" w:w="2160"/>
             <w:vAlign w:val="center"/>
+            <w:tcBorders>
+              <w:top w:val="single" w:sz="4" w:space="0" w:color="auto"/>
+              <w:bottom w:val="single" w:sz="4" w:space="0" w:color="auto"/>
+              <w:left w:val="single" w:sz="4" w:space="0" w:color="auto"/>
+              <w:right w:val="single" w:sz="4" w:space="0" w:color="auto"/>
+              <w:start w:val="single" w:sz="4" w:space="0" w:color="auto"/>
+              <w:end w:val="single" w:sz="4" w:space="0" w:color="auto"/>
+            </w:tcBorders>
           </w:tcPr>
           <w:p>
             <w:pPr>
@@ -8638,6 +9307,14 @@
           <w:tcPr>
             <w:tcW w:type="dxa" w:w="2160"/>
             <w:vAlign w:val="center"/>
+            <w:tcBorders>
+              <w:top w:val="single" w:sz="4" w:space="0" w:color="auto"/>
+              <w:bottom w:val="single" w:sz="4" w:space="0" w:color="auto"/>
+              <w:left w:val="single" w:sz="4" w:space="0" w:color="auto"/>
+              <w:right w:val="nil"/>
+              <w:start w:val="single" w:sz="4" w:space="0" w:color="auto"/>
+              <w:end w:val="nil"/>
+            </w:tcBorders>
           </w:tcPr>
           <w:p>
             <w:pPr>
@@ -8660,6 +9337,14 @@
           <w:tcPr>
             <w:tcW w:type="dxa" w:w="2160"/>
             <w:vAlign w:val="center"/>
+            <w:tcBorders>
+              <w:top w:val="single" w:sz="4" w:space="0" w:color="auto"/>
+              <w:bottom w:val="single" w:sz="4" w:space="0" w:color="auto"/>
+              <w:left w:val="nil"/>
+              <w:right w:val="single" w:sz="4" w:space="0" w:color="auto"/>
+              <w:start w:val="nil"/>
+              <w:end w:val="single" w:sz="4" w:space="0" w:color="auto"/>
+            </w:tcBorders>
           </w:tcPr>
           <w:p>
             <w:pPr>
@@ -8680,6 +9365,14 @@
           <w:tcPr>
             <w:tcW w:type="dxa" w:w="2160"/>
             <w:vAlign w:val="center"/>
+            <w:tcBorders>
+              <w:top w:val="single" w:sz="4" w:space="0" w:color="auto"/>
+              <w:bottom w:val="single" w:sz="4" w:space="0" w:color="auto"/>
+              <w:left w:val="single" w:sz="4" w:space="0" w:color="auto"/>
+              <w:right w:val="single" w:sz="4" w:space="0" w:color="auto"/>
+              <w:start w:val="single" w:sz="4" w:space="0" w:color="auto"/>
+              <w:end w:val="single" w:sz="4" w:space="0" w:color="auto"/>
+            </w:tcBorders>
           </w:tcPr>
           <w:p>
             <w:pPr>
@@ -8700,6 +9393,14 @@
           <w:tcPr>
             <w:tcW w:type="dxa" w:w="2160"/>
             <w:vAlign w:val="center"/>
+            <w:tcBorders>
+              <w:top w:val="single" w:sz="4" w:space="0" w:color="auto"/>
+              <w:bottom w:val="single" w:sz="4" w:space="0" w:color="auto"/>
+              <w:left w:val="single" w:sz="4" w:space="0" w:color="auto"/>
+              <w:right w:val="single" w:sz="4" w:space="0" w:color="auto"/>
+              <w:start w:val="single" w:sz="4" w:space="0" w:color="auto"/>
+              <w:end w:val="single" w:sz="4" w:space="0" w:color="auto"/>
+            </w:tcBorders>
           </w:tcPr>
           <w:p>
             <w:pPr>
@@ -8720,6 +9421,14 @@
           <w:tcPr>
             <w:tcW w:type="dxa" w:w="2160"/>
             <w:vAlign w:val="center"/>
+            <w:tcBorders>
+              <w:top w:val="single" w:sz="4" w:space="0" w:color="auto"/>
+              <w:bottom w:val="single" w:sz="4" w:space="0" w:color="auto"/>
+              <w:left w:val="single" w:sz="4" w:space="0" w:color="auto"/>
+              <w:right w:val="nil"/>
+              <w:start w:val="single" w:sz="4" w:space="0" w:color="auto"/>
+              <w:end w:val="nil"/>
+            </w:tcBorders>
           </w:tcPr>
           <w:p>
             <w:pPr>
@@ -8742,6 +9451,14 @@
           <w:tcPr>
             <w:tcW w:type="dxa" w:w="2160"/>
             <w:vAlign w:val="center"/>
+            <w:tcBorders>
+              <w:top w:val="single" w:sz="4" w:space="0" w:color="auto"/>
+              <w:bottom w:val="single" w:sz="4" w:space="0" w:color="auto"/>
+              <w:left w:val="nil"/>
+              <w:right w:val="single" w:sz="4" w:space="0" w:color="auto"/>
+              <w:start w:val="nil"/>
+              <w:end w:val="single" w:sz="4" w:space="0" w:color="auto"/>
+            </w:tcBorders>
           </w:tcPr>
           <w:p>
             <w:pPr>
@@ -8762,6 +9479,14 @@
           <w:tcPr>
             <w:tcW w:type="dxa" w:w="2160"/>
             <w:vAlign w:val="center"/>
+            <w:tcBorders>
+              <w:top w:val="single" w:sz="4" w:space="0" w:color="auto"/>
+              <w:bottom w:val="single" w:sz="4" w:space="0" w:color="auto"/>
+              <w:left w:val="single" w:sz="4" w:space="0" w:color="auto"/>
+              <w:right w:val="single" w:sz="4" w:space="0" w:color="auto"/>
+              <w:start w:val="single" w:sz="4" w:space="0" w:color="auto"/>
+              <w:end w:val="single" w:sz="4" w:space="0" w:color="auto"/>
+            </w:tcBorders>
           </w:tcPr>
           <w:p>
             <w:pPr>
@@ -8782,6 +9507,14 @@
           <w:tcPr>
             <w:tcW w:type="dxa" w:w="2160"/>
             <w:vAlign w:val="center"/>
+            <w:tcBorders>
+              <w:top w:val="single" w:sz="4" w:space="0" w:color="auto"/>
+              <w:bottom w:val="single" w:sz="4" w:space="0" w:color="auto"/>
+              <w:left w:val="single" w:sz="4" w:space="0" w:color="auto"/>
+              <w:right w:val="single" w:sz="4" w:space="0" w:color="auto"/>
+              <w:start w:val="single" w:sz="4" w:space="0" w:color="auto"/>
+              <w:end w:val="single" w:sz="4" w:space="0" w:color="auto"/>
+            </w:tcBorders>
           </w:tcPr>
           <w:p>
             <w:pPr>
@@ -8802,6 +9535,14 @@
           <w:tcPr>
             <w:tcW w:type="dxa" w:w="2160"/>
             <w:vAlign w:val="center"/>
+            <w:tcBorders>
+              <w:top w:val="single" w:sz="4" w:space="0" w:color="auto"/>
+              <w:bottom w:val="single" w:sz="4" w:space="0" w:color="auto"/>
+              <w:left w:val="single" w:sz="4" w:space="0" w:color="auto"/>
+              <w:right w:val="nil"/>
+              <w:start w:val="single" w:sz="4" w:space="0" w:color="auto"/>
+              <w:end w:val="nil"/>
+            </w:tcBorders>
           </w:tcPr>
           <w:p>
             <w:pPr>
@@ -8824,6 +9565,14 @@
           <w:tcPr>
             <w:tcW w:type="dxa" w:w="2160"/>
             <w:vAlign w:val="center"/>
+            <w:tcBorders>
+              <w:top w:val="single" w:sz="4" w:space="0" w:color="auto"/>
+              <w:bottom w:val="single" w:sz="4" w:space="0" w:color="auto"/>
+              <w:left w:val="nil"/>
+              <w:right w:val="single" w:sz="4" w:space="0" w:color="auto"/>
+              <w:start w:val="nil"/>
+              <w:end w:val="single" w:sz="4" w:space="0" w:color="auto"/>
+            </w:tcBorders>
           </w:tcPr>
           <w:p>
             <w:pPr>
@@ -8844,6 +9593,14 @@
           <w:tcPr>
             <w:tcW w:type="dxa" w:w="2160"/>
             <w:vAlign w:val="center"/>
+            <w:tcBorders>
+              <w:top w:val="single" w:sz="4" w:space="0" w:color="auto"/>
+              <w:bottom w:val="single" w:sz="4" w:space="0" w:color="auto"/>
+              <w:left w:val="single" w:sz="4" w:space="0" w:color="auto"/>
+              <w:right w:val="single" w:sz="4" w:space="0" w:color="auto"/>
+              <w:start w:val="single" w:sz="4" w:space="0" w:color="auto"/>
+              <w:end w:val="single" w:sz="4" w:space="0" w:color="auto"/>
+            </w:tcBorders>
           </w:tcPr>
           <w:p>
             <w:pPr>
@@ -8864,6 +9621,14 @@
           <w:tcPr>
             <w:tcW w:type="dxa" w:w="2160"/>
             <w:vAlign w:val="center"/>
+            <w:tcBorders>
+              <w:top w:val="single" w:sz="4" w:space="0" w:color="auto"/>
+              <w:bottom w:val="single" w:sz="4" w:space="0" w:color="auto"/>
+              <w:left w:val="single" w:sz="4" w:space="0" w:color="auto"/>
+              <w:right w:val="single" w:sz="4" w:space="0" w:color="auto"/>
+              <w:start w:val="single" w:sz="4" w:space="0" w:color="auto"/>
+              <w:end w:val="single" w:sz="4" w:space="0" w:color="auto"/>
+            </w:tcBorders>
           </w:tcPr>
           <w:p>
             <w:pPr>
@@ -8884,6 +9649,14 @@
           <w:tcPr>
             <w:tcW w:type="dxa" w:w="2160"/>
             <w:vAlign w:val="center"/>
+            <w:tcBorders>
+              <w:top w:val="single" w:sz="4" w:space="0" w:color="auto"/>
+              <w:bottom w:val="single" w:sz="4" w:space="0" w:color="auto"/>
+              <w:left w:val="single" w:sz="4" w:space="0" w:color="auto"/>
+              <w:right w:val="nil"/>
+              <w:start w:val="single" w:sz="4" w:space="0" w:color="auto"/>
+              <w:end w:val="nil"/>
+            </w:tcBorders>
           </w:tcPr>
           <w:p>
             <w:pPr>
@@ -8906,6 +9679,14 @@
           <w:tcPr>
             <w:tcW w:type="dxa" w:w="2160"/>
             <w:vAlign w:val="center"/>
+            <w:tcBorders>
+              <w:top w:val="single" w:sz="4" w:space="0" w:color="auto"/>
+              <w:bottom w:val="single" w:sz="4" w:space="0" w:color="auto"/>
+              <w:left w:val="nil"/>
+              <w:right w:val="single" w:sz="4" w:space="0" w:color="auto"/>
+              <w:start w:val="nil"/>
+              <w:end w:val="single" w:sz="4" w:space="0" w:color="auto"/>
+            </w:tcBorders>
           </w:tcPr>
           <w:p>
             <w:pPr>
@@ -8926,6 +9707,14 @@
           <w:tcPr>
             <w:tcW w:type="dxa" w:w="2160"/>
             <w:vAlign w:val="center"/>
+            <w:tcBorders>
+              <w:top w:val="single" w:sz="4" w:space="0" w:color="auto"/>
+              <w:bottom w:val="single" w:sz="4" w:space="0" w:color="auto"/>
+              <w:left w:val="single" w:sz="4" w:space="0" w:color="auto"/>
+              <w:right w:val="single" w:sz="4" w:space="0" w:color="auto"/>
+              <w:start w:val="single" w:sz="4" w:space="0" w:color="auto"/>
+              <w:end w:val="single" w:sz="4" w:space="0" w:color="auto"/>
+            </w:tcBorders>
           </w:tcPr>
           <w:p>
             <w:pPr>
@@ -8946,6 +9735,14 @@
           <w:tcPr>
             <w:tcW w:type="dxa" w:w="2160"/>
             <w:vAlign w:val="center"/>
+            <w:tcBorders>
+              <w:top w:val="single" w:sz="4" w:space="0" w:color="auto"/>
+              <w:bottom w:val="single" w:sz="4" w:space="0" w:color="auto"/>
+              <w:left w:val="single" w:sz="4" w:space="0" w:color="auto"/>
+              <w:right w:val="single" w:sz="4" w:space="0" w:color="auto"/>
+              <w:start w:val="single" w:sz="4" w:space="0" w:color="auto"/>
+              <w:end w:val="single" w:sz="4" w:space="0" w:color="auto"/>
+            </w:tcBorders>
           </w:tcPr>
           <w:p>
             <w:pPr>
@@ -8966,6 +9763,14 @@
           <w:tcPr>
             <w:tcW w:type="dxa" w:w="2160"/>
             <w:vAlign w:val="center"/>
+            <w:tcBorders>
+              <w:top w:val="single" w:sz="4" w:space="0" w:color="auto"/>
+              <w:bottom w:val="single" w:sz="4" w:space="0" w:color="auto"/>
+              <w:left w:val="single" w:sz="4" w:space="0" w:color="auto"/>
+              <w:right w:val="nil"/>
+              <w:start w:val="single" w:sz="4" w:space="0" w:color="auto"/>
+              <w:end w:val="nil"/>
+            </w:tcBorders>
           </w:tcPr>
           <w:p>
             <w:pPr>
@@ -9014,9 +9819,14 @@
     </w:p>
     <w:tbl>
       <w:tblPr>
-        <w:tblStyle w:val="TableGrid"/>
         <w:tblW w:type="auto" w:w="0"/>
         <w:tblLook w:firstColumn="1" w:firstRow="1" w:lastColumn="0" w:lastRow="0" w:noHBand="0" w:noVBand="1" w:val="04A0"/>
+        <w:tblBorders>
+          <w:left w:val="nil"/>
+          <w:right w:val="nil"/>
+          <w:start w:val="nil"/>
+          <w:end w:val="nil"/>
+        </w:tblBorders>
       </w:tblPr>
       <w:tblGrid>
         <w:gridCol w:w="2160"/>
@@ -9029,6 +9839,14 @@
           <w:tcPr>
             <w:tcW w:type="dxa" w:w="2160"/>
             <w:vAlign w:val="center"/>
+            <w:tcBorders>
+              <w:top w:val="single" w:sz="4" w:space="0" w:color="auto"/>
+              <w:bottom w:val="single" w:sz="4" w:space="0" w:color="auto"/>
+              <w:left w:val="nil"/>
+              <w:right w:val="single" w:sz="4" w:space="0" w:color="auto"/>
+              <w:start w:val="nil"/>
+              <w:end w:val="single" w:sz="4" w:space="0" w:color="auto"/>
+            </w:tcBorders>
           </w:tcPr>
           <w:p>
             <w:pPr>
@@ -9049,6 +9867,14 @@
           <w:tcPr>
             <w:tcW w:type="dxa" w:w="2160"/>
             <w:vAlign w:val="center"/>
+            <w:tcBorders>
+              <w:top w:val="single" w:sz="4" w:space="0" w:color="auto"/>
+              <w:bottom w:val="single" w:sz="4" w:space="0" w:color="auto"/>
+              <w:left w:val="single" w:sz="4" w:space="0" w:color="auto"/>
+              <w:right w:val="single" w:sz="4" w:space="0" w:color="auto"/>
+              <w:start w:val="single" w:sz="4" w:space="0" w:color="auto"/>
+              <w:end w:val="single" w:sz="4" w:space="0" w:color="auto"/>
+            </w:tcBorders>
           </w:tcPr>
           <w:p>
             <w:pPr>
@@ -9069,6 +9895,14 @@
           <w:tcPr>
             <w:tcW w:type="dxa" w:w="2160"/>
             <w:vAlign w:val="center"/>
+            <w:tcBorders>
+              <w:top w:val="single" w:sz="4" w:space="0" w:color="auto"/>
+              <w:bottom w:val="single" w:sz="4" w:space="0" w:color="auto"/>
+              <w:left w:val="single" w:sz="4" w:space="0" w:color="auto"/>
+              <w:right w:val="single" w:sz="4" w:space="0" w:color="auto"/>
+              <w:start w:val="single" w:sz="4" w:space="0" w:color="auto"/>
+              <w:end w:val="single" w:sz="4" w:space="0" w:color="auto"/>
+            </w:tcBorders>
           </w:tcPr>
           <w:p>
             <w:pPr>
@@ -9089,6 +9923,14 @@
           <w:tcPr>
             <w:tcW w:type="dxa" w:w="2160"/>
             <w:vAlign w:val="center"/>
+            <w:tcBorders>
+              <w:top w:val="single" w:sz="4" w:space="0" w:color="auto"/>
+              <w:bottom w:val="single" w:sz="4" w:space="0" w:color="auto"/>
+              <w:left w:val="single" w:sz="4" w:space="0" w:color="auto"/>
+              <w:right w:val="nil"/>
+              <w:start w:val="single" w:sz="4" w:space="0" w:color="auto"/>
+              <w:end w:val="nil"/>
+            </w:tcBorders>
           </w:tcPr>
           <w:p>
             <w:pPr>
@@ -9111,6 +9953,14 @@
           <w:tcPr>
             <w:tcW w:type="dxa" w:w="2160"/>
             <w:vAlign w:val="center"/>
+            <w:tcBorders>
+              <w:top w:val="single" w:sz="4" w:space="0" w:color="auto"/>
+              <w:bottom w:val="single" w:sz="4" w:space="0" w:color="auto"/>
+              <w:left w:val="nil"/>
+              <w:right w:val="single" w:sz="4" w:space="0" w:color="auto"/>
+              <w:start w:val="nil"/>
+              <w:end w:val="single" w:sz="4" w:space="0" w:color="auto"/>
+            </w:tcBorders>
           </w:tcPr>
           <w:p>
             <w:pPr>
@@ -9131,6 +9981,14 @@
           <w:tcPr>
             <w:tcW w:type="dxa" w:w="2160"/>
             <w:vAlign w:val="center"/>
+            <w:tcBorders>
+              <w:top w:val="single" w:sz="4" w:space="0" w:color="auto"/>
+              <w:bottom w:val="single" w:sz="4" w:space="0" w:color="auto"/>
+              <w:left w:val="single" w:sz="4" w:space="0" w:color="auto"/>
+              <w:right w:val="single" w:sz="4" w:space="0" w:color="auto"/>
+              <w:start w:val="single" w:sz="4" w:space="0" w:color="auto"/>
+              <w:end w:val="single" w:sz="4" w:space="0" w:color="auto"/>
+            </w:tcBorders>
           </w:tcPr>
           <w:p>
             <w:pPr>
@@ -9151,6 +10009,14 @@
           <w:tcPr>
             <w:tcW w:type="dxa" w:w="2160"/>
             <w:vAlign w:val="center"/>
+            <w:tcBorders>
+              <w:top w:val="single" w:sz="4" w:space="0" w:color="auto"/>
+              <w:bottom w:val="single" w:sz="4" w:space="0" w:color="auto"/>
+              <w:left w:val="single" w:sz="4" w:space="0" w:color="auto"/>
+              <w:right w:val="single" w:sz="4" w:space="0" w:color="auto"/>
+              <w:start w:val="single" w:sz="4" w:space="0" w:color="auto"/>
+              <w:end w:val="single" w:sz="4" w:space="0" w:color="auto"/>
+            </w:tcBorders>
           </w:tcPr>
           <w:p>
             <w:pPr>
@@ -9171,6 +10037,14 @@
           <w:tcPr>
             <w:tcW w:type="dxa" w:w="2160"/>
             <w:vAlign w:val="center"/>
+            <w:tcBorders>
+              <w:top w:val="single" w:sz="4" w:space="0" w:color="auto"/>
+              <w:bottom w:val="single" w:sz="4" w:space="0" w:color="auto"/>
+              <w:left w:val="single" w:sz="4" w:space="0" w:color="auto"/>
+              <w:right w:val="nil"/>
+              <w:start w:val="single" w:sz="4" w:space="0" w:color="auto"/>
+              <w:end w:val="nil"/>
+            </w:tcBorders>
           </w:tcPr>
           <w:p>
             <w:pPr>
@@ -9193,6 +10067,14 @@
           <w:tcPr>
             <w:tcW w:type="dxa" w:w="2160"/>
             <w:vAlign w:val="center"/>
+            <w:tcBorders>
+              <w:top w:val="single" w:sz="4" w:space="0" w:color="auto"/>
+              <w:bottom w:val="single" w:sz="4" w:space="0" w:color="auto"/>
+              <w:left w:val="nil"/>
+              <w:right w:val="single" w:sz="4" w:space="0" w:color="auto"/>
+              <w:start w:val="nil"/>
+              <w:end w:val="single" w:sz="4" w:space="0" w:color="auto"/>
+            </w:tcBorders>
           </w:tcPr>
           <w:p>
             <w:pPr>
@@ -9213,6 +10095,14 @@
           <w:tcPr>
             <w:tcW w:type="dxa" w:w="2160"/>
             <w:vAlign w:val="center"/>
+            <w:tcBorders>
+              <w:top w:val="single" w:sz="4" w:space="0" w:color="auto"/>
+              <w:bottom w:val="single" w:sz="4" w:space="0" w:color="auto"/>
+              <w:left w:val="single" w:sz="4" w:space="0" w:color="auto"/>
+              <w:right w:val="single" w:sz="4" w:space="0" w:color="auto"/>
+              <w:start w:val="single" w:sz="4" w:space="0" w:color="auto"/>
+              <w:end w:val="single" w:sz="4" w:space="0" w:color="auto"/>
+            </w:tcBorders>
           </w:tcPr>
           <w:p>
             <w:pPr>
@@ -9233,6 +10123,14 @@
           <w:tcPr>
             <w:tcW w:type="dxa" w:w="2160"/>
             <w:vAlign w:val="center"/>
+            <w:tcBorders>
+              <w:top w:val="single" w:sz="4" w:space="0" w:color="auto"/>
+              <w:bottom w:val="single" w:sz="4" w:space="0" w:color="auto"/>
+              <w:left w:val="single" w:sz="4" w:space="0" w:color="auto"/>
+              <w:right w:val="single" w:sz="4" w:space="0" w:color="auto"/>
+              <w:start w:val="single" w:sz="4" w:space="0" w:color="auto"/>
+              <w:end w:val="single" w:sz="4" w:space="0" w:color="auto"/>
+            </w:tcBorders>
           </w:tcPr>
           <w:p>
             <w:pPr>
@@ -9253,6 +10151,14 @@
           <w:tcPr>
             <w:tcW w:type="dxa" w:w="2160"/>
             <w:vAlign w:val="center"/>
+            <w:tcBorders>
+              <w:top w:val="single" w:sz="4" w:space="0" w:color="auto"/>
+              <w:bottom w:val="single" w:sz="4" w:space="0" w:color="auto"/>
+              <w:left w:val="single" w:sz="4" w:space="0" w:color="auto"/>
+              <w:right w:val="nil"/>
+              <w:start w:val="single" w:sz="4" w:space="0" w:color="auto"/>
+              <w:end w:val="nil"/>
+            </w:tcBorders>
           </w:tcPr>
           <w:p>
             <w:pPr>
@@ -9275,6 +10181,14 @@
           <w:tcPr>
             <w:tcW w:type="dxa" w:w="2160"/>
             <w:vAlign w:val="center"/>
+            <w:tcBorders>
+              <w:top w:val="single" w:sz="4" w:space="0" w:color="auto"/>
+              <w:bottom w:val="single" w:sz="4" w:space="0" w:color="auto"/>
+              <w:left w:val="nil"/>
+              <w:right w:val="single" w:sz="4" w:space="0" w:color="auto"/>
+              <w:start w:val="nil"/>
+              <w:end w:val="single" w:sz="4" w:space="0" w:color="auto"/>
+            </w:tcBorders>
           </w:tcPr>
           <w:p>
             <w:pPr>
@@ -9295,6 +10209,14 @@
           <w:tcPr>
             <w:tcW w:type="dxa" w:w="2160"/>
             <w:vAlign w:val="center"/>
+            <w:tcBorders>
+              <w:top w:val="single" w:sz="4" w:space="0" w:color="auto"/>
+              <w:bottom w:val="single" w:sz="4" w:space="0" w:color="auto"/>
+              <w:left w:val="single" w:sz="4" w:space="0" w:color="auto"/>
+              <w:right w:val="single" w:sz="4" w:space="0" w:color="auto"/>
+              <w:start w:val="single" w:sz="4" w:space="0" w:color="auto"/>
+              <w:end w:val="single" w:sz="4" w:space="0" w:color="auto"/>
+            </w:tcBorders>
           </w:tcPr>
           <w:p>
             <w:pPr>
@@ -9315,6 +10237,14 @@
           <w:tcPr>
             <w:tcW w:type="dxa" w:w="2160"/>
             <w:vAlign w:val="center"/>
+            <w:tcBorders>
+              <w:top w:val="single" w:sz="4" w:space="0" w:color="auto"/>
+              <w:bottom w:val="single" w:sz="4" w:space="0" w:color="auto"/>
+              <w:left w:val="single" w:sz="4" w:space="0" w:color="auto"/>
+              <w:right w:val="single" w:sz="4" w:space="0" w:color="auto"/>
+              <w:start w:val="single" w:sz="4" w:space="0" w:color="auto"/>
+              <w:end w:val="single" w:sz="4" w:space="0" w:color="auto"/>
+            </w:tcBorders>
           </w:tcPr>
           <w:p>
             <w:pPr>
@@ -9335,6 +10265,14 @@
           <w:tcPr>
             <w:tcW w:type="dxa" w:w="2160"/>
             <w:vAlign w:val="center"/>
+            <w:tcBorders>
+              <w:top w:val="single" w:sz="4" w:space="0" w:color="auto"/>
+              <w:bottom w:val="single" w:sz="4" w:space="0" w:color="auto"/>
+              <w:left w:val="single" w:sz="4" w:space="0" w:color="auto"/>
+              <w:right w:val="nil"/>
+              <w:start w:val="single" w:sz="4" w:space="0" w:color="auto"/>
+              <w:end w:val="nil"/>
+            </w:tcBorders>
           </w:tcPr>
           <w:p>
             <w:pPr>
@@ -9357,6 +10295,14 @@
           <w:tcPr>
             <w:tcW w:type="dxa" w:w="2160"/>
             <w:vAlign w:val="center"/>
+            <w:tcBorders>
+              <w:top w:val="single" w:sz="4" w:space="0" w:color="auto"/>
+              <w:bottom w:val="single" w:sz="4" w:space="0" w:color="auto"/>
+              <w:left w:val="nil"/>
+              <w:right w:val="single" w:sz="4" w:space="0" w:color="auto"/>
+              <w:start w:val="nil"/>
+              <w:end w:val="single" w:sz="4" w:space="0" w:color="auto"/>
+            </w:tcBorders>
           </w:tcPr>
           <w:p>
             <w:pPr>
@@ -9377,6 +10323,14 @@
           <w:tcPr>
             <w:tcW w:type="dxa" w:w="2160"/>
             <w:vAlign w:val="center"/>
+            <w:tcBorders>
+              <w:top w:val="single" w:sz="4" w:space="0" w:color="auto"/>
+              <w:bottom w:val="single" w:sz="4" w:space="0" w:color="auto"/>
+              <w:left w:val="single" w:sz="4" w:space="0" w:color="auto"/>
+              <w:right w:val="single" w:sz="4" w:space="0" w:color="auto"/>
+              <w:start w:val="single" w:sz="4" w:space="0" w:color="auto"/>
+              <w:end w:val="single" w:sz="4" w:space="0" w:color="auto"/>
+            </w:tcBorders>
           </w:tcPr>
           <w:p>
             <w:pPr>
@@ -9397,6 +10351,14 @@
           <w:tcPr>
             <w:tcW w:type="dxa" w:w="2160"/>
             <w:vAlign w:val="center"/>
+            <w:tcBorders>
+              <w:top w:val="single" w:sz="4" w:space="0" w:color="auto"/>
+              <w:bottom w:val="single" w:sz="4" w:space="0" w:color="auto"/>
+              <w:left w:val="single" w:sz="4" w:space="0" w:color="auto"/>
+              <w:right w:val="single" w:sz="4" w:space="0" w:color="auto"/>
+              <w:start w:val="single" w:sz="4" w:space="0" w:color="auto"/>
+              <w:end w:val="single" w:sz="4" w:space="0" w:color="auto"/>
+            </w:tcBorders>
           </w:tcPr>
           <w:p>
             <w:pPr>
@@ -9417,6 +10379,14 @@
           <w:tcPr>
             <w:tcW w:type="dxa" w:w="2160"/>
             <w:vAlign w:val="center"/>
+            <w:tcBorders>
+              <w:top w:val="single" w:sz="4" w:space="0" w:color="auto"/>
+              <w:bottom w:val="single" w:sz="4" w:space="0" w:color="auto"/>
+              <w:left w:val="single" w:sz="4" w:space="0" w:color="auto"/>
+              <w:right w:val="nil"/>
+              <w:start w:val="single" w:sz="4" w:space="0" w:color="auto"/>
+              <w:end w:val="nil"/>
+            </w:tcBorders>
           </w:tcPr>
           <w:p>
             <w:pPr>
@@ -9439,6 +10409,14 @@
           <w:tcPr>
             <w:tcW w:type="dxa" w:w="2160"/>
             <w:vAlign w:val="center"/>
+            <w:tcBorders>
+              <w:top w:val="single" w:sz="4" w:space="0" w:color="auto"/>
+              <w:bottom w:val="single" w:sz="4" w:space="0" w:color="auto"/>
+              <w:left w:val="nil"/>
+              <w:right w:val="single" w:sz="4" w:space="0" w:color="auto"/>
+              <w:start w:val="nil"/>
+              <w:end w:val="single" w:sz="4" w:space="0" w:color="auto"/>
+            </w:tcBorders>
           </w:tcPr>
           <w:p>
             <w:pPr>
@@ -9459,6 +10437,14 @@
           <w:tcPr>
             <w:tcW w:type="dxa" w:w="2160"/>
             <w:vAlign w:val="center"/>
+            <w:tcBorders>
+              <w:top w:val="single" w:sz="4" w:space="0" w:color="auto"/>
+              <w:bottom w:val="single" w:sz="4" w:space="0" w:color="auto"/>
+              <w:left w:val="single" w:sz="4" w:space="0" w:color="auto"/>
+              <w:right w:val="single" w:sz="4" w:space="0" w:color="auto"/>
+              <w:start w:val="single" w:sz="4" w:space="0" w:color="auto"/>
+              <w:end w:val="single" w:sz="4" w:space="0" w:color="auto"/>
+            </w:tcBorders>
           </w:tcPr>
           <w:p>
             <w:pPr>
@@ -9479,6 +10465,14 @@
           <w:tcPr>
             <w:tcW w:type="dxa" w:w="2160"/>
             <w:vAlign w:val="center"/>
+            <w:tcBorders>
+              <w:top w:val="single" w:sz="4" w:space="0" w:color="auto"/>
+              <w:bottom w:val="single" w:sz="4" w:space="0" w:color="auto"/>
+              <w:left w:val="single" w:sz="4" w:space="0" w:color="auto"/>
+              <w:right w:val="single" w:sz="4" w:space="0" w:color="auto"/>
+              <w:start w:val="single" w:sz="4" w:space="0" w:color="auto"/>
+              <w:end w:val="single" w:sz="4" w:space="0" w:color="auto"/>
+            </w:tcBorders>
           </w:tcPr>
           <w:p>
             <w:pPr>
@@ -9499,6 +10493,14 @@
           <w:tcPr>
             <w:tcW w:type="dxa" w:w="2160"/>
             <w:vAlign w:val="center"/>
+            <w:tcBorders>
+              <w:top w:val="single" w:sz="4" w:space="0" w:color="auto"/>
+              <w:bottom w:val="single" w:sz="4" w:space="0" w:color="auto"/>
+              <w:left w:val="single" w:sz="4" w:space="0" w:color="auto"/>
+              <w:right w:val="nil"/>
+              <w:start w:val="single" w:sz="4" w:space="0" w:color="auto"/>
+              <w:end w:val="nil"/>
+            </w:tcBorders>
           </w:tcPr>
           <w:p>
             <w:pPr>
@@ -9547,9 +10549,14 @@
     </w:p>
     <w:tbl>
       <w:tblPr>
-        <w:tblStyle w:val="TableGrid"/>
         <w:tblW w:type="auto" w:w="0"/>
         <w:tblLook w:firstColumn="1" w:firstRow="1" w:lastColumn="0" w:lastRow="0" w:noHBand="0" w:noVBand="1" w:val="04A0"/>
+        <w:tblBorders>
+          <w:left w:val="nil"/>
+          <w:right w:val="nil"/>
+          <w:start w:val="nil"/>
+          <w:end w:val="nil"/>
+        </w:tblBorders>
       </w:tblPr>
       <w:tblGrid>
         <w:gridCol w:w="2160"/>
@@ -9562,6 +10569,14 @@
           <w:tcPr>
             <w:tcW w:type="dxa" w:w="2160"/>
             <w:vAlign w:val="center"/>
+            <w:tcBorders>
+              <w:top w:val="single" w:sz="4" w:space="0" w:color="auto"/>
+              <w:bottom w:val="single" w:sz="4" w:space="0" w:color="auto"/>
+              <w:left w:val="nil"/>
+              <w:right w:val="single" w:sz="4" w:space="0" w:color="auto"/>
+              <w:start w:val="nil"/>
+              <w:end w:val="single" w:sz="4" w:space="0" w:color="auto"/>
+            </w:tcBorders>
           </w:tcPr>
           <w:p>
             <w:pPr>
@@ -9582,6 +10597,14 @@
           <w:tcPr>
             <w:tcW w:type="dxa" w:w="2160"/>
             <w:vAlign w:val="center"/>
+            <w:tcBorders>
+              <w:top w:val="single" w:sz="4" w:space="0" w:color="auto"/>
+              <w:bottom w:val="single" w:sz="4" w:space="0" w:color="auto"/>
+              <w:left w:val="single" w:sz="4" w:space="0" w:color="auto"/>
+              <w:right w:val="single" w:sz="4" w:space="0" w:color="auto"/>
+              <w:start w:val="single" w:sz="4" w:space="0" w:color="auto"/>
+              <w:end w:val="single" w:sz="4" w:space="0" w:color="auto"/>
+            </w:tcBorders>
           </w:tcPr>
           <w:p>
             <w:pPr>
@@ -9602,6 +10625,14 @@
           <w:tcPr>
             <w:tcW w:type="dxa" w:w="2160"/>
             <w:vAlign w:val="center"/>
+            <w:tcBorders>
+              <w:top w:val="single" w:sz="4" w:space="0" w:color="auto"/>
+              <w:bottom w:val="single" w:sz="4" w:space="0" w:color="auto"/>
+              <w:left w:val="single" w:sz="4" w:space="0" w:color="auto"/>
+              <w:right w:val="single" w:sz="4" w:space="0" w:color="auto"/>
+              <w:start w:val="single" w:sz="4" w:space="0" w:color="auto"/>
+              <w:end w:val="single" w:sz="4" w:space="0" w:color="auto"/>
+            </w:tcBorders>
           </w:tcPr>
           <w:p>
             <w:pPr>
@@ -9622,6 +10653,14 @@
           <w:tcPr>
             <w:tcW w:type="dxa" w:w="2160"/>
             <w:vAlign w:val="center"/>
+            <w:tcBorders>
+              <w:top w:val="single" w:sz="4" w:space="0" w:color="auto"/>
+              <w:bottom w:val="single" w:sz="4" w:space="0" w:color="auto"/>
+              <w:left w:val="single" w:sz="4" w:space="0" w:color="auto"/>
+              <w:right w:val="nil"/>
+              <w:start w:val="single" w:sz="4" w:space="0" w:color="auto"/>
+              <w:end w:val="nil"/>
+            </w:tcBorders>
           </w:tcPr>
           <w:p>
             <w:pPr>
@@ -9644,6 +10683,14 @@
           <w:tcPr>
             <w:tcW w:type="dxa" w:w="2160"/>
             <w:vAlign w:val="center"/>
+            <w:tcBorders>
+              <w:top w:val="single" w:sz="4" w:space="0" w:color="auto"/>
+              <w:bottom w:val="single" w:sz="4" w:space="0" w:color="auto"/>
+              <w:left w:val="nil"/>
+              <w:right w:val="single" w:sz="4" w:space="0" w:color="auto"/>
+              <w:start w:val="nil"/>
+              <w:end w:val="single" w:sz="4" w:space="0" w:color="auto"/>
+            </w:tcBorders>
           </w:tcPr>
           <w:p>
             <w:pPr>
@@ -9664,6 +10711,14 @@
           <w:tcPr>
             <w:tcW w:type="dxa" w:w="2160"/>
             <w:vAlign w:val="center"/>
+            <w:tcBorders>
+              <w:top w:val="single" w:sz="4" w:space="0" w:color="auto"/>
+              <w:bottom w:val="single" w:sz="4" w:space="0" w:color="auto"/>
+              <w:left w:val="single" w:sz="4" w:space="0" w:color="auto"/>
+              <w:right w:val="single" w:sz="4" w:space="0" w:color="auto"/>
+              <w:start w:val="single" w:sz="4" w:space="0" w:color="auto"/>
+              <w:end w:val="single" w:sz="4" w:space="0" w:color="auto"/>
+            </w:tcBorders>
           </w:tcPr>
           <w:p>
             <w:pPr>
@@ -9684,6 +10739,14 @@
           <w:tcPr>
             <w:tcW w:type="dxa" w:w="2160"/>
             <w:vAlign w:val="center"/>
+            <w:tcBorders>
+              <w:top w:val="single" w:sz="4" w:space="0" w:color="auto"/>
+              <w:bottom w:val="single" w:sz="4" w:space="0" w:color="auto"/>
+              <w:left w:val="single" w:sz="4" w:space="0" w:color="auto"/>
+              <w:right w:val="single" w:sz="4" w:space="0" w:color="auto"/>
+              <w:start w:val="single" w:sz="4" w:space="0" w:color="auto"/>
+              <w:end w:val="single" w:sz="4" w:space="0" w:color="auto"/>
+            </w:tcBorders>
           </w:tcPr>
           <w:p>
             <w:pPr>
@@ -9704,6 +10767,14 @@
           <w:tcPr>
             <w:tcW w:type="dxa" w:w="2160"/>
             <w:vAlign w:val="center"/>
+            <w:tcBorders>
+              <w:top w:val="single" w:sz="4" w:space="0" w:color="auto"/>
+              <w:bottom w:val="single" w:sz="4" w:space="0" w:color="auto"/>
+              <w:left w:val="single" w:sz="4" w:space="0" w:color="auto"/>
+              <w:right w:val="nil"/>
+              <w:start w:val="single" w:sz="4" w:space="0" w:color="auto"/>
+              <w:end w:val="nil"/>
+            </w:tcBorders>
           </w:tcPr>
           <w:p>
             <w:pPr>
@@ -9726,6 +10797,14 @@
           <w:tcPr>
             <w:tcW w:type="dxa" w:w="2160"/>
             <w:vAlign w:val="center"/>
+            <w:tcBorders>
+              <w:top w:val="single" w:sz="4" w:space="0" w:color="auto"/>
+              <w:bottom w:val="single" w:sz="4" w:space="0" w:color="auto"/>
+              <w:left w:val="nil"/>
+              <w:right w:val="single" w:sz="4" w:space="0" w:color="auto"/>
+              <w:start w:val="nil"/>
+              <w:end w:val="single" w:sz="4" w:space="0" w:color="auto"/>
+            </w:tcBorders>
           </w:tcPr>
           <w:p>
             <w:pPr>
@@ -9746,6 +10825,14 @@
           <w:tcPr>
             <w:tcW w:type="dxa" w:w="2160"/>
             <w:vAlign w:val="center"/>
+            <w:tcBorders>
+              <w:top w:val="single" w:sz="4" w:space="0" w:color="auto"/>
+              <w:bottom w:val="single" w:sz="4" w:space="0" w:color="auto"/>
+              <w:left w:val="single" w:sz="4" w:space="0" w:color="auto"/>
+              <w:right w:val="single" w:sz="4" w:space="0" w:color="auto"/>
+              <w:start w:val="single" w:sz="4" w:space="0" w:color="auto"/>
+              <w:end w:val="single" w:sz="4" w:space="0" w:color="auto"/>
+            </w:tcBorders>
           </w:tcPr>
           <w:p>
             <w:pPr>
@@ -9766,6 +10853,14 @@
           <w:tcPr>
             <w:tcW w:type="dxa" w:w="2160"/>
             <w:vAlign w:val="center"/>
+            <w:tcBorders>
+              <w:top w:val="single" w:sz="4" w:space="0" w:color="auto"/>
+              <w:bottom w:val="single" w:sz="4" w:space="0" w:color="auto"/>
+              <w:left w:val="single" w:sz="4" w:space="0" w:color="auto"/>
+              <w:right w:val="single" w:sz="4" w:space="0" w:color="auto"/>
+              <w:start w:val="single" w:sz="4" w:space="0" w:color="auto"/>
+              <w:end w:val="single" w:sz="4" w:space="0" w:color="auto"/>
+            </w:tcBorders>
           </w:tcPr>
           <w:p>
             <w:pPr>
@@ -9786,6 +10881,14 @@
           <w:tcPr>
             <w:tcW w:type="dxa" w:w="2160"/>
             <w:vAlign w:val="center"/>
+            <w:tcBorders>
+              <w:top w:val="single" w:sz="4" w:space="0" w:color="auto"/>
+              <w:bottom w:val="single" w:sz="4" w:space="0" w:color="auto"/>
+              <w:left w:val="single" w:sz="4" w:space="0" w:color="auto"/>
+              <w:right w:val="nil"/>
+              <w:start w:val="single" w:sz="4" w:space="0" w:color="auto"/>
+              <w:end w:val="nil"/>
+            </w:tcBorders>
           </w:tcPr>
           <w:p>
             <w:pPr>
@@ -9808,6 +10911,14 @@
           <w:tcPr>
             <w:tcW w:type="dxa" w:w="2160"/>
             <w:vAlign w:val="center"/>
+            <w:tcBorders>
+              <w:top w:val="single" w:sz="4" w:space="0" w:color="auto"/>
+              <w:bottom w:val="single" w:sz="4" w:space="0" w:color="auto"/>
+              <w:left w:val="nil"/>
+              <w:right w:val="single" w:sz="4" w:space="0" w:color="auto"/>
+              <w:start w:val="nil"/>
+              <w:end w:val="single" w:sz="4" w:space="0" w:color="auto"/>
+            </w:tcBorders>
           </w:tcPr>
           <w:p>
             <w:pPr>
@@ -9828,6 +10939,14 @@
           <w:tcPr>
             <w:tcW w:type="dxa" w:w="2160"/>
             <w:vAlign w:val="center"/>
+            <w:tcBorders>
+              <w:top w:val="single" w:sz="4" w:space="0" w:color="auto"/>
+              <w:bottom w:val="single" w:sz="4" w:space="0" w:color="auto"/>
+              <w:left w:val="single" w:sz="4" w:space="0" w:color="auto"/>
+              <w:right w:val="single" w:sz="4" w:space="0" w:color="auto"/>
+              <w:start w:val="single" w:sz="4" w:space="0" w:color="auto"/>
+              <w:end w:val="single" w:sz="4" w:space="0" w:color="auto"/>
+            </w:tcBorders>
           </w:tcPr>
           <w:p>
             <w:pPr>
@@ -9848,6 +10967,14 @@
           <w:tcPr>
             <w:tcW w:type="dxa" w:w="2160"/>
             <w:vAlign w:val="center"/>
+            <w:tcBorders>
+              <w:top w:val="single" w:sz="4" w:space="0" w:color="auto"/>
+              <w:bottom w:val="single" w:sz="4" w:space="0" w:color="auto"/>
+              <w:left w:val="single" w:sz="4" w:space="0" w:color="auto"/>
+              <w:right w:val="single" w:sz="4" w:space="0" w:color="auto"/>
+              <w:start w:val="single" w:sz="4" w:space="0" w:color="auto"/>
+              <w:end w:val="single" w:sz="4" w:space="0" w:color="auto"/>
+            </w:tcBorders>
           </w:tcPr>
           <w:p>
             <w:pPr>
@@ -9868,6 +10995,14 @@
           <w:tcPr>
             <w:tcW w:type="dxa" w:w="2160"/>
             <w:vAlign w:val="center"/>
+            <w:tcBorders>
+              <w:top w:val="single" w:sz="4" w:space="0" w:color="auto"/>
+              <w:bottom w:val="single" w:sz="4" w:space="0" w:color="auto"/>
+              <w:left w:val="single" w:sz="4" w:space="0" w:color="auto"/>
+              <w:right w:val="nil"/>
+              <w:start w:val="single" w:sz="4" w:space="0" w:color="auto"/>
+              <w:end w:val="nil"/>
+            </w:tcBorders>
           </w:tcPr>
           <w:p>
             <w:pPr>
@@ -9890,6 +11025,14 @@
           <w:tcPr>
             <w:tcW w:type="dxa" w:w="2160"/>
             <w:vAlign w:val="center"/>
+            <w:tcBorders>
+              <w:top w:val="single" w:sz="4" w:space="0" w:color="auto"/>
+              <w:bottom w:val="single" w:sz="4" w:space="0" w:color="auto"/>
+              <w:left w:val="nil"/>
+              <w:right w:val="single" w:sz="4" w:space="0" w:color="auto"/>
+              <w:start w:val="nil"/>
+              <w:end w:val="single" w:sz="4" w:space="0" w:color="auto"/>
+            </w:tcBorders>
           </w:tcPr>
           <w:p>
             <w:pPr>
@@ -9910,6 +11053,14 @@
           <w:tcPr>
             <w:tcW w:type="dxa" w:w="2160"/>
             <w:vAlign w:val="center"/>
+            <w:tcBorders>
+              <w:top w:val="single" w:sz="4" w:space="0" w:color="auto"/>
+              <w:bottom w:val="single" w:sz="4" w:space="0" w:color="auto"/>
+              <w:left w:val="single" w:sz="4" w:space="0" w:color="auto"/>
+              <w:right w:val="single" w:sz="4" w:space="0" w:color="auto"/>
+              <w:start w:val="single" w:sz="4" w:space="0" w:color="auto"/>
+              <w:end w:val="single" w:sz="4" w:space="0" w:color="auto"/>
+            </w:tcBorders>
           </w:tcPr>
           <w:p>
             <w:pPr>
@@ -9930,6 +11081,14 @@
           <w:tcPr>
             <w:tcW w:type="dxa" w:w="2160"/>
             <w:vAlign w:val="center"/>
+            <w:tcBorders>
+              <w:top w:val="single" w:sz="4" w:space="0" w:color="auto"/>
+              <w:bottom w:val="single" w:sz="4" w:space="0" w:color="auto"/>
+              <w:left w:val="single" w:sz="4" w:space="0" w:color="auto"/>
+              <w:right w:val="single" w:sz="4" w:space="0" w:color="auto"/>
+              <w:start w:val="single" w:sz="4" w:space="0" w:color="auto"/>
+              <w:end w:val="single" w:sz="4" w:space="0" w:color="auto"/>
+            </w:tcBorders>
           </w:tcPr>
           <w:p>
             <w:pPr>
@@ -9950,6 +11109,14 @@
           <w:tcPr>
             <w:tcW w:type="dxa" w:w="2160"/>
             <w:vAlign w:val="center"/>
+            <w:tcBorders>
+              <w:top w:val="single" w:sz="4" w:space="0" w:color="auto"/>
+              <w:bottom w:val="single" w:sz="4" w:space="0" w:color="auto"/>
+              <w:left w:val="single" w:sz="4" w:space="0" w:color="auto"/>
+              <w:right w:val="nil"/>
+              <w:start w:val="single" w:sz="4" w:space="0" w:color="auto"/>
+              <w:end w:val="nil"/>
+            </w:tcBorders>
           </w:tcPr>
           <w:p>
             <w:pPr>
@@ -9972,6 +11139,14 @@
           <w:tcPr>
             <w:tcW w:type="dxa" w:w="2160"/>
             <w:vAlign w:val="center"/>
+            <w:tcBorders>
+              <w:top w:val="single" w:sz="4" w:space="0" w:color="auto"/>
+              <w:bottom w:val="single" w:sz="4" w:space="0" w:color="auto"/>
+              <w:left w:val="nil"/>
+              <w:right w:val="single" w:sz="4" w:space="0" w:color="auto"/>
+              <w:start w:val="nil"/>
+              <w:end w:val="single" w:sz="4" w:space="0" w:color="auto"/>
+            </w:tcBorders>
           </w:tcPr>
           <w:p>
             <w:pPr>
@@ -9992,6 +11167,14 @@
           <w:tcPr>
             <w:tcW w:type="dxa" w:w="2160"/>
             <w:vAlign w:val="center"/>
+            <w:tcBorders>
+              <w:top w:val="single" w:sz="4" w:space="0" w:color="auto"/>
+              <w:bottom w:val="single" w:sz="4" w:space="0" w:color="auto"/>
+              <w:left w:val="single" w:sz="4" w:space="0" w:color="auto"/>
+              <w:right w:val="single" w:sz="4" w:space="0" w:color="auto"/>
+              <w:start w:val="single" w:sz="4" w:space="0" w:color="auto"/>
+              <w:end w:val="single" w:sz="4" w:space="0" w:color="auto"/>
+            </w:tcBorders>
           </w:tcPr>
           <w:p>
             <w:pPr>
@@ -10012,6 +11195,14 @@
           <w:tcPr>
             <w:tcW w:type="dxa" w:w="2160"/>
             <w:vAlign w:val="center"/>
+            <w:tcBorders>
+              <w:top w:val="single" w:sz="4" w:space="0" w:color="auto"/>
+              <w:bottom w:val="single" w:sz="4" w:space="0" w:color="auto"/>
+              <w:left w:val="single" w:sz="4" w:space="0" w:color="auto"/>
+              <w:right w:val="single" w:sz="4" w:space="0" w:color="auto"/>
+              <w:start w:val="single" w:sz="4" w:space="0" w:color="auto"/>
+              <w:end w:val="single" w:sz="4" w:space="0" w:color="auto"/>
+            </w:tcBorders>
           </w:tcPr>
           <w:p>
             <w:pPr>
@@ -10032,6 +11223,14 @@
           <w:tcPr>
             <w:tcW w:type="dxa" w:w="2160"/>
             <w:vAlign w:val="center"/>
+            <w:tcBorders>
+              <w:top w:val="single" w:sz="4" w:space="0" w:color="auto"/>
+              <w:bottom w:val="single" w:sz="4" w:space="0" w:color="auto"/>
+              <w:left w:val="single" w:sz="4" w:space="0" w:color="auto"/>
+              <w:right w:val="nil"/>
+              <w:start w:val="single" w:sz="4" w:space="0" w:color="auto"/>
+              <w:end w:val="nil"/>
+            </w:tcBorders>
           </w:tcPr>
           <w:p>
             <w:pPr>
@@ -11248,9 +12447,14 @@
     </w:p>
     <w:tbl>
       <w:tblPr>
-        <w:tblStyle w:val="TableGrid"/>
         <w:tblW w:type="auto" w:w="0"/>
         <w:tblLook w:firstColumn="1" w:firstRow="1" w:lastColumn="0" w:lastRow="0" w:noHBand="0" w:noVBand="1" w:val="04A0"/>
+        <w:tblBorders>
+          <w:left w:val="nil"/>
+          <w:right w:val="nil"/>
+          <w:start w:val="nil"/>
+          <w:end w:val="nil"/>
+        </w:tblBorders>
       </w:tblPr>
       <w:tblGrid>
         <w:gridCol w:w="1728"/>
@@ -11264,6 +12468,14 @@
           <w:tcPr>
             <w:tcW w:type="dxa" w:w="1728"/>
             <w:vAlign w:val="center"/>
+            <w:tcBorders>
+              <w:top w:val="single" w:sz="4" w:space="0" w:color="auto"/>
+              <w:bottom w:val="single" w:sz="4" w:space="0" w:color="auto"/>
+              <w:left w:val="nil"/>
+              <w:right w:val="single" w:sz="4" w:space="0" w:color="auto"/>
+              <w:start w:val="nil"/>
+              <w:end w:val="single" w:sz="4" w:space="0" w:color="auto"/>
+            </w:tcBorders>
           </w:tcPr>
           <w:p>
             <w:pPr>
@@ -11284,6 +12496,14 @@
           <w:tcPr>
             <w:tcW w:type="dxa" w:w="1728"/>
             <w:vAlign w:val="center"/>
+            <w:tcBorders>
+              <w:top w:val="single" w:sz="4" w:space="0" w:color="auto"/>
+              <w:bottom w:val="single" w:sz="4" w:space="0" w:color="auto"/>
+              <w:left w:val="single" w:sz="4" w:space="0" w:color="auto"/>
+              <w:right w:val="single" w:sz="4" w:space="0" w:color="auto"/>
+              <w:start w:val="single" w:sz="4" w:space="0" w:color="auto"/>
+              <w:end w:val="single" w:sz="4" w:space="0" w:color="auto"/>
+            </w:tcBorders>
           </w:tcPr>
           <w:p>
             <w:pPr>
@@ -11304,6 +12524,14 @@
           <w:tcPr>
             <w:tcW w:type="dxa" w:w="1728"/>
             <w:vAlign w:val="center"/>
+            <w:tcBorders>
+              <w:top w:val="single" w:sz="4" w:space="0" w:color="auto"/>
+              <w:bottom w:val="single" w:sz="4" w:space="0" w:color="auto"/>
+              <w:left w:val="single" w:sz="4" w:space="0" w:color="auto"/>
+              <w:right w:val="single" w:sz="4" w:space="0" w:color="auto"/>
+              <w:start w:val="single" w:sz="4" w:space="0" w:color="auto"/>
+              <w:end w:val="single" w:sz="4" w:space="0" w:color="auto"/>
+            </w:tcBorders>
           </w:tcPr>
           <w:p>
             <w:pPr>
@@ -11324,6 +12552,14 @@
           <w:tcPr>
             <w:tcW w:type="dxa" w:w="1728"/>
             <w:vAlign w:val="center"/>
+            <w:tcBorders>
+              <w:top w:val="single" w:sz="4" w:space="0" w:color="auto"/>
+              <w:bottom w:val="single" w:sz="4" w:space="0" w:color="auto"/>
+              <w:left w:val="single" w:sz="4" w:space="0" w:color="auto"/>
+              <w:right w:val="single" w:sz="4" w:space="0" w:color="auto"/>
+              <w:start w:val="single" w:sz="4" w:space="0" w:color="auto"/>
+              <w:end w:val="single" w:sz="4" w:space="0" w:color="auto"/>
+            </w:tcBorders>
           </w:tcPr>
           <w:p>
             <w:pPr>
@@ -11344,6 +12580,14 @@
           <w:tcPr>
             <w:tcW w:type="dxa" w:w="1728"/>
             <w:vAlign w:val="center"/>
+            <w:tcBorders>
+              <w:top w:val="single" w:sz="4" w:space="0" w:color="auto"/>
+              <w:bottom w:val="single" w:sz="4" w:space="0" w:color="auto"/>
+              <w:left w:val="single" w:sz="4" w:space="0" w:color="auto"/>
+              <w:right w:val="nil"/>
+              <w:start w:val="single" w:sz="4" w:space="0" w:color="auto"/>
+              <w:end w:val="nil"/>
+            </w:tcBorders>
           </w:tcPr>
           <w:p>
             <w:pPr>
@@ -11366,6 +12610,14 @@
           <w:tcPr>
             <w:tcW w:type="dxa" w:w="1728"/>
             <w:vAlign w:val="center"/>
+            <w:tcBorders>
+              <w:top w:val="single" w:sz="4" w:space="0" w:color="auto"/>
+              <w:bottom w:val="single" w:sz="4" w:space="0" w:color="auto"/>
+              <w:left w:val="nil"/>
+              <w:right w:val="single" w:sz="4" w:space="0" w:color="auto"/>
+              <w:start w:val="nil"/>
+              <w:end w:val="single" w:sz="4" w:space="0" w:color="auto"/>
+            </w:tcBorders>
           </w:tcPr>
           <w:p>
             <w:pPr>
@@ -11386,6 +12638,14 @@
           <w:tcPr>
             <w:tcW w:type="dxa" w:w="1728"/>
             <w:vAlign w:val="center"/>
+            <w:tcBorders>
+              <w:top w:val="single" w:sz="4" w:space="0" w:color="auto"/>
+              <w:bottom w:val="single" w:sz="4" w:space="0" w:color="auto"/>
+              <w:left w:val="single" w:sz="4" w:space="0" w:color="auto"/>
+              <w:right w:val="single" w:sz="4" w:space="0" w:color="auto"/>
+              <w:start w:val="single" w:sz="4" w:space="0" w:color="auto"/>
+              <w:end w:val="single" w:sz="4" w:space="0" w:color="auto"/>
+            </w:tcBorders>
           </w:tcPr>
           <w:p>
             <w:pPr>
@@ -11406,6 +12666,14 @@
           <w:tcPr>
             <w:tcW w:type="dxa" w:w="1728"/>
             <w:vAlign w:val="center"/>
+            <w:tcBorders>
+              <w:top w:val="single" w:sz="4" w:space="0" w:color="auto"/>
+              <w:bottom w:val="single" w:sz="4" w:space="0" w:color="auto"/>
+              <w:left w:val="single" w:sz="4" w:space="0" w:color="auto"/>
+              <w:right w:val="single" w:sz="4" w:space="0" w:color="auto"/>
+              <w:start w:val="single" w:sz="4" w:space="0" w:color="auto"/>
+              <w:end w:val="single" w:sz="4" w:space="0" w:color="auto"/>
+            </w:tcBorders>
           </w:tcPr>
           <w:p>
             <w:pPr>
@@ -11426,6 +12694,14 @@
           <w:tcPr>
             <w:tcW w:type="dxa" w:w="1728"/>
             <w:vAlign w:val="center"/>
+            <w:tcBorders>
+              <w:top w:val="single" w:sz="4" w:space="0" w:color="auto"/>
+              <w:bottom w:val="single" w:sz="4" w:space="0" w:color="auto"/>
+              <w:left w:val="single" w:sz="4" w:space="0" w:color="auto"/>
+              <w:right w:val="single" w:sz="4" w:space="0" w:color="auto"/>
+              <w:start w:val="single" w:sz="4" w:space="0" w:color="auto"/>
+              <w:end w:val="single" w:sz="4" w:space="0" w:color="auto"/>
+            </w:tcBorders>
           </w:tcPr>
           <w:p>
             <w:pPr>
@@ -11446,6 +12722,14 @@
           <w:tcPr>
             <w:tcW w:type="dxa" w:w="1728"/>
             <w:vAlign w:val="center"/>
+            <w:tcBorders>
+              <w:top w:val="single" w:sz="4" w:space="0" w:color="auto"/>
+              <w:bottom w:val="single" w:sz="4" w:space="0" w:color="auto"/>
+              <w:left w:val="single" w:sz="4" w:space="0" w:color="auto"/>
+              <w:right w:val="nil"/>
+              <w:start w:val="single" w:sz="4" w:space="0" w:color="auto"/>
+              <w:end w:val="nil"/>
+            </w:tcBorders>
           </w:tcPr>
           <w:p>
             <w:pPr>
@@ -11468,6 +12752,14 @@
           <w:tcPr>
             <w:tcW w:type="dxa" w:w="1728"/>
             <w:vAlign w:val="center"/>
+            <w:tcBorders>
+              <w:top w:val="single" w:sz="4" w:space="0" w:color="auto"/>
+              <w:bottom w:val="single" w:sz="4" w:space="0" w:color="auto"/>
+              <w:left w:val="nil"/>
+              <w:right w:val="single" w:sz="4" w:space="0" w:color="auto"/>
+              <w:start w:val="nil"/>
+              <w:end w:val="single" w:sz="4" w:space="0" w:color="auto"/>
+            </w:tcBorders>
           </w:tcPr>
           <w:p>
             <w:pPr>
@@ -11488,6 +12780,14 @@
           <w:tcPr>
             <w:tcW w:type="dxa" w:w="1728"/>
             <w:vAlign w:val="center"/>
+            <w:tcBorders>
+              <w:top w:val="single" w:sz="4" w:space="0" w:color="auto"/>
+              <w:bottom w:val="single" w:sz="4" w:space="0" w:color="auto"/>
+              <w:left w:val="single" w:sz="4" w:space="0" w:color="auto"/>
+              <w:right w:val="single" w:sz="4" w:space="0" w:color="auto"/>
+              <w:start w:val="single" w:sz="4" w:space="0" w:color="auto"/>
+              <w:end w:val="single" w:sz="4" w:space="0" w:color="auto"/>
+            </w:tcBorders>
           </w:tcPr>
           <w:p>
             <w:pPr>
@@ -11508,6 +12808,14 @@
           <w:tcPr>
             <w:tcW w:type="dxa" w:w="1728"/>
             <w:vAlign w:val="center"/>
+            <w:tcBorders>
+              <w:top w:val="single" w:sz="4" w:space="0" w:color="auto"/>
+              <w:bottom w:val="single" w:sz="4" w:space="0" w:color="auto"/>
+              <w:left w:val="single" w:sz="4" w:space="0" w:color="auto"/>
+              <w:right w:val="single" w:sz="4" w:space="0" w:color="auto"/>
+              <w:start w:val="single" w:sz="4" w:space="0" w:color="auto"/>
+              <w:end w:val="single" w:sz="4" w:space="0" w:color="auto"/>
+            </w:tcBorders>
           </w:tcPr>
           <w:p>
             <w:pPr>
@@ -11528,6 +12836,14 @@
           <w:tcPr>
             <w:tcW w:type="dxa" w:w="1728"/>
             <w:vAlign w:val="center"/>
+            <w:tcBorders>
+              <w:top w:val="single" w:sz="4" w:space="0" w:color="auto"/>
+              <w:bottom w:val="single" w:sz="4" w:space="0" w:color="auto"/>
+              <w:left w:val="single" w:sz="4" w:space="0" w:color="auto"/>
+              <w:right w:val="single" w:sz="4" w:space="0" w:color="auto"/>
+              <w:start w:val="single" w:sz="4" w:space="0" w:color="auto"/>
+              <w:end w:val="single" w:sz="4" w:space="0" w:color="auto"/>
+            </w:tcBorders>
           </w:tcPr>
           <w:p>
             <w:pPr>
@@ -11548,6 +12864,14 @@
           <w:tcPr>
             <w:tcW w:type="dxa" w:w="1728"/>
             <w:vAlign w:val="center"/>
+            <w:tcBorders>
+              <w:top w:val="single" w:sz="4" w:space="0" w:color="auto"/>
+              <w:bottom w:val="single" w:sz="4" w:space="0" w:color="auto"/>
+              <w:left w:val="single" w:sz="4" w:space="0" w:color="auto"/>
+              <w:right w:val="nil"/>
+              <w:start w:val="single" w:sz="4" w:space="0" w:color="auto"/>
+              <w:end w:val="nil"/>
+            </w:tcBorders>
           </w:tcPr>
           <w:p>
             <w:pPr>
@@ -11570,6 +12894,14 @@
           <w:tcPr>
             <w:tcW w:type="dxa" w:w="1728"/>
             <w:vAlign w:val="center"/>
+            <w:tcBorders>
+              <w:top w:val="single" w:sz="4" w:space="0" w:color="auto"/>
+              <w:bottom w:val="single" w:sz="4" w:space="0" w:color="auto"/>
+              <w:left w:val="nil"/>
+              <w:right w:val="single" w:sz="4" w:space="0" w:color="auto"/>
+              <w:start w:val="nil"/>
+              <w:end w:val="single" w:sz="4" w:space="0" w:color="auto"/>
+            </w:tcBorders>
           </w:tcPr>
           <w:p>
             <w:pPr>
@@ -11590,6 +12922,14 @@
           <w:tcPr>
             <w:tcW w:type="dxa" w:w="1728"/>
             <w:vAlign w:val="center"/>
+            <w:tcBorders>
+              <w:top w:val="single" w:sz="4" w:space="0" w:color="auto"/>
+              <w:bottom w:val="single" w:sz="4" w:space="0" w:color="auto"/>
+              <w:left w:val="single" w:sz="4" w:space="0" w:color="auto"/>
+              <w:right w:val="single" w:sz="4" w:space="0" w:color="auto"/>
+              <w:start w:val="single" w:sz="4" w:space="0" w:color="auto"/>
+              <w:end w:val="single" w:sz="4" w:space="0" w:color="auto"/>
+            </w:tcBorders>
           </w:tcPr>
           <w:p>
             <w:pPr>
@@ -11610,6 +12950,14 @@
           <w:tcPr>
             <w:tcW w:type="dxa" w:w="1728"/>
             <w:vAlign w:val="center"/>
+            <w:tcBorders>
+              <w:top w:val="single" w:sz="4" w:space="0" w:color="auto"/>
+              <w:bottom w:val="single" w:sz="4" w:space="0" w:color="auto"/>
+              <w:left w:val="single" w:sz="4" w:space="0" w:color="auto"/>
+              <w:right w:val="single" w:sz="4" w:space="0" w:color="auto"/>
+              <w:start w:val="single" w:sz="4" w:space="0" w:color="auto"/>
+              <w:end w:val="single" w:sz="4" w:space="0" w:color="auto"/>
+            </w:tcBorders>
           </w:tcPr>
           <w:p>
             <w:pPr>
@@ -11630,6 +12978,14 @@
           <w:tcPr>
             <w:tcW w:type="dxa" w:w="1728"/>
             <w:vAlign w:val="center"/>
+            <w:tcBorders>
+              <w:top w:val="single" w:sz="4" w:space="0" w:color="auto"/>
+              <w:bottom w:val="single" w:sz="4" w:space="0" w:color="auto"/>
+              <w:left w:val="single" w:sz="4" w:space="0" w:color="auto"/>
+              <w:right w:val="single" w:sz="4" w:space="0" w:color="auto"/>
+              <w:start w:val="single" w:sz="4" w:space="0" w:color="auto"/>
+              <w:end w:val="single" w:sz="4" w:space="0" w:color="auto"/>
+            </w:tcBorders>
           </w:tcPr>
           <w:p>
             <w:pPr>
@@ -11650,6 +13006,14 @@
           <w:tcPr>
             <w:tcW w:type="dxa" w:w="1728"/>
             <w:vAlign w:val="center"/>
+            <w:tcBorders>
+              <w:top w:val="single" w:sz="4" w:space="0" w:color="auto"/>
+              <w:bottom w:val="single" w:sz="4" w:space="0" w:color="auto"/>
+              <w:left w:val="single" w:sz="4" w:space="0" w:color="auto"/>
+              <w:right w:val="nil"/>
+              <w:start w:val="single" w:sz="4" w:space="0" w:color="auto"/>
+              <w:end w:val="nil"/>
+            </w:tcBorders>
           </w:tcPr>
           <w:p>
             <w:pPr>
@@ -11698,9 +13062,14 @@
     </w:p>
     <w:tbl>
       <w:tblPr>
-        <w:tblStyle w:val="TableGrid"/>
         <w:tblW w:type="auto" w:w="0"/>
         <w:tblLook w:firstColumn="1" w:firstRow="1" w:lastColumn="0" w:lastRow="0" w:noHBand="0" w:noVBand="1" w:val="04A0"/>
+        <w:tblBorders>
+          <w:left w:val="nil"/>
+          <w:right w:val="nil"/>
+          <w:start w:val="nil"/>
+          <w:end w:val="nil"/>
+        </w:tblBorders>
       </w:tblPr>
       <w:tblGrid>
         <w:gridCol w:w="1728"/>
@@ -11714,6 +13083,14 @@
           <w:tcPr>
             <w:tcW w:type="dxa" w:w="1728"/>
             <w:vAlign w:val="center"/>
+            <w:tcBorders>
+              <w:top w:val="single" w:sz="4" w:space="0" w:color="auto"/>
+              <w:bottom w:val="single" w:sz="4" w:space="0" w:color="auto"/>
+              <w:left w:val="nil"/>
+              <w:right w:val="single" w:sz="4" w:space="0" w:color="auto"/>
+              <w:start w:val="nil"/>
+              <w:end w:val="single" w:sz="4" w:space="0" w:color="auto"/>
+            </w:tcBorders>
           </w:tcPr>
           <w:p>
             <w:pPr>
@@ -11734,6 +13111,14 @@
           <w:tcPr>
             <w:tcW w:type="dxa" w:w="1728"/>
             <w:vAlign w:val="center"/>
+            <w:tcBorders>
+              <w:top w:val="single" w:sz="4" w:space="0" w:color="auto"/>
+              <w:bottom w:val="single" w:sz="4" w:space="0" w:color="auto"/>
+              <w:left w:val="single" w:sz="4" w:space="0" w:color="auto"/>
+              <w:right w:val="single" w:sz="4" w:space="0" w:color="auto"/>
+              <w:start w:val="single" w:sz="4" w:space="0" w:color="auto"/>
+              <w:end w:val="single" w:sz="4" w:space="0" w:color="auto"/>
+            </w:tcBorders>
           </w:tcPr>
           <w:p>
             <w:pPr>
@@ -11754,6 +13139,14 @@
           <w:tcPr>
             <w:tcW w:type="dxa" w:w="1728"/>
             <w:vAlign w:val="center"/>
+            <w:tcBorders>
+              <w:top w:val="single" w:sz="4" w:space="0" w:color="auto"/>
+              <w:bottom w:val="single" w:sz="4" w:space="0" w:color="auto"/>
+              <w:left w:val="single" w:sz="4" w:space="0" w:color="auto"/>
+              <w:right w:val="single" w:sz="4" w:space="0" w:color="auto"/>
+              <w:start w:val="single" w:sz="4" w:space="0" w:color="auto"/>
+              <w:end w:val="single" w:sz="4" w:space="0" w:color="auto"/>
+            </w:tcBorders>
           </w:tcPr>
           <w:p>
             <w:pPr>
@@ -11774,6 +13167,14 @@
           <w:tcPr>
             <w:tcW w:type="dxa" w:w="1728"/>
             <w:vAlign w:val="center"/>
+            <w:tcBorders>
+              <w:top w:val="single" w:sz="4" w:space="0" w:color="auto"/>
+              <w:bottom w:val="single" w:sz="4" w:space="0" w:color="auto"/>
+              <w:left w:val="single" w:sz="4" w:space="0" w:color="auto"/>
+              <w:right w:val="single" w:sz="4" w:space="0" w:color="auto"/>
+              <w:start w:val="single" w:sz="4" w:space="0" w:color="auto"/>
+              <w:end w:val="single" w:sz="4" w:space="0" w:color="auto"/>
+            </w:tcBorders>
           </w:tcPr>
           <w:p>
             <w:pPr>
@@ -11794,6 +13195,14 @@
           <w:tcPr>
             <w:tcW w:type="dxa" w:w="1728"/>
             <w:vAlign w:val="center"/>
+            <w:tcBorders>
+              <w:top w:val="single" w:sz="4" w:space="0" w:color="auto"/>
+              <w:bottom w:val="single" w:sz="4" w:space="0" w:color="auto"/>
+              <w:left w:val="single" w:sz="4" w:space="0" w:color="auto"/>
+              <w:right w:val="nil"/>
+              <w:start w:val="single" w:sz="4" w:space="0" w:color="auto"/>
+              <w:end w:val="nil"/>
+            </w:tcBorders>
           </w:tcPr>
           <w:p>
             <w:pPr>
@@ -11816,6 +13225,14 @@
           <w:tcPr>
             <w:tcW w:type="dxa" w:w="1728"/>
             <w:vAlign w:val="center"/>
+            <w:tcBorders>
+              <w:top w:val="single" w:sz="4" w:space="0" w:color="auto"/>
+              <w:bottom w:val="single" w:sz="4" w:space="0" w:color="auto"/>
+              <w:left w:val="nil"/>
+              <w:right w:val="single" w:sz="4" w:space="0" w:color="auto"/>
+              <w:start w:val="nil"/>
+              <w:end w:val="single" w:sz="4" w:space="0" w:color="auto"/>
+            </w:tcBorders>
           </w:tcPr>
           <w:p>
             <w:pPr>
@@ -11836,6 +13253,14 @@
           <w:tcPr>
             <w:tcW w:type="dxa" w:w="1728"/>
             <w:vAlign w:val="center"/>
+            <w:tcBorders>
+              <w:top w:val="single" w:sz="4" w:space="0" w:color="auto"/>
+              <w:bottom w:val="single" w:sz="4" w:space="0" w:color="auto"/>
+              <w:left w:val="single" w:sz="4" w:space="0" w:color="auto"/>
+              <w:right w:val="single" w:sz="4" w:space="0" w:color="auto"/>
+              <w:start w:val="single" w:sz="4" w:space="0" w:color="auto"/>
+              <w:end w:val="single" w:sz="4" w:space="0" w:color="auto"/>
+            </w:tcBorders>
           </w:tcPr>
           <w:p>
             <w:pPr>
@@ -11856,6 +13281,14 @@
           <w:tcPr>
             <w:tcW w:type="dxa" w:w="1728"/>
             <w:vAlign w:val="center"/>
+            <w:tcBorders>
+              <w:top w:val="single" w:sz="4" w:space="0" w:color="auto"/>
+              <w:bottom w:val="single" w:sz="4" w:space="0" w:color="auto"/>
+              <w:left w:val="single" w:sz="4" w:space="0" w:color="auto"/>
+              <w:right w:val="single" w:sz="4" w:space="0" w:color="auto"/>
+              <w:start w:val="single" w:sz="4" w:space="0" w:color="auto"/>
+              <w:end w:val="single" w:sz="4" w:space="0" w:color="auto"/>
+            </w:tcBorders>
           </w:tcPr>
           <w:p>
             <w:pPr>
@@ -11876,6 +13309,14 @@
           <w:tcPr>
             <w:tcW w:type="dxa" w:w="1728"/>
             <w:vAlign w:val="center"/>
+            <w:tcBorders>
+              <w:top w:val="single" w:sz="4" w:space="0" w:color="auto"/>
+              <w:bottom w:val="single" w:sz="4" w:space="0" w:color="auto"/>
+              <w:left w:val="single" w:sz="4" w:space="0" w:color="auto"/>
+              <w:right w:val="single" w:sz="4" w:space="0" w:color="auto"/>
+              <w:start w:val="single" w:sz="4" w:space="0" w:color="auto"/>
+              <w:end w:val="single" w:sz="4" w:space="0" w:color="auto"/>
+            </w:tcBorders>
           </w:tcPr>
           <w:p>
             <w:pPr>
@@ -11896,6 +13337,14 @@
           <w:tcPr>
             <w:tcW w:type="dxa" w:w="1728"/>
             <w:vAlign w:val="center"/>
+            <w:tcBorders>
+              <w:top w:val="single" w:sz="4" w:space="0" w:color="auto"/>
+              <w:bottom w:val="single" w:sz="4" w:space="0" w:color="auto"/>
+              <w:left w:val="single" w:sz="4" w:space="0" w:color="auto"/>
+              <w:right w:val="nil"/>
+              <w:start w:val="single" w:sz="4" w:space="0" w:color="auto"/>
+              <w:end w:val="nil"/>
+            </w:tcBorders>
           </w:tcPr>
           <w:p>
             <w:pPr>
@@ -11918,6 +13367,14 @@
           <w:tcPr>
             <w:tcW w:type="dxa" w:w="1728"/>
             <w:vAlign w:val="center"/>
+            <w:tcBorders>
+              <w:top w:val="single" w:sz="4" w:space="0" w:color="auto"/>
+              <w:bottom w:val="single" w:sz="4" w:space="0" w:color="auto"/>
+              <w:left w:val="nil"/>
+              <w:right w:val="single" w:sz="4" w:space="0" w:color="auto"/>
+              <w:start w:val="nil"/>
+              <w:end w:val="single" w:sz="4" w:space="0" w:color="auto"/>
+            </w:tcBorders>
           </w:tcPr>
           <w:p>
             <w:pPr>
@@ -11938,6 +13395,14 @@
           <w:tcPr>
             <w:tcW w:type="dxa" w:w="1728"/>
             <w:vAlign w:val="center"/>
+            <w:tcBorders>
+              <w:top w:val="single" w:sz="4" w:space="0" w:color="auto"/>
+              <w:bottom w:val="single" w:sz="4" w:space="0" w:color="auto"/>
+              <w:left w:val="single" w:sz="4" w:space="0" w:color="auto"/>
+              <w:right w:val="single" w:sz="4" w:space="0" w:color="auto"/>
+              <w:start w:val="single" w:sz="4" w:space="0" w:color="auto"/>
+              <w:end w:val="single" w:sz="4" w:space="0" w:color="auto"/>
+            </w:tcBorders>
           </w:tcPr>
           <w:p>
             <w:pPr>
@@ -11958,6 +13423,14 @@
           <w:tcPr>
             <w:tcW w:type="dxa" w:w="1728"/>
             <w:vAlign w:val="center"/>
+            <w:tcBorders>
+              <w:top w:val="single" w:sz="4" w:space="0" w:color="auto"/>
+              <w:bottom w:val="single" w:sz="4" w:space="0" w:color="auto"/>
+              <w:left w:val="single" w:sz="4" w:space="0" w:color="auto"/>
+              <w:right w:val="single" w:sz="4" w:space="0" w:color="auto"/>
+              <w:start w:val="single" w:sz="4" w:space="0" w:color="auto"/>
+              <w:end w:val="single" w:sz="4" w:space="0" w:color="auto"/>
+            </w:tcBorders>
           </w:tcPr>
           <w:p>
             <w:pPr>
@@ -11978,6 +13451,14 @@
           <w:tcPr>
             <w:tcW w:type="dxa" w:w="1728"/>
             <w:vAlign w:val="center"/>
+            <w:tcBorders>
+              <w:top w:val="single" w:sz="4" w:space="0" w:color="auto"/>
+              <w:bottom w:val="single" w:sz="4" w:space="0" w:color="auto"/>
+              <w:left w:val="single" w:sz="4" w:space="0" w:color="auto"/>
+              <w:right w:val="single" w:sz="4" w:space="0" w:color="auto"/>
+              <w:start w:val="single" w:sz="4" w:space="0" w:color="auto"/>
+              <w:end w:val="single" w:sz="4" w:space="0" w:color="auto"/>
+            </w:tcBorders>
           </w:tcPr>
           <w:p>
             <w:pPr>
@@ -11998,6 +13479,14 @@
           <w:tcPr>
             <w:tcW w:type="dxa" w:w="1728"/>
             <w:vAlign w:val="center"/>
+            <w:tcBorders>
+              <w:top w:val="single" w:sz="4" w:space="0" w:color="auto"/>
+              <w:bottom w:val="single" w:sz="4" w:space="0" w:color="auto"/>
+              <w:left w:val="single" w:sz="4" w:space="0" w:color="auto"/>
+              <w:right w:val="nil"/>
+              <w:start w:val="single" w:sz="4" w:space="0" w:color="auto"/>
+              <w:end w:val="nil"/>
+            </w:tcBorders>
           </w:tcPr>
           <w:p>
             <w:pPr>
@@ -12020,6 +13509,14 @@
           <w:tcPr>
             <w:tcW w:type="dxa" w:w="1728"/>
             <w:vAlign w:val="center"/>
+            <w:tcBorders>
+              <w:top w:val="single" w:sz="4" w:space="0" w:color="auto"/>
+              <w:bottom w:val="single" w:sz="4" w:space="0" w:color="auto"/>
+              <w:left w:val="nil"/>
+              <w:right w:val="single" w:sz="4" w:space="0" w:color="auto"/>
+              <w:start w:val="nil"/>
+              <w:end w:val="single" w:sz="4" w:space="0" w:color="auto"/>
+            </w:tcBorders>
           </w:tcPr>
           <w:p>
             <w:pPr>
@@ -12040,6 +13537,14 @@
           <w:tcPr>
             <w:tcW w:type="dxa" w:w="1728"/>
             <w:vAlign w:val="center"/>
+            <w:tcBorders>
+              <w:top w:val="single" w:sz="4" w:space="0" w:color="auto"/>
+              <w:bottom w:val="single" w:sz="4" w:space="0" w:color="auto"/>
+              <w:left w:val="single" w:sz="4" w:space="0" w:color="auto"/>
+              <w:right w:val="single" w:sz="4" w:space="0" w:color="auto"/>
+              <w:start w:val="single" w:sz="4" w:space="0" w:color="auto"/>
+              <w:end w:val="single" w:sz="4" w:space="0" w:color="auto"/>
+            </w:tcBorders>
           </w:tcPr>
           <w:p>
             <w:pPr>
@@ -12060,6 +13565,14 @@
           <w:tcPr>
             <w:tcW w:type="dxa" w:w="1728"/>
             <w:vAlign w:val="center"/>
+            <w:tcBorders>
+              <w:top w:val="single" w:sz="4" w:space="0" w:color="auto"/>
+              <w:bottom w:val="single" w:sz="4" w:space="0" w:color="auto"/>
+              <w:left w:val="single" w:sz="4" w:space="0" w:color="auto"/>
+              <w:right w:val="single" w:sz="4" w:space="0" w:color="auto"/>
+              <w:start w:val="single" w:sz="4" w:space="0" w:color="auto"/>
+              <w:end w:val="single" w:sz="4" w:space="0" w:color="auto"/>
+            </w:tcBorders>
           </w:tcPr>
           <w:p>
             <w:pPr>
@@ -12080,6 +13593,14 @@
           <w:tcPr>
             <w:tcW w:type="dxa" w:w="1728"/>
             <w:vAlign w:val="center"/>
+            <w:tcBorders>
+              <w:top w:val="single" w:sz="4" w:space="0" w:color="auto"/>
+              <w:bottom w:val="single" w:sz="4" w:space="0" w:color="auto"/>
+              <w:left w:val="single" w:sz="4" w:space="0" w:color="auto"/>
+              <w:right w:val="single" w:sz="4" w:space="0" w:color="auto"/>
+              <w:start w:val="single" w:sz="4" w:space="0" w:color="auto"/>
+              <w:end w:val="single" w:sz="4" w:space="0" w:color="auto"/>
+            </w:tcBorders>
           </w:tcPr>
           <w:p>
             <w:pPr>
@@ -12100,6 +13621,14 @@
           <w:tcPr>
             <w:tcW w:type="dxa" w:w="1728"/>
             <w:vAlign w:val="center"/>
+            <w:tcBorders>
+              <w:top w:val="single" w:sz="4" w:space="0" w:color="auto"/>
+              <w:bottom w:val="single" w:sz="4" w:space="0" w:color="auto"/>
+              <w:left w:val="single" w:sz="4" w:space="0" w:color="auto"/>
+              <w:right w:val="nil"/>
+              <w:start w:val="single" w:sz="4" w:space="0" w:color="auto"/>
+              <w:end w:val="nil"/>
+            </w:tcBorders>
           </w:tcPr>
           <w:p>
             <w:pPr>
@@ -12148,9 +13677,14 @@
     </w:p>
     <w:tbl>
       <w:tblPr>
-        <w:tblStyle w:val="TableGrid"/>
         <w:tblW w:type="auto" w:w="0"/>
         <w:tblLook w:firstColumn="1" w:firstRow="1" w:lastColumn="0" w:lastRow="0" w:noHBand="0" w:noVBand="1" w:val="04A0"/>
+        <w:tblBorders>
+          <w:left w:val="nil"/>
+          <w:right w:val="nil"/>
+          <w:start w:val="nil"/>
+          <w:end w:val="nil"/>
+        </w:tblBorders>
       </w:tblPr>
       <w:tblGrid>
         <w:gridCol w:w="1728"/>
@@ -12164,6 +13698,14 @@
           <w:tcPr>
             <w:tcW w:type="dxa" w:w="1728"/>
             <w:vAlign w:val="center"/>
+            <w:tcBorders>
+              <w:top w:val="single" w:sz="4" w:space="0" w:color="auto"/>
+              <w:bottom w:val="single" w:sz="4" w:space="0" w:color="auto"/>
+              <w:left w:val="nil"/>
+              <w:right w:val="single" w:sz="4" w:space="0" w:color="auto"/>
+              <w:start w:val="nil"/>
+              <w:end w:val="single" w:sz="4" w:space="0" w:color="auto"/>
+            </w:tcBorders>
           </w:tcPr>
           <w:p>
             <w:pPr>
@@ -12184,6 +13726,14 @@
           <w:tcPr>
             <w:tcW w:type="dxa" w:w="1728"/>
             <w:vAlign w:val="center"/>
+            <w:tcBorders>
+              <w:top w:val="single" w:sz="4" w:space="0" w:color="auto"/>
+              <w:bottom w:val="single" w:sz="4" w:space="0" w:color="auto"/>
+              <w:left w:val="single" w:sz="4" w:space="0" w:color="auto"/>
+              <w:right w:val="single" w:sz="4" w:space="0" w:color="auto"/>
+              <w:start w:val="single" w:sz="4" w:space="0" w:color="auto"/>
+              <w:end w:val="single" w:sz="4" w:space="0" w:color="auto"/>
+            </w:tcBorders>
           </w:tcPr>
           <w:p>
             <w:pPr>
@@ -12204,6 +13754,14 @@
           <w:tcPr>
             <w:tcW w:type="dxa" w:w="1728"/>
             <w:vAlign w:val="center"/>
+            <w:tcBorders>
+              <w:top w:val="single" w:sz="4" w:space="0" w:color="auto"/>
+              <w:bottom w:val="single" w:sz="4" w:space="0" w:color="auto"/>
+              <w:left w:val="single" w:sz="4" w:space="0" w:color="auto"/>
+              <w:right w:val="single" w:sz="4" w:space="0" w:color="auto"/>
+              <w:start w:val="single" w:sz="4" w:space="0" w:color="auto"/>
+              <w:end w:val="single" w:sz="4" w:space="0" w:color="auto"/>
+            </w:tcBorders>
           </w:tcPr>
           <w:p>
             <w:pPr>
@@ -12224,6 +13782,14 @@
           <w:tcPr>
             <w:tcW w:type="dxa" w:w="1728"/>
             <w:vAlign w:val="center"/>
+            <w:tcBorders>
+              <w:top w:val="single" w:sz="4" w:space="0" w:color="auto"/>
+              <w:bottom w:val="single" w:sz="4" w:space="0" w:color="auto"/>
+              <w:left w:val="single" w:sz="4" w:space="0" w:color="auto"/>
+              <w:right w:val="single" w:sz="4" w:space="0" w:color="auto"/>
+              <w:start w:val="single" w:sz="4" w:space="0" w:color="auto"/>
+              <w:end w:val="single" w:sz="4" w:space="0" w:color="auto"/>
+            </w:tcBorders>
           </w:tcPr>
           <w:p>
             <w:pPr>
@@ -12244,6 +13810,14 @@
           <w:tcPr>
             <w:tcW w:type="dxa" w:w="1728"/>
             <w:vAlign w:val="center"/>
+            <w:tcBorders>
+              <w:top w:val="single" w:sz="4" w:space="0" w:color="auto"/>
+              <w:bottom w:val="single" w:sz="4" w:space="0" w:color="auto"/>
+              <w:left w:val="single" w:sz="4" w:space="0" w:color="auto"/>
+              <w:right w:val="nil"/>
+              <w:start w:val="single" w:sz="4" w:space="0" w:color="auto"/>
+              <w:end w:val="nil"/>
+            </w:tcBorders>
           </w:tcPr>
           <w:p>
             <w:pPr>
@@ -12266,6 +13840,14 @@
           <w:tcPr>
             <w:tcW w:type="dxa" w:w="1728"/>
             <w:vAlign w:val="center"/>
+            <w:tcBorders>
+              <w:top w:val="single" w:sz="4" w:space="0" w:color="auto"/>
+              <w:bottom w:val="single" w:sz="4" w:space="0" w:color="auto"/>
+              <w:left w:val="nil"/>
+              <w:right w:val="single" w:sz="4" w:space="0" w:color="auto"/>
+              <w:start w:val="nil"/>
+              <w:end w:val="single" w:sz="4" w:space="0" w:color="auto"/>
+            </w:tcBorders>
           </w:tcPr>
           <w:p>
             <w:pPr>
@@ -12286,6 +13868,14 @@
           <w:tcPr>
             <w:tcW w:type="dxa" w:w="1728"/>
             <w:vAlign w:val="center"/>
+            <w:tcBorders>
+              <w:top w:val="single" w:sz="4" w:space="0" w:color="auto"/>
+              <w:bottom w:val="single" w:sz="4" w:space="0" w:color="auto"/>
+              <w:left w:val="single" w:sz="4" w:space="0" w:color="auto"/>
+              <w:right w:val="single" w:sz="4" w:space="0" w:color="auto"/>
+              <w:start w:val="single" w:sz="4" w:space="0" w:color="auto"/>
+              <w:end w:val="single" w:sz="4" w:space="0" w:color="auto"/>
+            </w:tcBorders>
           </w:tcPr>
           <w:p>
             <w:pPr>
@@ -12306,6 +13896,14 @@
           <w:tcPr>
             <w:tcW w:type="dxa" w:w="1728"/>
             <w:vAlign w:val="center"/>
+            <w:tcBorders>
+              <w:top w:val="single" w:sz="4" w:space="0" w:color="auto"/>
+              <w:bottom w:val="single" w:sz="4" w:space="0" w:color="auto"/>
+              <w:left w:val="single" w:sz="4" w:space="0" w:color="auto"/>
+              <w:right w:val="single" w:sz="4" w:space="0" w:color="auto"/>
+              <w:start w:val="single" w:sz="4" w:space="0" w:color="auto"/>
+              <w:end w:val="single" w:sz="4" w:space="0" w:color="auto"/>
+            </w:tcBorders>
           </w:tcPr>
           <w:p>
             <w:pPr>
@@ -12326,6 +13924,14 @@
           <w:tcPr>
             <w:tcW w:type="dxa" w:w="1728"/>
             <w:vAlign w:val="center"/>
+            <w:tcBorders>
+              <w:top w:val="single" w:sz="4" w:space="0" w:color="auto"/>
+              <w:bottom w:val="single" w:sz="4" w:space="0" w:color="auto"/>
+              <w:left w:val="single" w:sz="4" w:space="0" w:color="auto"/>
+              <w:right w:val="single" w:sz="4" w:space="0" w:color="auto"/>
+              <w:start w:val="single" w:sz="4" w:space="0" w:color="auto"/>
+              <w:end w:val="single" w:sz="4" w:space="0" w:color="auto"/>
+            </w:tcBorders>
           </w:tcPr>
           <w:p>
             <w:pPr>
@@ -12346,6 +13952,14 @@
           <w:tcPr>
             <w:tcW w:type="dxa" w:w="1728"/>
             <w:vAlign w:val="center"/>
+            <w:tcBorders>
+              <w:top w:val="single" w:sz="4" w:space="0" w:color="auto"/>
+              <w:bottom w:val="single" w:sz="4" w:space="0" w:color="auto"/>
+              <w:left w:val="single" w:sz="4" w:space="0" w:color="auto"/>
+              <w:right w:val="nil"/>
+              <w:start w:val="single" w:sz="4" w:space="0" w:color="auto"/>
+              <w:end w:val="nil"/>
+            </w:tcBorders>
           </w:tcPr>
           <w:p>
             <w:pPr>
@@ -12368,6 +13982,14 @@
           <w:tcPr>
             <w:tcW w:type="dxa" w:w="1728"/>
             <w:vAlign w:val="center"/>
+            <w:tcBorders>
+              <w:top w:val="single" w:sz="4" w:space="0" w:color="auto"/>
+              <w:bottom w:val="single" w:sz="4" w:space="0" w:color="auto"/>
+              <w:left w:val="nil"/>
+              <w:right w:val="single" w:sz="4" w:space="0" w:color="auto"/>
+              <w:start w:val="nil"/>
+              <w:end w:val="single" w:sz="4" w:space="0" w:color="auto"/>
+            </w:tcBorders>
           </w:tcPr>
           <w:p>
             <w:pPr>
@@ -12388,6 +14010,14 @@
           <w:tcPr>
             <w:tcW w:type="dxa" w:w="1728"/>
             <w:vAlign w:val="center"/>
+            <w:tcBorders>
+              <w:top w:val="single" w:sz="4" w:space="0" w:color="auto"/>
+              <w:bottom w:val="single" w:sz="4" w:space="0" w:color="auto"/>
+              <w:left w:val="single" w:sz="4" w:space="0" w:color="auto"/>
+              <w:right w:val="single" w:sz="4" w:space="0" w:color="auto"/>
+              <w:start w:val="single" w:sz="4" w:space="0" w:color="auto"/>
+              <w:end w:val="single" w:sz="4" w:space="0" w:color="auto"/>
+            </w:tcBorders>
           </w:tcPr>
           <w:p>
             <w:pPr>
@@ -12408,6 +14038,14 @@
           <w:tcPr>
             <w:tcW w:type="dxa" w:w="1728"/>
             <w:vAlign w:val="center"/>
+            <w:tcBorders>
+              <w:top w:val="single" w:sz="4" w:space="0" w:color="auto"/>
+              <w:bottom w:val="single" w:sz="4" w:space="0" w:color="auto"/>
+              <w:left w:val="single" w:sz="4" w:space="0" w:color="auto"/>
+              <w:right w:val="single" w:sz="4" w:space="0" w:color="auto"/>
+              <w:start w:val="single" w:sz="4" w:space="0" w:color="auto"/>
+              <w:end w:val="single" w:sz="4" w:space="0" w:color="auto"/>
+            </w:tcBorders>
           </w:tcPr>
           <w:p>
             <w:pPr>
@@ -12428,6 +14066,14 @@
           <w:tcPr>
             <w:tcW w:type="dxa" w:w="1728"/>
             <w:vAlign w:val="center"/>
+            <w:tcBorders>
+              <w:top w:val="single" w:sz="4" w:space="0" w:color="auto"/>
+              <w:bottom w:val="single" w:sz="4" w:space="0" w:color="auto"/>
+              <w:left w:val="single" w:sz="4" w:space="0" w:color="auto"/>
+              <w:right w:val="single" w:sz="4" w:space="0" w:color="auto"/>
+              <w:start w:val="single" w:sz="4" w:space="0" w:color="auto"/>
+              <w:end w:val="single" w:sz="4" w:space="0" w:color="auto"/>
+            </w:tcBorders>
           </w:tcPr>
           <w:p>
             <w:pPr>
@@ -12448,6 +14094,14 @@
           <w:tcPr>
             <w:tcW w:type="dxa" w:w="1728"/>
             <w:vAlign w:val="center"/>
+            <w:tcBorders>
+              <w:top w:val="single" w:sz="4" w:space="0" w:color="auto"/>
+              <w:bottom w:val="single" w:sz="4" w:space="0" w:color="auto"/>
+              <w:left w:val="single" w:sz="4" w:space="0" w:color="auto"/>
+              <w:right w:val="nil"/>
+              <w:start w:val="single" w:sz="4" w:space="0" w:color="auto"/>
+              <w:end w:val="nil"/>
+            </w:tcBorders>
           </w:tcPr>
           <w:p>
             <w:pPr>
@@ -12470,6 +14124,14 @@
           <w:tcPr>
             <w:tcW w:type="dxa" w:w="1728"/>
             <w:vAlign w:val="center"/>
+            <w:tcBorders>
+              <w:top w:val="single" w:sz="4" w:space="0" w:color="auto"/>
+              <w:bottom w:val="single" w:sz="4" w:space="0" w:color="auto"/>
+              <w:left w:val="nil"/>
+              <w:right w:val="single" w:sz="4" w:space="0" w:color="auto"/>
+              <w:start w:val="nil"/>
+              <w:end w:val="single" w:sz="4" w:space="0" w:color="auto"/>
+            </w:tcBorders>
           </w:tcPr>
           <w:p>
             <w:pPr>
@@ -12490,6 +14152,14 @@
           <w:tcPr>
             <w:tcW w:type="dxa" w:w="1728"/>
             <w:vAlign w:val="center"/>
+            <w:tcBorders>
+              <w:top w:val="single" w:sz="4" w:space="0" w:color="auto"/>
+              <w:bottom w:val="single" w:sz="4" w:space="0" w:color="auto"/>
+              <w:left w:val="single" w:sz="4" w:space="0" w:color="auto"/>
+              <w:right w:val="single" w:sz="4" w:space="0" w:color="auto"/>
+              <w:start w:val="single" w:sz="4" w:space="0" w:color="auto"/>
+              <w:end w:val="single" w:sz="4" w:space="0" w:color="auto"/>
+            </w:tcBorders>
           </w:tcPr>
           <w:p>
             <w:pPr>
@@ -12510,6 +14180,14 @@
           <w:tcPr>
             <w:tcW w:type="dxa" w:w="1728"/>
             <w:vAlign w:val="center"/>
+            <w:tcBorders>
+              <w:top w:val="single" w:sz="4" w:space="0" w:color="auto"/>
+              <w:bottom w:val="single" w:sz="4" w:space="0" w:color="auto"/>
+              <w:left w:val="single" w:sz="4" w:space="0" w:color="auto"/>
+              <w:right w:val="single" w:sz="4" w:space="0" w:color="auto"/>
+              <w:start w:val="single" w:sz="4" w:space="0" w:color="auto"/>
+              <w:end w:val="single" w:sz="4" w:space="0" w:color="auto"/>
+            </w:tcBorders>
           </w:tcPr>
           <w:p>
             <w:pPr>
@@ -12530,6 +14208,14 @@
           <w:tcPr>
             <w:tcW w:type="dxa" w:w="1728"/>
             <w:vAlign w:val="center"/>
+            <w:tcBorders>
+              <w:top w:val="single" w:sz="4" w:space="0" w:color="auto"/>
+              <w:bottom w:val="single" w:sz="4" w:space="0" w:color="auto"/>
+              <w:left w:val="single" w:sz="4" w:space="0" w:color="auto"/>
+              <w:right w:val="single" w:sz="4" w:space="0" w:color="auto"/>
+              <w:start w:val="single" w:sz="4" w:space="0" w:color="auto"/>
+              <w:end w:val="single" w:sz="4" w:space="0" w:color="auto"/>
+            </w:tcBorders>
           </w:tcPr>
           <w:p>
             <w:pPr>
@@ -12550,6 +14236,14 @@
           <w:tcPr>
             <w:tcW w:type="dxa" w:w="1728"/>
             <w:vAlign w:val="center"/>
+            <w:tcBorders>
+              <w:top w:val="single" w:sz="4" w:space="0" w:color="auto"/>
+              <w:bottom w:val="single" w:sz="4" w:space="0" w:color="auto"/>
+              <w:left w:val="single" w:sz="4" w:space="0" w:color="auto"/>
+              <w:right w:val="nil"/>
+              <w:start w:val="single" w:sz="4" w:space="0" w:color="auto"/>
+              <w:end w:val="nil"/>
+            </w:tcBorders>
           </w:tcPr>
           <w:p>
             <w:pPr>
@@ -12628,9 +14322,14 @@
     </w:p>
     <w:tbl>
       <w:tblPr>
-        <w:tblStyle w:val="TableGrid"/>
         <w:tblW w:type="auto" w:w="0"/>
         <w:tblLook w:firstColumn="1" w:firstRow="1" w:lastColumn="0" w:lastRow="0" w:noHBand="0" w:noVBand="1" w:val="04A0"/>
+        <w:tblBorders>
+          <w:left w:val="nil"/>
+          <w:right w:val="nil"/>
+          <w:start w:val="nil"/>
+          <w:end w:val="nil"/>
+        </w:tblBorders>
       </w:tblPr>
       <w:tblGrid>
         <w:gridCol w:w="2160"/>
@@ -12643,6 +14342,14 @@
           <w:tcPr>
             <w:tcW w:type="dxa" w:w="2160"/>
             <w:vAlign w:val="center"/>
+            <w:tcBorders>
+              <w:top w:val="single" w:sz="4" w:space="0" w:color="auto"/>
+              <w:bottom w:val="single" w:sz="4" w:space="0" w:color="auto"/>
+              <w:left w:val="nil"/>
+              <w:right w:val="single" w:sz="4" w:space="0" w:color="auto"/>
+              <w:start w:val="nil"/>
+              <w:end w:val="single" w:sz="4" w:space="0" w:color="auto"/>
+            </w:tcBorders>
           </w:tcPr>
           <w:p>
             <w:pPr>
@@ -12663,6 +14370,14 @@
           <w:tcPr>
             <w:tcW w:type="dxa" w:w="2160"/>
             <w:vAlign w:val="center"/>
+            <w:tcBorders>
+              <w:top w:val="single" w:sz="4" w:space="0" w:color="auto"/>
+              <w:bottom w:val="single" w:sz="4" w:space="0" w:color="auto"/>
+              <w:left w:val="single" w:sz="4" w:space="0" w:color="auto"/>
+              <w:right w:val="single" w:sz="4" w:space="0" w:color="auto"/>
+              <w:start w:val="single" w:sz="4" w:space="0" w:color="auto"/>
+              <w:end w:val="single" w:sz="4" w:space="0" w:color="auto"/>
+            </w:tcBorders>
           </w:tcPr>
           <w:p>
             <w:pPr>
@@ -12683,6 +14398,14 @@
           <w:tcPr>
             <w:tcW w:type="dxa" w:w="2160"/>
             <w:vAlign w:val="center"/>
+            <w:tcBorders>
+              <w:top w:val="single" w:sz="4" w:space="0" w:color="auto"/>
+              <w:bottom w:val="single" w:sz="4" w:space="0" w:color="auto"/>
+              <w:left w:val="single" w:sz="4" w:space="0" w:color="auto"/>
+              <w:right w:val="single" w:sz="4" w:space="0" w:color="auto"/>
+              <w:start w:val="single" w:sz="4" w:space="0" w:color="auto"/>
+              <w:end w:val="single" w:sz="4" w:space="0" w:color="auto"/>
+            </w:tcBorders>
           </w:tcPr>
           <w:p>
             <w:pPr>
@@ -12703,6 +14426,14 @@
           <w:tcPr>
             <w:tcW w:type="dxa" w:w="2160"/>
             <w:vAlign w:val="center"/>
+            <w:tcBorders>
+              <w:top w:val="single" w:sz="4" w:space="0" w:color="auto"/>
+              <w:bottom w:val="single" w:sz="4" w:space="0" w:color="auto"/>
+              <w:left w:val="single" w:sz="4" w:space="0" w:color="auto"/>
+              <w:right w:val="nil"/>
+              <w:start w:val="single" w:sz="4" w:space="0" w:color="auto"/>
+              <w:end w:val="nil"/>
+            </w:tcBorders>
           </w:tcPr>
           <w:p>
             <w:pPr>
@@ -12725,6 +14456,14 @@
           <w:tcPr>
             <w:tcW w:type="dxa" w:w="2160"/>
             <w:vAlign w:val="center"/>
+            <w:tcBorders>
+              <w:top w:val="single" w:sz="4" w:space="0" w:color="auto"/>
+              <w:bottom w:val="single" w:sz="4" w:space="0" w:color="auto"/>
+              <w:left w:val="nil"/>
+              <w:right w:val="single" w:sz="4" w:space="0" w:color="auto"/>
+              <w:start w:val="nil"/>
+              <w:end w:val="single" w:sz="4" w:space="0" w:color="auto"/>
+            </w:tcBorders>
           </w:tcPr>
           <w:p>
             <w:pPr>
@@ -12745,6 +14484,14 @@
           <w:tcPr>
             <w:tcW w:type="dxa" w:w="2160"/>
             <w:vAlign w:val="center"/>
+            <w:tcBorders>
+              <w:top w:val="single" w:sz="4" w:space="0" w:color="auto"/>
+              <w:bottom w:val="single" w:sz="4" w:space="0" w:color="auto"/>
+              <w:left w:val="single" w:sz="4" w:space="0" w:color="auto"/>
+              <w:right w:val="single" w:sz="4" w:space="0" w:color="auto"/>
+              <w:start w:val="single" w:sz="4" w:space="0" w:color="auto"/>
+              <w:end w:val="single" w:sz="4" w:space="0" w:color="auto"/>
+            </w:tcBorders>
           </w:tcPr>
           <w:p>
             <w:pPr>
@@ -12765,6 +14512,14 @@
           <w:tcPr>
             <w:tcW w:type="dxa" w:w="2160"/>
             <w:vAlign w:val="center"/>
+            <w:tcBorders>
+              <w:top w:val="single" w:sz="4" w:space="0" w:color="auto"/>
+              <w:bottom w:val="single" w:sz="4" w:space="0" w:color="auto"/>
+              <w:left w:val="single" w:sz="4" w:space="0" w:color="auto"/>
+              <w:right w:val="single" w:sz="4" w:space="0" w:color="auto"/>
+              <w:start w:val="single" w:sz="4" w:space="0" w:color="auto"/>
+              <w:end w:val="single" w:sz="4" w:space="0" w:color="auto"/>
+            </w:tcBorders>
           </w:tcPr>
           <w:p>
             <w:pPr>
@@ -12785,6 +14540,14 @@
           <w:tcPr>
             <w:tcW w:type="dxa" w:w="2160"/>
             <w:vAlign w:val="center"/>
+            <w:tcBorders>
+              <w:top w:val="single" w:sz="4" w:space="0" w:color="auto"/>
+              <w:bottom w:val="single" w:sz="4" w:space="0" w:color="auto"/>
+              <w:left w:val="single" w:sz="4" w:space="0" w:color="auto"/>
+              <w:right w:val="nil"/>
+              <w:start w:val="single" w:sz="4" w:space="0" w:color="auto"/>
+              <w:end w:val="nil"/>
+            </w:tcBorders>
           </w:tcPr>
           <w:p>
             <w:pPr>
@@ -12807,6 +14570,14 @@
           <w:tcPr>
             <w:tcW w:type="dxa" w:w="2160"/>
             <w:vAlign w:val="center"/>
+            <w:tcBorders>
+              <w:top w:val="single" w:sz="4" w:space="0" w:color="auto"/>
+              <w:bottom w:val="single" w:sz="4" w:space="0" w:color="auto"/>
+              <w:left w:val="nil"/>
+              <w:right w:val="single" w:sz="4" w:space="0" w:color="auto"/>
+              <w:start w:val="nil"/>
+              <w:end w:val="single" w:sz="4" w:space="0" w:color="auto"/>
+            </w:tcBorders>
           </w:tcPr>
           <w:p>
             <w:pPr>
@@ -12827,6 +14598,14 @@
           <w:tcPr>
             <w:tcW w:type="dxa" w:w="2160"/>
             <w:vAlign w:val="center"/>
+            <w:tcBorders>
+              <w:top w:val="single" w:sz="4" w:space="0" w:color="auto"/>
+              <w:bottom w:val="single" w:sz="4" w:space="0" w:color="auto"/>
+              <w:left w:val="single" w:sz="4" w:space="0" w:color="auto"/>
+              <w:right w:val="single" w:sz="4" w:space="0" w:color="auto"/>
+              <w:start w:val="single" w:sz="4" w:space="0" w:color="auto"/>
+              <w:end w:val="single" w:sz="4" w:space="0" w:color="auto"/>
+            </w:tcBorders>
           </w:tcPr>
           <w:p>
             <w:pPr>
@@ -12847,6 +14626,14 @@
           <w:tcPr>
             <w:tcW w:type="dxa" w:w="2160"/>
             <w:vAlign w:val="center"/>
+            <w:tcBorders>
+              <w:top w:val="single" w:sz="4" w:space="0" w:color="auto"/>
+              <w:bottom w:val="single" w:sz="4" w:space="0" w:color="auto"/>
+              <w:left w:val="single" w:sz="4" w:space="0" w:color="auto"/>
+              <w:right w:val="single" w:sz="4" w:space="0" w:color="auto"/>
+              <w:start w:val="single" w:sz="4" w:space="0" w:color="auto"/>
+              <w:end w:val="single" w:sz="4" w:space="0" w:color="auto"/>
+            </w:tcBorders>
           </w:tcPr>
           <w:p>
             <w:pPr>
@@ -12867,6 +14654,14 @@
           <w:tcPr>
             <w:tcW w:type="dxa" w:w="2160"/>
             <w:vAlign w:val="center"/>
+            <w:tcBorders>
+              <w:top w:val="single" w:sz="4" w:space="0" w:color="auto"/>
+              <w:bottom w:val="single" w:sz="4" w:space="0" w:color="auto"/>
+              <w:left w:val="single" w:sz="4" w:space="0" w:color="auto"/>
+              <w:right w:val="nil"/>
+              <w:start w:val="single" w:sz="4" w:space="0" w:color="auto"/>
+              <w:end w:val="nil"/>
+            </w:tcBorders>
           </w:tcPr>
           <w:p>
             <w:pPr>
@@ -12889,6 +14684,14 @@
           <w:tcPr>
             <w:tcW w:type="dxa" w:w="2160"/>
             <w:vAlign w:val="center"/>
+            <w:tcBorders>
+              <w:top w:val="single" w:sz="4" w:space="0" w:color="auto"/>
+              <w:bottom w:val="single" w:sz="4" w:space="0" w:color="auto"/>
+              <w:left w:val="nil"/>
+              <w:right w:val="single" w:sz="4" w:space="0" w:color="auto"/>
+              <w:start w:val="nil"/>
+              <w:end w:val="single" w:sz="4" w:space="0" w:color="auto"/>
+            </w:tcBorders>
           </w:tcPr>
           <w:p>
             <w:pPr>
@@ -12909,6 +14712,14 @@
           <w:tcPr>
             <w:tcW w:type="dxa" w:w="2160"/>
             <w:vAlign w:val="center"/>
+            <w:tcBorders>
+              <w:top w:val="single" w:sz="4" w:space="0" w:color="auto"/>
+              <w:bottom w:val="single" w:sz="4" w:space="0" w:color="auto"/>
+              <w:left w:val="single" w:sz="4" w:space="0" w:color="auto"/>
+              <w:right w:val="single" w:sz="4" w:space="0" w:color="auto"/>
+              <w:start w:val="single" w:sz="4" w:space="0" w:color="auto"/>
+              <w:end w:val="single" w:sz="4" w:space="0" w:color="auto"/>
+            </w:tcBorders>
           </w:tcPr>
           <w:p>
             <w:pPr>
@@ -12929,6 +14740,14 @@
           <w:tcPr>
             <w:tcW w:type="dxa" w:w="2160"/>
             <w:vAlign w:val="center"/>
+            <w:tcBorders>
+              <w:top w:val="single" w:sz="4" w:space="0" w:color="auto"/>
+              <w:bottom w:val="single" w:sz="4" w:space="0" w:color="auto"/>
+              <w:left w:val="single" w:sz="4" w:space="0" w:color="auto"/>
+              <w:right w:val="single" w:sz="4" w:space="0" w:color="auto"/>
+              <w:start w:val="single" w:sz="4" w:space="0" w:color="auto"/>
+              <w:end w:val="single" w:sz="4" w:space="0" w:color="auto"/>
+            </w:tcBorders>
           </w:tcPr>
           <w:p>
             <w:pPr>
@@ -12949,6 +14768,14 @@
           <w:tcPr>
             <w:tcW w:type="dxa" w:w="2160"/>
             <w:vAlign w:val="center"/>
+            <w:tcBorders>
+              <w:top w:val="single" w:sz="4" w:space="0" w:color="auto"/>
+              <w:bottom w:val="single" w:sz="4" w:space="0" w:color="auto"/>
+              <w:left w:val="single" w:sz="4" w:space="0" w:color="auto"/>
+              <w:right w:val="nil"/>
+              <w:start w:val="single" w:sz="4" w:space="0" w:color="auto"/>
+              <w:end w:val="nil"/>
+            </w:tcBorders>
           </w:tcPr>
           <w:p>
             <w:pPr>
@@ -12971,6 +14798,14 @@
           <w:tcPr>
             <w:tcW w:type="dxa" w:w="2160"/>
             <w:vAlign w:val="center"/>
+            <w:tcBorders>
+              <w:top w:val="single" w:sz="4" w:space="0" w:color="auto"/>
+              <w:bottom w:val="single" w:sz="4" w:space="0" w:color="auto"/>
+              <w:left w:val="nil"/>
+              <w:right w:val="single" w:sz="4" w:space="0" w:color="auto"/>
+              <w:start w:val="nil"/>
+              <w:end w:val="single" w:sz="4" w:space="0" w:color="auto"/>
+            </w:tcBorders>
           </w:tcPr>
           <w:p>
             <w:pPr>
@@ -12991,6 +14826,14 @@
           <w:tcPr>
             <w:tcW w:type="dxa" w:w="2160"/>
             <w:vAlign w:val="center"/>
+            <w:tcBorders>
+              <w:top w:val="single" w:sz="4" w:space="0" w:color="auto"/>
+              <w:bottom w:val="single" w:sz="4" w:space="0" w:color="auto"/>
+              <w:left w:val="single" w:sz="4" w:space="0" w:color="auto"/>
+              <w:right w:val="single" w:sz="4" w:space="0" w:color="auto"/>
+              <w:start w:val="single" w:sz="4" w:space="0" w:color="auto"/>
+              <w:end w:val="single" w:sz="4" w:space="0" w:color="auto"/>
+            </w:tcBorders>
           </w:tcPr>
           <w:p>
             <w:pPr>
@@ -13011,6 +14854,14 @@
           <w:tcPr>
             <w:tcW w:type="dxa" w:w="2160"/>
             <w:vAlign w:val="center"/>
+            <w:tcBorders>
+              <w:top w:val="single" w:sz="4" w:space="0" w:color="auto"/>
+              <w:bottom w:val="single" w:sz="4" w:space="0" w:color="auto"/>
+              <w:left w:val="single" w:sz="4" w:space="0" w:color="auto"/>
+              <w:right w:val="single" w:sz="4" w:space="0" w:color="auto"/>
+              <w:start w:val="single" w:sz="4" w:space="0" w:color="auto"/>
+              <w:end w:val="single" w:sz="4" w:space="0" w:color="auto"/>
+            </w:tcBorders>
           </w:tcPr>
           <w:p>
             <w:pPr>
@@ -13031,6 +14882,14 @@
           <w:tcPr>
             <w:tcW w:type="dxa" w:w="2160"/>
             <w:vAlign w:val="center"/>
+            <w:tcBorders>
+              <w:top w:val="single" w:sz="4" w:space="0" w:color="auto"/>
+              <w:bottom w:val="single" w:sz="4" w:space="0" w:color="auto"/>
+              <w:left w:val="single" w:sz="4" w:space="0" w:color="auto"/>
+              <w:right w:val="nil"/>
+              <w:start w:val="single" w:sz="4" w:space="0" w:color="auto"/>
+              <w:end w:val="nil"/>
+            </w:tcBorders>
           </w:tcPr>
           <w:p>
             <w:pPr>

</xml_diff>

<commit_message>
feat: add gateway benchmark support
</commit_message>
<xml_diff>
--- a/output/doc/毕业设计说明书初稿.docx
+++ b/output/doc/毕业设计说明书初稿.docx
@@ -3998,6 +3998,21 @@
           <w:sz w:val="24"/>
         </w:rPr>
         <w:t>为验证系统并发处理能力，本文使用压力测试工具模拟多个用户同时访问。测试中设置不同并发数，统计系统在一定时间内的请求吞吐量、平均响应时间和错误率等指标。</w:t>
+      </w:r>
+    </w:p>
+    <w:p/>
+    <w:p>
+      <w:pPr>
+        <w:spacing w:line="360" w:lineRule="auto"/>
+        <w:ind w:firstLine="480"/>
+      </w:pPr>
+      <w:r>
+        <w:rPr>
+          <w:rFonts w:ascii="宋体" w:hAnsi="宋体" w:eastAsia="宋体"/>
+          <w:b w:val="0"/>
+          <w:sz w:val="24"/>
+        </w:rPr>
+        <w:t>在测试方法上，系统提供 `scripts/benchmark_gateway.py` 作为统一压测入口。该脚本可分别对 `/api/health` 健康检查链路和 `/api/chat` 智能问答链路进行并发访问，运行时通过 `--requests` 设置总请求数，通过 `--concurrency` 设置并发数，并将测试结果保存为 JSON 文件。输出指标包括平均响应时间、P95 响应时间、`throughput_rps`、成功率、错误率和错误样例。与手工执行单条 curl 命令相比，该脚本能够保留实验参数和原始数据，便于论文实验结果复核。</w:t>
       </w:r>
     </w:p>
     <w:p/>

</xml_diff>

<commit_message>
feat: strengthen gateway validation support
</commit_message>
<xml_diff>
--- a/output/doc/毕业设计说明书初稿.docx
+++ b/output/doc/毕业设计说明书初稿.docx
@@ -119,7 +119,7 @@
           <w:b w:val="0"/>
           <w:sz w:val="24"/>
         </w:rPr>
-        <w:t>**关键词：** C++；高并发；Reactor；Epoll；FastAPI；大语言模型；智能交互系统</w:t>
+        <w:t>关键词： C++；高并发；Reactor；Epoll；FastAPI；大语言模型；智能交互系统</w:t>
       </w:r>
     </w:p>
     <w:p/>
@@ -209,7 +209,7 @@
           <w:b w:val="0"/>
           <w:sz w:val="24"/>
         </w:rPr>
-        <w:t>**Key words:** C++; high concurrency; Reactor; Epoll; FastAPI; large language model; interactive system</w:t>
+        <w:t>Key words: C++; high concurrency; Reactor; Epoll; FastAPI; large language model; interactive system</w:t>
       </w:r>
     </w:p>
     <w:p/>
@@ -2123,7 +2123,7 @@
           <w:b w:val="0"/>
           <w:sz w:val="24"/>
         </w:rPr>
-        <w:t>1. 用户表 `user`：存储用户账号、密码、角色和创建时间。</w:t>
+        <w:t>1. 用户表 user：存储用户账号、密码、角色和创建时间。</w:t>
       </w:r>
     </w:p>
     <w:p>
@@ -2137,7 +2137,7 @@
           <w:b w:val="0"/>
           <w:sz w:val="24"/>
         </w:rPr>
-        <w:t>2. 会话表 `chat_session`：存储会话编号、所属用户、创建时间和状态。</w:t>
+        <w:t>2. 会话表 chat_session：存储会话编号、所属用户、创建时间和状态。</w:t>
       </w:r>
     </w:p>
     <w:p>
@@ -2151,7 +2151,7 @@
           <w:b w:val="0"/>
           <w:sz w:val="24"/>
         </w:rPr>
-        <w:t>3. 消息表 `chat_message`：存储问题、回答、时间戳和消息顺序。</w:t>
+        <w:t>3. 消息表 chat_message：存储问题、回答、时间戳和消息顺序。</w:t>
       </w:r>
     </w:p>
     <w:p>
@@ -2165,7 +2165,7 @@
           <w:b w:val="0"/>
           <w:sz w:val="24"/>
         </w:rPr>
-        <w:t>4. 配置表 `system_config`：存储模型名称、接口地址、超时时间等系统参数。</w:t>
+        <w:t>4. 配置表 system_config：存储模型名称、接口地址、超时时间等系统参数。</w:t>
       </w:r>
     </w:p>
     <w:p>
@@ -2179,7 +2179,7 @@
           <w:b w:val="0"/>
           <w:sz w:val="24"/>
         </w:rPr>
-        <w:t>5. 日志表 `system_log`：存储关键业务日志和异常信息。</w:t>
+        <w:t>5. 日志表 system_log：存储关键业务日志和异常信息。</w:t>
       </w:r>
     </w:p>
     <w:p/>
@@ -2924,7 +2924,7 @@
           <w:b w:val="0"/>
           <w:sz w:val="24"/>
         </w:rPr>
-        <w:t>在跨环境运行约定上，系统统一使用 Python 服务端口 `8000`、C++ 网关端口 `8080`、前端静态服务端口 `5500`。前端支持两种访问模式：一种是直连 Python 服务的通用演示模式，适合 Windows 环境下快速展示；另一种是通过 C++ 网关转发访问的高并发演示模式，适合在 WSL 或 Linux 环境下展示系统的双后端协同架构。</w:t>
+        <w:t>在跨环境运行约定上，系统统一使用 Python 服务端口 8000、C++ 网关端口 8080、前端静态服务端口 5500。前端支持两种访问模式：一种是直连 Python 服务的通用演示模式，适合 Windows 环境下快速展示；另一种是通过 C++ 网关转发访问的高并发演示模式，适合在 WSL 或 Linux 环境下展示系统的双后端协同架构。</w:t>
       </w:r>
     </w:p>
     <w:p/>
@@ -2939,7 +2939,7 @@
           <w:b w:val="0"/>
           <w:sz w:val="24"/>
         </w:rPr>
-        <w:t>为了降低不同环境下的部署歧义，项目根目录统一提供 `.env.example` 作为环境变量模板，用于约定模型接口地址、端口号和运行参数；同时系统定义 `/api/health` 作为统一健康检查接口，使得 Windows、Linux 和 WSL 三类环境均可以通过相同方式完成最小可运行验证。</w:t>
+        <w:t>为了降低不同环境下的部署歧义，项目根目录统一提供 .env.example 作为环境变量模板，用于约定模型接口地址、端口号和运行参数；同时系统定义 /api/health 作为统一健康检查接口，使得 Windows、Linux 和 WSL 三类环境均可以通过相同方式完成最小可运行验证。</w:t>
       </w:r>
     </w:p>
     <w:p/>
@@ -2954,7 +2954,7 @@
           <w:b w:val="0"/>
           <w:sz w:val="24"/>
         </w:rPr>
-        <w:t>在高并发专项层中，C++ 网关默认监听 `8080` 端口并转发到 `127.0.0.1:8000` 的 Python 服务，同时支持通过 `GATEWAY_PORT`、`UPSTREAM_HOST`、`UPSTREAM_PORT` 等环境变量覆盖默认配置，从而适应 WSL 与 Linux 下不同的联调和部署拓扑。</w:t>
+        <w:t>在高并发专项层中，C++ 网关默认监听 8080 端口并转发到 127.0.0.1:8000 的 Python 服务，同时支持通过 GATEWAY_PORT、UPSTREAM_HOST、UPSTREAM_PORT 等环境变量覆盖默认配置，从而适应 WSL 与 Linux 下不同的联调和部署拓扑。</w:t>
       </w:r>
     </w:p>
     <w:p/>
@@ -3119,7 +3119,7 @@
           <w:b w:val="0"/>
           <w:sz w:val="24"/>
         </w:rPr>
-        <w:t>系统采用有限状态机方式对 HTTP 报文进行解析，将解析过程划分为请求行解析、请求头解析和消息体解析三个阶段。该方法可提高复杂报文处理的清晰度和稳定性。</w:t>
+        <w:t>系统在当前实现中采用轻量级 HTTP 报文解析流程，重点解析请求行、请求方法、访问路径和消息体内容。由于网关主要承担前端到 Python 服务的请求转发任务，因此当前版本优先保证 GET 与 POST 主链路的正确转发，并通过统一错误响应处理异常请求。</w:t>
       </w:r>
     </w:p>
     <w:p/>
@@ -3149,7 +3149,7 @@
           <w:b w:val="0"/>
           <w:sz w:val="24"/>
         </w:rPr>
-        <w:t>线程池在系统初始化时预创建多个工作线程。主线程负责将已解析请求封装成任务，工作线程负责执行业务逻辑，包括数据库访问、向 AI 服务发送请求和组织返回报文等。</w:t>
+        <w:t>线程池在系统初始化时预创建多个工作线程。主线程负责监听连接事件并将客户端请求封装成任务，工作线程负责执行请求读取、上游转发、响应回写和连接关闭等操作。该设计避免所有请求都阻塞在主事件循环中，使接入层能够同时处理多个客户端连接。</w:t>
       </w:r>
     </w:p>
     <w:p/>
@@ -3179,7 +3179,7 @@
           <w:b w:val="0"/>
           <w:sz w:val="24"/>
         </w:rPr>
-        <w:t>系统为每个客户端连接维护超时信息，通过定时器定期扫描长时间无活动连接并主动关闭，以防止连接长期占用系统资源。</w:t>
+        <w:t>系统在转发到 Python 服务时设置上游连接超时和读写超时。网关使用非阻塞 connect 配合 select 检查连接建立状态，避免上游服务未启动或端口不可达时线程长期阻塞；同时通过 SO_RCVTIMEO 和 SO_SNDTIMEO 控制上游读写等待时间。当上游不可用时，网关返回 502 Bad Gateway 风格的 JSON 错误响应，从而保证异常场景下仍能给调用方明确反馈。</w:t>
       </w:r>
     </w:p>
     <w:p/>
@@ -3224,7 +3224,7 @@
           <w:b w:val="0"/>
           <w:sz w:val="24"/>
         </w:rPr>
-        <w:t>Python 服务提供统一的问答接口，例如 `/api/ask`。该接口接收用户问题、会话编号和可选上下文信息，完成输入校验后调用模型服务。</w:t>
+        <w:t>Python 服务提供统一的 HTTP 接口，包括健康检查、用户登录、智能问答、历史记录、管理员日志、系统配置和后台概览等接口。智能问答接口接收用户 token 和问题内容，完成身份校验后调用模型服务或演示模式回答逻辑，并将会话消息写入仓储层。</w:t>
       </w:r>
     </w:p>
     <w:p/>
@@ -3284,7 +3284,7 @@
           <w:b w:val="0"/>
           <w:sz w:val="24"/>
         </w:rPr>
-        <w:t>AI 服务封装对外部大模型接口的调用逻辑，处理鉴权、超时、异常捕获与结果提取。系统设计为双模式运行：在未配置模型接口环境变量时，自动返回演示模式回复，以保证本地开发和答辩演示的稳定性；在配置 `LLM_API_URL`、`LLM_API_KEY` 和 `LLM_MODEL_NAME` 后，系统会向真实模型服务发送请求并提取结果。若模型调用失败，系统自动回退到本地演示模式，避免异常直接暴露给用户。</w:t>
+        <w:t>AI 服务封装对外部大模型接口的调用逻辑，处理鉴权、超时、异常捕获与结果提取。系统设计为双模式运行：在未配置模型接口环境变量时，自动返回演示模式回复，以保证本地开发和答辩演示的稳定性；在配置 LLM_API_URL、LLM_API_KEY 和 LLM_MODEL_NAME 后，系统会向真实模型服务发送请求并提取结果。若模型调用失败，系统自动回退到本地演示模式，避免异常直接暴露给用户。</w:t>
       </w:r>
     </w:p>
     <w:p/>
@@ -3329,7 +3329,7 @@
           <w:b w:val="0"/>
           <w:sz w:val="24"/>
         </w:rPr>
-        <w:t>为了适配不同环境下的运行方式，前端增加了运行时配置脚本。当前端以默认模式启动时，页面直连 Python 服务，适合 Windows、Linux 和 WSL 的通用演示；当页面以 `mode=gateway` 参数启动时，前端自动将请求发送给 `8080` 端口的 C++ 网关，从而展示 Linux/WSL 环境下的高并发接入层转发能力。</w:t>
+        <w:t>为了适配不同环境下的运行方式，前端增加了运行时配置脚本。当前端以默认模式启动时，页面直连 Python 服务，适合 Windows、Linux 和 WSL 的通用演示；当页面以 mode=gateway 参数启动时，前端自动将请求发送给 8080 端口的 C++ 网关，从而展示 Linux/WSL 环境下的高并发接入层转发能力。</w:t>
       </w:r>
     </w:p>
     <w:p/>
@@ -3344,7 +3344,7 @@
           <w:b w:val="0"/>
           <w:sz w:val="24"/>
         </w:rPr>
-        <w:t>为便于部署检查，Python 服务额外提供 `/api/health` 健康检查接口，返回服务状态、当前运行模式、模型名称和会话数量等基础信息。配合 `verify_runtime.ps1` 与 `verify_runtime.sh` 脚本，系统可以在不同环境下用统一方式验证“服务启动成功、登录成功、问答成功”这条最小主链路。</w:t>
+        <w:t>为便于部署检查，Python 服务额外提供 /api/health 健康检查接口，返回服务状态、当前运行模式、存储模式、模型名称和会话数量等基础信息。配合 verify_runtime.ps1 与 verify_runtime.sh 脚本，系统可以在不同环境下用统一方式验证“服务启动成功、登录成功、问答成功”这条最小主链路。</w:t>
       </w:r>
     </w:p>
     <w:p/>
@@ -3359,7 +3359,7 @@
           <w:b w:val="0"/>
           <w:sz w:val="24"/>
         </w:rPr>
-        <w:t>针对 Linux / WSL 下的网关专项验证，系统额外提供 `start_gateway_wsl.sh` 脚本，用于按统一环境变量启动 epoll 网关，并结合 `verify_gateway_smoke.sh` 对历史记录接口进行补充验证。这种做法降低了联调时对人工输入命令的依赖，提高了实验复现效率。</w:t>
+        <w:t>针对 Linux / WSL 下的网关专项验证，系统额外提供 start_gateway_wsl.sh 脚本，用于按统一环境变量启动 epoll 网关，并结合 verify_gateway_smoke.sh 对历史记录接口进行补充验证。这种做法降低了联调时对人工输入命令的依赖，提高了实验复现效率。</w:t>
       </w:r>
     </w:p>
     <w:p/>
@@ -3420,6 +3420,21 @@
           <w:sz w:val="24"/>
         </w:rPr>
         <w:t>C++ 网关启动后监听固定端口，通过 Epoll 感知连接事件，并将客户端请求交由线程池异步处理。在线程池任务中，系统首先解析 HTTP 请求行，提取请求方法与路径，再读取消息体内容，最后通过套接字向 Python 服务重新组装 HTTP 请求并转发。Python 服务处理完成后，网关读取完整响应并回传浏览器端。该设计使得“高并发接入”和“智能服务处理”在职责上保持清晰分离。</w:t>
+      </w:r>
+    </w:p>
+    <w:p/>
+    <w:p>
+      <w:pPr>
+        <w:spacing w:line="360" w:lineRule="auto"/>
+        <w:ind w:firstLine="480"/>
+      </w:pPr>
+      <w:r>
+        <w:rPr>
+          <w:rFonts w:ascii="宋体" w:hAnsi="宋体" w:eastAsia="宋体"/>
+          <w:b w:val="0"/>
+          <w:sz w:val="24"/>
+        </w:rPr>
+        <w:t>在实际联调中，Windows 侧启动 Python FastAPI 服务后，WSL 侧通过 build_gateway_wsl.sh 完成 C++ 网关编译。由于测试环境中未安装 CMake，构建脚本自动回退到 g++ 直接编译方式并生成可执行文件。随后通过 GATEWAY_PORT、UPSTREAM_HOST、UPSTREAM_PORT 配置网关监听端口与上游地址，并使用 verify_runtime.sh gateway 与 verify_gateway_smoke.sh 完成接口验证。验证结果表明，系统可以经由 C++ 网关访问健康检查、用户登录、智能问答和历史记录接口；当上游端口指向未监听端口时，网关返回 502 Bad Gateway 错误响应，说明转发成功路径和异常路径均具备可验证性。</w:t>
       </w:r>
     </w:p>
     <w:p/>
@@ -4012,7 +4027,7 @@
           <w:b w:val="0"/>
           <w:sz w:val="24"/>
         </w:rPr>
-        <w:t>在测试方法上，系统提供 `scripts/benchmark_gateway.py` 作为统一压测入口。该脚本可分别对 `/api/health` 健康检查链路和 `/api/chat` 智能问答链路进行并发访问，运行时通过 `--requests` 设置总请求数，通过 `--concurrency` 设置并发数，并将测试结果保存为 JSON 文件。输出指标包括平均响应时间、P95 响应时间、`throughput_rps`、成功率、错误率和错误样例。与手工执行单条 curl 命令相比，该脚本能够保留实验参数和原始数据，便于论文实验结果复核。</w:t>
+        <w:t>在测试方法上，系统提供 scripts/benchmark_gateway.py 作为统一压测入口。该脚本可分别对 /api/health 健康检查链路和 /api/chat 智能问答链路进行并发访问，运行时通过 --requests 设置总请求数，通过 --concurrency 设置并发数，并将测试结果保存为 JSON 文件。输出指标包括平均响应时间、P95 响应时间、throughput_rps、成功率、错误率和错误样例。与手工执行单条 curl 命令相比，该脚本能够保留实验参数和原始数据，便于论文实验结果复核。</w:t>
       </w:r>
     </w:p>
     <w:p/>
@@ -4201,7 +4216,7 @@
           <w:b w:val="0"/>
           <w:sz w:val="24"/>
         </w:rPr>
-        <w:t>从跨环境运行角度看，系统的部署验证分为三个层次。第一，Windows 环境下验证前端页面与 Python 服务能够独立启动，并完成登录、问答、历史记录和管理员概览等核心功能；第二，WSL 环境下验证 C++ 网关能够完成编译、启动与转发，并通过网关访问 `/api/login`、`/api/chat`、`/api/history` 等主链路接口；第三，Linux 环境下保留完整部署与并发压测入口，用于后续进一步补充高并发实验数据。</w:t>
+        <w:t>从跨环境运行角度看，系统的部署验证分为三个层次。第一，Windows 环境下验证前端页面与 Python 服务能够独立启动，并完成登录、问答、历史记录和管理员概览等核心功能；第二，WSL 环境下验证 C++ 网关能够完成编译、启动与转发，并通过网关访问 /api/login、/api/chat、/api/history 等主链路接口；第三，Linux 环境下保留完整部署与并发压测入口，用于后续进一步补充高并发实验数据。</w:t>
       </w:r>
     </w:p>
     <w:p/>
@@ -4216,7 +4231,7 @@
           <w:b w:val="0"/>
           <w:sz w:val="24"/>
         </w:rPr>
-        <w:t>在具体验证方法上，本系统将 `/api/health` 作为统一健康检查契约，并提供 Windows PowerShell 与 Linux Shell 两套运行验证脚本。通过这种方式，三个环境下的验证工作不再依赖人工逐条构造请求，而是能够按照统一脚本完成基础检查，提高了部署验证的可重复性。</w:t>
+        <w:t>在具体验证方法上，本系统将 /api/health 作为统一健康检查契约，并提供 Windows PowerShell 与 Linux Shell 两套运行验证脚本。通过这种方式，三个环境下的验证工作不再依赖人工逐条构造请求，而是能够按照统一脚本完成基础检查，提高了部署验证的可重复性。</w:t>
       </w:r>
     </w:p>
     <w:p/>
@@ -4231,6 +4246,21 @@
           <w:b w:val="0"/>
           <w:sz w:val="24"/>
         </w:rPr>
+        <w:t>本阶段已完成一次 WSL 网关联调验证。验证过程中，Python 服务运行在 8000 端口，C++ 网关临时监听 18081 端口并转发到 127.0.0.1:8000。构建脚本输出“cmake not found; using direct g++ fallback build.”，说明脚本能够在缺少 CMake 的环境中自动切换到 g++ 编译路径。随后通过网关访问健康检查、登录、问答和历史记录接口，返回内容均符合接口契约；网关启动日志显示其监听地址为 0.0.0.0:18081，上游地址为 127.0.0.1:8000。</w:t>
+      </w:r>
+    </w:p>
+    <w:p/>
+    <w:p>
+      <w:pPr>
+        <w:spacing w:line="360" w:lineRule="auto"/>
+        <w:ind w:firstLine="480"/>
+      </w:pPr>
+      <w:r>
+        <w:rPr>
+          <w:rFonts w:ascii="宋体" w:hAnsi="宋体" w:eastAsia="宋体"/>
+          <w:b w:val="0"/>
+          <w:sz w:val="24"/>
+        </w:rPr>
         <w:t>通过这种环境适配设计，系统避免了“只能在作者本机上运行”的问题，使其能够在不同操作系统和运行环境下按照统一的接口契约完成部署与演示。</w:t>
       </w:r>
     </w:p>
@@ -4334,7 +4364,7 @@
           <w:b w:val="0"/>
           <w:sz w:val="24"/>
         </w:rPr>
-        <w:t>此外，从当前自动化测试结果来看，Python 业务层、API 层以及项目结构检查均已通过验证，说明系统的主链路具备较好的可运行性。后续若在 Linux 环境完成 C++ 网关编译与压力测试截图采集，则论文的实验部分还可进一步增强。</w:t>
+        <w:t>此外，从当前自动化测试结果来看，Python 业务层、API 层、项目结构检查以及 WSL 网关联调均已通过验证，说明系统的主链路具备较好的可运行性。后续若补充更大规模 Linux 压力测试截图和原始数据，则论文的性能实验部分还可进一步增强。</w:t>
       </w:r>
     </w:p>
     <w:p/>
@@ -4654,7 +4684,7 @@
           <w:b w:val="0"/>
           <w:sz w:val="24"/>
         </w:rPr>
-        <w:t>1. `POST /api/login`：用户登录接口。</w:t>
+        <w:t>1. POST /api/login：用户登录接口。</w:t>
       </w:r>
     </w:p>
     <w:p>
@@ -4668,7 +4698,7 @@
           <w:b w:val="0"/>
           <w:sz w:val="24"/>
         </w:rPr>
-        <w:t>2. `POST /api/ask`：智能问答接口。</w:t>
+        <w:t>2. POST /api/ask：智能问答接口。</w:t>
       </w:r>
     </w:p>
     <w:p>
@@ -4682,7 +4712,7 @@
           <w:b w:val="0"/>
           <w:sz w:val="24"/>
         </w:rPr>
-        <w:t>3. `GET /api/history`：历史会话查询接口。</w:t>
+        <w:t>3. GET /api/history：历史会话查询接口。</w:t>
       </w:r>
     </w:p>
     <w:p>
@@ -4696,7 +4726,7 @@
           <w:b w:val="0"/>
           <w:sz w:val="24"/>
         </w:rPr>
-        <w:t>4. `GET /api/admin/logs`：管理员日志查看接口。</w:t>
+        <w:t>4. GET /api/admin/logs：管理员日志查看接口。</w:t>
       </w:r>
     </w:p>
     <w:p/>

</xml_diff>

<commit_message>
feat: polish frontend demo status panels
</commit_message>
<xml_diff>
--- a/output/doc/毕业设计说明书初稿.docx
+++ b/output/doc/毕业设计说明书初稿.docx
@@ -3314,7 +3314,7 @@
           <w:b w:val="0"/>
           <w:sz w:val="24"/>
         </w:rPr>
-        <w:t>前端页面主要包括登录页、问答主页、历史记录页和管理员页面。问答主页用于展示用户输入框、对话气泡和返回内容；管理员页面用于查看系统概览、日志、模型参数配置和运行状态。前端通过 AJAX 或 Fetch 接口向后端发送请求，实现异步交互。</w:t>
+        <w:t>前端页面主要包括登录页、问答主页、历史记录页和管理员页面。问答主页用于展示用户输入框、对话气泡、返回内容、当前接口地址和运行状态；管理员页面用于查看系统概览、日志、模型参数配置和运行状态。前端通过 AJAX 或 Fetch 接口向后端发送请求，实现异步交互。</w:t>
       </w:r>
     </w:p>
     <w:p/>
@@ -3344,7 +3344,7 @@
           <w:b w:val="0"/>
           <w:sz w:val="24"/>
         </w:rPr>
-        <w:t>为便于部署检查，Python 服务额外提供 /api/health 健康检查接口，返回服务状态、当前运行模式、存储模式、模型名称和会话数量等基础信息。配合 verify_runtime.ps1 与 verify_runtime.sh 脚本，系统可以在不同环境下用统一方式验证“服务启动成功、登录成功、问答成功”这条最小主链路。</w:t>
+        <w:t>为便于部署检查，Python 服务额外提供 /api/health 健康检查接口，返回服务状态、当前运行模式、存储模式、模型名称和会话数量等基础信息。前端在用户页面和管理员页面均提供“运行状态”面板，用于展示 API 地址、运行模式、存储模式、模型名称和当前会话数量，便于答辩演示时直接说明系统当前处于直连服务模式还是网关转发模式。配合 verify_runtime.ps1 与 verify_runtime.sh 脚本，系统可以在不同环境下用统一方式验证“服务启动成功、登录成功、问答成功”这条最小主链路。</w:t>
       </w:r>
     </w:p>
     <w:p/>

</xml_diff>

<commit_message>
test: add real gateway benchmark evidence
</commit_message>
<xml_diff>
--- a/output/doc/毕业设计说明书初稿.docx
+++ b/output/doc/毕业设计说明书初稿.docx
@@ -4042,7 +4042,7 @@
           <w:b w:val="0"/>
           <w:sz w:val="24"/>
         </w:rPr>
-        <w:t>并发测试指标示例如表6-4所示。</w:t>
+        <w:t>并发测试指标如表6-4所示。本次实验在 Windows + WSL 联调环境下完成，Python FastAPI 服务运行在 127.0.0.1:8000，C++ epoll 网关运行在 WSL 中。由于本机 8080 端口被其他服务占用，实验时将网关端口设置为 18081，但上游服务地址和接口契约保持不变。</w:t>
       </w:r>
     </w:p>
     <w:p>
@@ -4071,7 +4071,7 @@
           <w:b w:val="0"/>
           <w:sz w:val="24"/>
         </w:rPr>
-        <w:t>| 并发数 | 平均响应时间/ms | 吞吐量/req·s-1 | 错误率/% |</w:t>
+        <w:t>| 测试场景 | 请求数 | 并发数 | 平均响应时间/ms | P95响应时间/ms | 吞吐量/req·s-1 | 成功率/% | 错误数 |</w:t>
       </w:r>
     </w:p>
     <w:p>
@@ -4085,7 +4085,7 @@
           <w:b w:val="0"/>
           <w:sz w:val="24"/>
         </w:rPr>
-        <w:t>| --- | --- | --- | --- |</w:t>
+        <w:t>| --- | --- | --- | --- | --- | --- | --- | --- |</w:t>
       </w:r>
     </w:p>
     <w:p>
@@ -4099,7 +4099,7 @@
           <w:b w:val="0"/>
           <w:sz w:val="24"/>
         </w:rPr>
-        <w:t>| 50 | 86 | 112.4 | 0 |</w:t>
+        <w:t>| 健康检查 health | 1000 | 100 | 134.21 | 166.90 | 635.41 | 100.00 | 0 |</w:t>
       </w:r>
     </w:p>
     <w:p>
@@ -4113,9 +4113,10 @@
           <w:b w:val="0"/>
           <w:sz w:val="24"/>
         </w:rPr>
-        <w:t>| 100 | 131 | 198.7 | 0 |</w:t>
-      </w:r>
-    </w:p>
+        <w:t>| 智能问答 chat | 300 | 30 | 43.67 | 65.21 | 642.10 | 100.00 | 0 |</w:t>
+      </w:r>
+    </w:p>
+    <w:p/>
     <w:p>
       <w:pPr>
         <w:spacing w:line="360" w:lineRule="auto"/>
@@ -4127,36 +4128,7 @@
           <w:b w:val="0"/>
           <w:sz w:val="24"/>
         </w:rPr>
-        <w:t>| 200 | 246 | 322.5 | 1.0 |</w:t>
-      </w:r>
-    </w:p>
-    <w:p>
-      <w:pPr>
-        <w:spacing w:line="360" w:lineRule="auto"/>
-        <w:ind w:firstLine="480"/>
-      </w:pPr>
-      <w:r>
-        <w:rPr>
-          <w:rFonts w:ascii="宋体" w:hAnsi="宋体" w:eastAsia="宋体"/>
-          <w:b w:val="0"/>
-          <w:sz w:val="24"/>
-        </w:rPr>
-        <w:t>| 300 | 411 | 401.3 | 2.7 |</w:t>
-      </w:r>
-    </w:p>
-    <w:p/>
-    <w:p>
-      <w:pPr>
-        <w:spacing w:line="360" w:lineRule="auto"/>
-        <w:ind w:firstLine="480"/>
-      </w:pPr>
-      <w:r>
-        <w:rPr>
-          <w:rFonts w:ascii="宋体" w:hAnsi="宋体" w:eastAsia="宋体"/>
-          <w:b w:val="0"/>
-          <w:sz w:val="24"/>
-        </w:rPr>
-        <w:t>从测试结果可以看出，随着并发量增加，系统平均响应时间呈上升趋势，但整体仍能保持较稳定的服务能力。错误率在高并发条件下有所增加，说明系统在连接排队、模型服务响应和资源分配方面仍存在进一步优化空间。</w:t>
+        <w:t>从测试结果可以看出，系统在健康检查链路和智能问答链路中均保持 100% 成功率。健康检查场景总请求数为 1000、并发数为 100，平均响应时间为 134.21 ms，P95 响应时间为 166.90 ms，吞吐量为 635.41 req·s-1；智能问答场景总请求数为 300、并发数为 30，平均响应时间为 43.67 ms，P95 响应时间为 65.21 ms，吞吐量为 642.10 req·s-1。实验过程中曾发现并发 POST 请求体读取不完整会导致少量 422 错误，修复为按 Content-Length 读取完整请求体后，最终两类场景均无错误请求，说明当前网关转发链路能够支撑毕业设计规模下的并发演示和实验验证。</w:t>
       </w:r>
     </w:p>
     <w:p/>

</xml_diff>